<commit_message>
Fix XGBoost Brier (calibrated), add algorithm note to Tabela 5
</commit_message>
<xml_diff>
--- a/xg_rad_nacrt.docx
+++ b/xg_rad_nacrt.docx
@@ -3970,7 +3970,7 @@
                 <w:sz w:val="19"/>
                 <w:szCs w:val="19"/>
               </w:rPr>
-              <w:t xml:space="preserve">0,783</w:t>
+              <w:t xml:space="preserve">0,758</w:t>
             </w:r>
           </w:p>
         </w:tc>
@@ -4002,7 +4002,7 @@
                 <w:sz w:val="19"/>
                 <w:szCs w:val="19"/>
               </w:rPr>
-              <w:t xml:space="preserve">0,350</w:t>
+              <w:t xml:space="preserve">0,294</w:t>
             </w:r>
           </w:p>
         </w:tc>
@@ -4034,7 +4034,7 @@
                 <w:sz w:val="19"/>
                 <w:szCs w:val="19"/>
               </w:rPr>
-              <w:t xml:space="preserve">0,355</w:t>
+              <w:t xml:space="preserve">0,376</w:t>
             </w:r>
           </w:p>
         </w:tc>
@@ -4066,7 +4066,7 @@
                 <w:sz w:val="19"/>
                 <w:szCs w:val="19"/>
               </w:rPr>
-              <w:t xml:space="preserve">0,159</w:t>
+              <w:t xml:space="preserve">0,076</w:t>
             </w:r>
           </w:p>
         </w:tc>
@@ -4858,7 +4858,7 @@
                 <w:sz w:val="19"/>
                 <w:szCs w:val="19"/>
               </w:rPr>
-              <w:t xml:space="preserve">0,780</w:t>
+              <w:t xml:space="preserve">0,770</w:t>
             </w:r>
           </w:p>
         </w:tc>
@@ -4890,7 +4890,7 @@
                 <w:sz w:val="19"/>
                 <w:szCs w:val="19"/>
               </w:rPr>
-              <w:t xml:space="preserve">0,347</w:t>
+              <w:t xml:space="preserve">0,310</w:t>
             </w:r>
           </w:p>
         </w:tc>
@@ -4922,7 +4922,7 @@
                 <w:sz w:val="19"/>
                 <w:szCs w:val="19"/>
               </w:rPr>
-              <w:t xml:space="preserve">0,356</w:t>
+              <w:t xml:space="preserve">0,389</w:t>
             </w:r>
           </w:p>
         </w:tc>
@@ -4954,7 +4954,7 @@
                 <w:sz w:val="19"/>
                 <w:szCs w:val="19"/>
               </w:rPr>
-              <w:t xml:space="preserve">0,149</w:t>
+              <w:t xml:space="preserve">0,075</w:t>
             </w:r>
           </w:p>
         </w:tc>
@@ -5743,7 +5743,7 @@
           <w:sz w:val="18"/>
           <w:szCs w:val="18"/>
         </w:rPr>
-        <w:t xml:space="preserve">Tabela 5. Ablation analiza: inkrementalni doprinos svake grupe 360 atributa</w:t>
+        <w:t xml:space="preserve">Tabela 5. Ablation analiza: inkrementalni doprinos svake grupe 360 atributa (logistička regresija, LOTO validacija)</w:t>
       </w:r>
     </w:p>
     <w:tbl>

</xml_diff>

<commit_message>
Cosmetic fixes: Brier note in table captions, Tabela 5 footnote, shootout clarification
</commit_message>
<xml_diff>
--- a/xg_rad_nacrt.docx
+++ b/xg_rad_nacrt.docx
@@ -865,7 +865,7 @@
           <w:sz w:val="22"/>
           <w:szCs w:val="22"/>
         </w:rPr>
-        <w:t xml:space="preserve">Posebno je provereno i uklonjeno 103 šuta koji potiču iz penal-shootout faze (jedanaesterci posle produžetaka, StatsBomb oznaka perioda 5), jer ta faza nije deo same utakmice u xG smislu i nema isti takmičarski i psihološki kontekst kao penal dosuđen tokom igre.</w:t>
+        <w:t xml:space="preserve">Posebno je provereno i uklonjeno 103 šuta koji potiču iz penal-shootout faze (jedanaesterci posle produžetaka, StatsBomb oznaka perioda 5), jer ta faza nije deo same utakmice u xG smislu. Ovih 103 šuteva su deo ukupne cifre od 155 penala pomenute gore (ne oduzimaju se dodatno), tako da konačan skup za modelovanje iznosi 4.123 minus 155 = 3.968 šuteva.</w:t>
       </w:r>
     </w:p>
     <w:p>
@@ -3221,7 +3221,7 @@
           <w:sz w:val="18"/>
           <w:szCs w:val="18"/>
         </w:rPr>
-        <w:t xml:space="preserve">Tabela 2. Rezultati Stratified K-Fold validacije (prosek kroz 5 foldova)</w:t>
+        <w:t xml:space="preserve">Tabela 2. Rezultati Stratified K-Fold validacije (prosek kroz 5 foldova). Brier skor prikazuje vrednost posle post-hoc kalibracije (izotona regresija unutar folda).</w:t>
       </w:r>
     </w:p>
     <w:tbl>
@@ -4109,7 +4109,7 @@
           <w:sz w:val="18"/>
           <w:szCs w:val="18"/>
         </w:rPr>
-        <w:t xml:space="preserve">Tabela 3. Rezultati Leave-One-Tournament-Out validacije (prosek kroz tri turnira)</w:t>
+        <w:t xml:space="preserve">Tabela 3. Rezultati Leave-One-Tournament-Out validacije (prosek kroz tri turnira). Brier skor prikazuje vrednost posle post-hoc kalibracije.</w:t>
       </w:r>
     </w:p>
     <w:tbl>
@@ -6474,7 +6474,7 @@
           <w:sz w:val="22"/>
           <w:szCs w:val="22"/>
         </w:rPr>
-        <w:t xml:space="preserve">Rezultati pokazuju da najveći deo inkrementalne vrednosti dolazi iz informacije o broju i rasporedu protivnika u konusu šuta (CONE, +0,007), zatim iz defanzivnog pritiska (PRESSURE, +0,006), dok pozicija golmana donosi manji, ali merljiv doprinos (+0,003). Udaljenost branioca od linije šuta (SHOT_LINE) ne donosi praktično nikakav inkrementalni doprinos (+0,000) kad se doda sama, bez ostalih 360 atributa. Zaključak je da nije ceo 360 sloj podjednako vredan: najveći deo poboljšanja dolazi iz geometrijske informacije o zagušenosti prostora između šutera i gola.</w:t>
+        <w:t xml:space="preserve">Rezultati pokazuju da najveći deo inkrementalne vrednosti dolazi iz informacije o broju i rasporedu protivnika u konusu šuta (CONE, +0,008), zatim iz defanzivnog pritiska (PRESSURE, +0,007), dok pozicija golmana donosi manji, ali merljiv doprinos (+0,004). Udaljenost branioca od linije šuta (SHOT_LINE) ne donosi praktično nikakav inkrementalni doprinos kad se doda sama, bez ostalih 360 atributa. Zaključak je da nije ceo 360 sloj podjednako vredan: najveći deo poboljšanja dolazi iz geometrijske informacije o zagušenosti prostora između šutera i gola. Napomena: ROC AUC za pun Model B u Tabeli 5 (0,773) blago se razlikuje od vrednosti u Tabeli 3 (0,769) jer ablation analiza koristi logističku regresiju bez hiperparametarskog podešavanja (GridSearchCV), za razliku od Tabele 3 gde je model optimizovan unutar svakog folda.</w:t>
       </w:r>
     </w:p>
     <w:p>

</xml_diff>

<commit_message>
Remove all goalkeeper_anomaly references, use goalkeeper_distance_360 directly (no leakage)
</commit_message>
<xml_diff>
--- a/xg_rad_nacrt.docx
+++ b/xg_rad_nacrt.docx
@@ -2237,75 +2237,7 @@
           <w:sz w:val="22"/>
           <w:szCs w:val="22"/>
         </w:rPr>
-        <w:t xml:space="preserve">gde je Rᵢ² koeficijent determinacije iz regresije i-tog atributa na sve ostale atribute u modelu. Vrednost VIF preko 5 do 10 se uobičajeno smatra znakom problematične multikolinearnosti. Problem je rešen zamenom apsolutne udaljenosti golmana sa rezidualom (anomalijom) u odnosu na očekivanu poziciju golmana za datu udaljenost šuta:</w:t>
-      </w:r>
-    </w:p>
-    <w:p>
-      <w:pPr>
-        <w:tabs>
-          <w:tab w:val="right" w:pos="9000"/>
-        </w:tabs>
-        <w:spacing w:after="200" w:before="160"/>
-        <w:jc w:val="center"/>
-      </w:pPr>
-      <m:oMath>
-        <m:r>
-          <m:t>anomaly = </m:t>
-        </m:r>
-        <m:sSub>
-          <m:sSubPr/>
-          <m:e>
-            <m:r>
-              <m:t>d</m:t>
-            </m:r>
-          </m:e>
-          <m:sub>
-            <m:r>
-              <m:t>gk</m:t>
-            </m:r>
-          </m:sub>
-        </m:sSub>
-        <m:r>
-          <m:t> − (a·</m:t>
-        </m:r>
-        <m:sSub>
-          <m:sSubPr/>
-          <m:e>
-            <m:r>
-              <m:t>d</m:t>
-            </m:r>
-          </m:e>
-          <m:sub>
-            <m:r>
-              <m:t>shot</m:t>
-            </m:r>
-          </m:sub>
-        </m:sSub>
-        <m:r>
-          <m:t> + b)</m:t>
-        </m:r>
-      </m:oMath>
-      <w:r>
-        <w:rPr>
-          <w:sz w:val="20"/>
-          <w:szCs w:val="20"/>
-        </w:rPr>
-        <w:t xml:space="preserve">	(16)</w:t>
-      </w:r>
-    </w:p>
-    <w:p>
-      <w:pPr>
-        <w:spacing w:after="160" w:line="276"/>
-        <w:ind w:firstLine="397"/>
-        <w:jc w:val="both"/>
-      </w:pPr>
-      <w:r>
-        <w:rPr>
-          <w:rFonts w:ascii="Calibri" w:cs="Calibri" w:eastAsia="Calibri" w:hAnsi="Calibri"/>
-          <w:sz w:val="22"/>
-          <w:szCs w:val="22"/>
-        </w:rPr>
-        <w:t xml:space="preserve">gde su a i b koeficijenti proste linearne regresije udaljenosti golmana (d_gk) na udaljenost šuta (d_shot), procenjeni na celom skupu podataka. Ovom transformacijom VIF je spušten ispod 2.</w:t>
+        <w:t xml:space="preserve">gde je Rᵢ² koeficijent determinacije iz regresije i-tog atributa na sve ostale atribute u modelu. Vrednost VIF preko 5 do 10 se uobičajeno smatra znakom problematične multikolinearnosti. U finalnoj verziji pipeline-a, atribut golmana koristi direktnu udaljenost golmana iz freeze-frame podataka (goalkeeper_distance_360), bez globalne regresije ili transformacije. Time se izbegava curenje podataka koje bi nastalo da se koeficijenti regresije procene na celom skupu (uključujući test fold). VIF za goalkeeper_distance_360 je prihvatljiv (ispod 6).</w:t>
       </w:r>
     </w:p>
     <w:p>
@@ -2433,7 +2365,7 @@
           <w:sz w:val="22"/>
           <w:szCs w:val="22"/>
         </w:rPr>
-        <w:t xml:space="preserve">Centralna teza rada zahteva eksplicitno poređenje dva modela, ne samo apsolutnu procenu jednog modela. Model A koristi isključivo klasične event atribute: udaljenost od gola, ugao šuta, minut meča, deo tela, tehniku, tip akcije, tip šuta, stanje rezultata, da li je šut izveden pod pritiskom i da li je prvim dodirom. Model B sadrži sve atribute Modela A, uz dodatak StatsBomb 360 prostornih atributa: broj branilaca u liniji šuta, broj saigrača u istoj zoni, broj protivnika u krugu od 5 metara, otvorenost ugla ka golu (udeo gol-okvira koji nije zaklonjen), anomaliju pozicije golmana, najbližu udaljenost branioca od linije šuta i kontinuiranu meru defanzivnog pritiska.</w:t>
+        <w:t xml:space="preserve">Centralna teza rada zahteva eksplicitno poređenje dva modela, ne samo apsolutnu procenu jednog modela. Model A koristi isključivo klasične event atribute: udaljenost od gola, ugao šuta, da li je šut prvim dodirom, da li je šut jedan-na-jedan, deo tela i tip šuta. Model B sadrži sve atribute Modela A, uz dodatak StatsBomb 360 prostornih atributa: udaljenost golmana, broj branilaca u konusu šuta, broj protivnika između šutera i gola, protivnici u kaznenom prostoru, broj branilaca unutar 5m i 10m, najbliža udaljenost branioca od linije šuta, broj branilaca unutar 1m i 2m od linije šuta, i kontinuiranu meru defanzivnog pritiska (pressure_score).</w:t>
       </w:r>
     </w:p>
     <w:p>
@@ -5025,7 +4957,7 @@
           <w:sz w:val="22"/>
           <w:szCs w:val="22"/>
         </w:rPr>
-        <w:t xml:space="preserve">Za logističku regresiju, Model A je formalno ugnježden u Model B: svih 24 atributa Modela A predstavljaju tačan podskup 31 atributa Modela B, pri čemu su preostala 7 atributa StatsBomb 360 prostorni atributi (broj branilaca u liniji šuta, broj saigrača u istoj zoni, broj protivnika u krugu od 5 metara, otvorenost ugla ka golu, najbliža udaljenost branioca od linije šuta, defanzivni pritisak i anomalija pozicije golmana). Ugnježdena struktura modela dozvoljava primenu Likelihood Ratio (LR) testa, koji poredi logaritme verodostojnosti (log-likelihood) dva modela:</w:t>
+        <w:t xml:space="preserve">Za logističku regresiju, Model A je formalno ugnježden u Model B: atributi Modela A predstavljaju tačan podskup atributa Modela B, pri čemu su dodatni atributi StatsBomb 360 prostorni atributi (udaljenost golmana, broj branilaca u konusu šuta, protivnici između šutera i gola, protivnici u kaznenom prostoru, najbliža udaljenost branioca od linije šuta, branioci unutar 1m i 2m od linije šuta, i defanzivni pritisak). Ugnježdena struktura modela dozvoljava primenu Likelihood Ratio (LR) testa, koji poredi logaritme verodostojnosti (log-likelihood) dva modela:</w:t>
       </w:r>
     </w:p>
     <w:p>
@@ -6527,7 +6459,7 @@
           <w:sz w:val="22"/>
           <w:szCs w:val="22"/>
         </w:rPr>
-        <w:t xml:space="preserve">Zanimljiv je nesklad između dva pristupa interpretaciji za atribut najbliže udaljenosti branioca od linije šuta: u logističkoj regresiji ovaj atribut nije statistički značajan (p = 0,645), dok se u SHAP analizi XGBoost modela plasira na petom mestu po uticaju, odmah iza anomalije pozicije golmana. Ovaj nesklad sugeriše da efekat ovog atributa na verovatnoću gola nije linearan, odnosno da ga logistička regresija, koja pretpostavlja linearan odnos sa logitom, ne uspeva u potpunosti da uhvati, dok XGBoost, kroz stabla odluke, prirodno modeluje takav nelinearni ili interakcijski efekat, na primer da udaljenost branioca od linije šuta ima značajan utisak samo u kombinaciji sa malom udaljenošću od gola ili velikim otvorenim uglom. Ovo je dodatni argument u prilog korišćenju oba modela paralelno, jer se njihove interpretacije međusobno nadopunjuju, ne samo potvrđuju.</w:t>
+        <w:t xml:space="preserve">Zanimljiv je nesklad između dva pristupa interpretaciji za atribut najbliže udaljenosti branioca od linije šuta: u logističkoj regresiji ovaj atribut nije statistički značajan (p = 0,645), dok se u SHAP analizi XGBoost modela plasira na petom mestu po uticaju, odmah iza udaljenosti golmana. Ovaj nesklad sugeriše da efekat ovog atributa nije linearan, odnosno da ga logistička regresija ne uspeva u potpunosti da uhvati, dok XGBoost prirodno modeluje takav nelinearni ili interakcijski efekat. Ovo je dodatni argument u prilog korišćenju oba modela paralelno, jer se njihove interpretacije međusobno nadopunjuju.</w:t>
       </w:r>
     </w:p>
     <w:p>
@@ -6634,7 +6566,7 @@
           <w:sz w:val="22"/>
           <w:szCs w:val="22"/>
         </w:rPr>
-        <w:t xml:space="preserve">Nalazi rada imaju nekoliko mogućih praktičnih primena u fudbalskoj analitici. Trenerski štab i analitičari mogu koristiti razliku između Modela A i Modela B kao indikator koliko je konkretna šansa bila kvalitetnija ili lošija nego što čista geometrija šuta sugeriše, što je korisno za retrospektivnu analizu kvaliteta stvorenih šansi (na primer, da li je tim sistematski stvarao šanse iz situacija sa malo defanzivnog pritiska, ili obrnuto). U skautingu, SHAP interpretacija modela može pomoći u identifikaciji igrača koji konzistentno postižu golove iz situacija sa visokim defanzivnim pritiskom, što ukazuje na veštinu koja nadilazi čistu poziciju na terenu. U evaluaciji golmana, atribut anomalije pozicije golmana, koji meri odstupanje od očekivane pozicije za datu udaljenost šuta, može poslužiti kao osnova za dalju analizu pozicioniranja.</w:t>
+        <w:t xml:space="preserve">Nalazi rada imaju nekoliko mogućih praktičnih primena u fudbalskoj analitici. Trenerski štab i analitičari mogu koristiti razliku između Modela A i Modela B kao indikator koliko je konkretna šansa bila kvalitetnija ili lošija nego što čista geometrija šuta sugeriše. U skautingu, SHAP interpretacija modela može pomoći u identifikaciji igrača koji konzistentno postižu golove iz situacija sa visokim defanzivnim pritiskom, što ukazuje na prediktivnu asocijaciju sa veštinom koja nadilazi čistu poziciju na terenu. U evaluaciji golmana, atribut udaljenosti golmana iz freeze-frame podataka može poslužiti kao osnova za dalju analizu pozicioniranja.</w:t>
       </w:r>
     </w:p>
     <w:p>

</xml_diff>

<commit_message>
Fix all textual inaccuracies: metrics claims, LOTO diff, Brier%, bootstrap explanation, F1 threshold, expanded limitations
</commit_message>
<xml_diff>
--- a/xg_rad_nacrt.docx
+++ b/xg_rad_nacrt.docx
@@ -2751,7 +2751,7 @@
           <w:sz w:val="22"/>
           <w:szCs w:val="22"/>
         </w:rPr>
-        <w:t xml:space="preserve">Modeli su evaluirani po dve nezavisne dimenzije kvaliteta. Diskriminacija, odnosno da li model ispravno rangira šuteve po riziku, merena je preko ROC AUC, Precision-Recall AUC (PR AUC, posebno informativan kod neuravnoteženih klasa), preciznosti, odziva, F1 mere i matrice konfuzije. Kalibracija, odnosno da li predviđena verovatnoća brojčano odgovara stvarnoj frekvenciji ishoda, merena je preko Brier skora, koji predstavlja srednju kvadratnu grešku između predviđene verovatnoće pᵢ i stvarnog binarnog ishoda oᵢ za svih N opservacija:</w:t>
+        <w:t xml:space="preserve">Modeli su evaluirani po dve nezavisne dimenzije kvaliteta. Diskriminacija, odnosno da li model ispravno rangira šuteve po riziku, merena je preko ROC AUC i Precision-Recall AUC (PR AUC, posebno informativan kod neuravnoteženih klasa). F1 mera je prikazana kao sekundarna metrika (sa podrazumevanim pragom klasifikacije 0,5) i ne treba je tumačiti kao primarni kriterijum kvaliteta, jer je xG model prevashodno probabilistički (cilj je tačna procena verovatnoće, ne klasifikaciona odluka). Kalibracija, odnosno da li predviđena verovatnoća brojčano odgovara stvarnoj frekvenciji ishoda, merena je preko Brier skora, koji predstavlja srednju kvadratnu grešku između predviđene verovatnoće pᵢ i stvarnog binarnog ishoda oᵢ za svih N opservacija:</w:t>
       </w:r>
     </w:p>
     <w:p>
@@ -4016,7 +4016,7 @@
           <w:sz w:val="22"/>
           <w:szCs w:val="22"/>
         </w:rPr>
-        <w:t xml:space="preserve">Model B nadmašuje Model A na svim metrikama, bez obzira na to koji algoritam je korišćen. Logistička regresija ostvaruje viši ROC AUC i PR AUC od XGBoost-a u oba slučaja, dok XGBoost ostvaruje niži, odnosno bolji Brier skor, što ukazuje da XGBoost ima blago slabiju diskriminaciju ali bolju kalibraciju u odnosu na logističku regresiju na ovom skupu podataka.</w:t>
+        <w:t xml:space="preserve">Model B nadmašuje Model A na ROC AUC i PR AUC metrikama, bez obzira na to koji algoritam je korišćen. Razlika u kalibriranom Brier skoru je minimalna ali konzistentno u korist Modela B za logističku regresiju, dok je za XGBoost praktično izjednačena.</w:t>
       </w:r>
     </w:p>
     <w:p>
@@ -4904,7 +4904,7 @@
           <w:sz w:val="22"/>
           <w:szCs w:val="22"/>
         </w:rPr>
-        <w:t xml:space="preserve">Rezultati Leave-One-Tournament-Out validacije su gotovo identični rezultatima Stratified K-Fold validacije za sve četiri kombinacije modela i algoritma. Razlika u ROC AUC između dve validacione šeme ne prelazi 0,002 za bilo koju kombinaciju. Ovo je značajan nalaz: model ne pokazuje znake prenaučenosti specifičnostima jednog turnira, već generalizuje na turnir koji nikada nije vidio tokom treninga skoro identično dobro kao na podacima iz iste distribucije.</w:t>
+        <w:t xml:space="preserve">Rezultati Leave-One-Tournament-Out validacije su konzistentni sa rezultatima Stratified K-Fold validacije. Razlike u ROC AUC između dve validacione šeme ne prelaze 0,02, što ukazuje da modeli ne pokazuju znake dramatične prenaučenosti specifičnostima jednog turnira, mada LOTO rezultati pokazuju nešto veću varijabilnost nego K-Fold (što je očekivano s obzirom na samo 3 turnira).</w:t>
       </w:r>
     </w:p>
     <w:p>
@@ -5045,7 +5045,7 @@
           <w:sz w:val="22"/>
           <w:szCs w:val="22"/>
         </w:rPr>
-        <w:t xml:space="preserve">Za XGBoost, modeli nisu ugnježdeni na isti parametarski način, pa Likelihood Ratio test nije primenjiv. Umesto toga, sprovedena je bootstrap analiza razlike ROC AUC na kompletnim out-of-fold (OOF) predikcijama iz svih LOTO foldova. Za svaki šut u datasetu postoji tačno jedna predikcija dobijena iz modela koji ga nikada nije video tokom treninga. Na ovim parnim (shot-level) predikcijama sprovedeno je 2.000 bootstrap iteracija. Opažena razlika ROC AUC (Model B minus Model A) iznosi 0,061, a 95% interval poverenja dobijen iz bootstrap raspodele iznosi [0,043, 0,079]. Pošto interval ne sadrži nulu, razlika se smatra statistički značajnom (p &lt; 0,001). Ovaj pristup je metodološki jači od bootstrap-a na jednom train-test splitu jer koristi sve podatke kao genuino out-of-sample predikcije i čuva shot-level korelacionu strukturu.</w:t>
+        <w:t xml:space="preserve">Za XGBoost, modeli nisu ugnježdeni na isti parametarski način, pa Likelihood Ratio test nije primenjiv. Umesto toga, sprovedena je bootstrap analiza razlike ROC AUC na kompletnim out-of-fold (OOF) predikcijama iz svih LOTO foldova. Za svaki šut u datasetu postoji tačno jedna predikcija dobijena iz modela koji ga nikada nije video tokom treninga. Na ovim parnim (shot-level) predikcijama sprovedeno je 2.000 bootstrap iteracija. Opažena razlika ROC AUC (Model B minus Model A) iznosi 0,061, a 95% interval poverenja iznosi [0,043, 0,079]. Pošto interval ne sadrži nulu, razlika se smatra statistički značajnom na nivou alfa = 0,05. Napomena: ova razlika (0,061) je veća od razlike u Tabeli 3 (0,010) jer bootstrap koristi pooled OOF AUC (svi šutevi zajedno kao jedan skup), dok Tabela 3 prikazuje neponderisani prosek AUC-ova izračunatih odvojeno po turniru; pooled pristup daje veći raspon jer ne prosečava preko različito teških turnira.</w:t>
       </w:r>
     </w:p>
     <w:p>
@@ -5635,7 +5635,7 @@
           <w:sz w:val="22"/>
           <w:szCs w:val="22"/>
         </w:rPr>
-        <w:t xml:space="preserve">Sirovi modeli, pre post-hoc kalibracije, pokazuju sistematsku prekalibrisanost u višem opsegu predviđenih verovatnoća: model predviđa visoke verovatnoće gola (na primer, preko 0,6) za situacije koje se u stvarnosti dešavaju znatno reže. Ovo je direktna posledica ponderisanja klasa primenjenog radi poboljšanja diskriminacije manjinske klase. Primena izotone regresije kao post-hoc kalibracije drastično poboljšava Brier skor za sve četiri kombinacije modela, sa redukcijom od preko 50%.</w:t>
+        <w:t xml:space="preserve">Sirovi modeli, pre post-hoc kalibracije, pokazuju sistematsku prekalibrisanost u višem opsegu predviđenih verovatnoća. Primena izotone regresije kao post-hoc kalibracije značajno poboljšava Brier skor za sve četiri kombinacije modela (redukcije od 29% do 51% u zavisnosti od modela i validacione šeme).</w:t>
       </w:r>
     </w:p>
     <w:p>
@@ -6649,7 +6649,67 @@
           <w:sz w:val="22"/>
           <w:szCs w:val="22"/>
         </w:rPr>
-        <w:t xml:space="preserve">Peto, atributi nisu skalirani pre primene L2-regularizovane logističke regresije, što znači da regularizacioni parametar C neravnomerno penalizuje koeficijente atributa različitih skala, na primer minut utakmice u opsegu od 0 do 120 naspram binarnog indikatora 0 ili 1. S obzirom na to da je optimalni C približno 0,85, što predstavlja relativno slabu regularizaciju, i da se interpretacija koeficijenata kroz Odds Ratio temelji na zasebnom fitovanju metodom maksimalne verodostojnosti bez penalizacije, efekat ovog propusta na konačne zaključke procenjuje se kao zanemarljiv, ali se navodi kao metodološka nepreciznost.</w:t>
+        <w:t xml:space="preserve">Peto, atributi nisu skalirani pre primene L2-regularizovane logističke regresije, što znači da regularizacioni parametar C neravnomerno penalizuje koeficijente atributa različitih skala. S obzirom na to da je optimalni C približno 0,85 (relativno slaba regularizacija), efekat ovog propusta procenjuje se kao zanemarljiv, ali se navodi kao metodološka nepreciznost.</w:t>
+      </w:r>
+    </w:p>
+    <w:p>
+      <w:pPr>
+        <w:spacing w:after="160" w:line="276"/>
+        <w:ind w:firstLine="397"/>
+        <w:jc w:val="both"/>
+      </w:pPr>
+      <w:r>
+        <w:rPr>
+          <w:rFonts w:ascii="Calibri" w:cs="Calibri" w:eastAsia="Calibri" w:hAnsi="Calibri"/>
+          <w:sz w:val="22"/>
+          <w:szCs w:val="22"/>
+        </w:rPr>
+        <w:t xml:space="preserve">Šesto, Stratified K-Fold validacija deli šuteve na nivou pojedinačnih opservacija, ne na nivou mečeva. Šutevi iz istog meča mogu završiti u trening i test delu, što može dati blago optimističniju procenu performansa. LOTO validacija adresira ovaj problem na nivou turnira, ali unutar nje K-Fold i dalje deli po šutevima. StratifiedGroupKFold sa meč ID-em kao grupom bi bio stroži pristup.</w:t>
+      </w:r>
+    </w:p>
+    <w:p>
+      <w:pPr>
+        <w:spacing w:after="160" w:line="276"/>
+        <w:ind w:firstLine="397"/>
+        <w:jc w:val="both"/>
+      </w:pPr>
+      <w:r>
+        <w:rPr>
+          <w:rFonts w:ascii="Calibri" w:cs="Calibri" w:eastAsia="Calibri" w:hAnsi="Calibri"/>
+          <w:sz w:val="22"/>
+          <w:szCs w:val="22"/>
+        </w:rPr>
+        <w:t xml:space="preserve">Sedmo, bootstrap analiza je sprovedena na nivou pojedinačnih šuteva (parno resamplovanje), što čuva uparivanje Model A/B predikcija za isti šut, ali ne čuva zavisnost šuteva unutar istog meča. Cluster bootstrap po mečevima bi bio robusniji pristup.</w:t>
+      </w:r>
+    </w:p>
+    <w:p>
+      <w:pPr>
+        <w:spacing w:after="160" w:line="276"/>
+        <w:ind w:firstLine="397"/>
+        <w:jc w:val="both"/>
+      </w:pPr>
+      <w:r>
+        <w:rPr>
+          <w:rFonts w:ascii="Calibri" w:cs="Calibri" w:eastAsia="Calibri" w:hAnsi="Calibri"/>
+          <w:sz w:val="22"/>
+          <w:szCs w:val="22"/>
+        </w:rPr>
+        <w:t xml:space="preserve">Osmo, StatsBomb 360 freeze-frame sadrži samo igrače vidljive kameri u trenutku šuta, ne nužno sve igrače na terenu. Count i density atributi (broj protivnika, pressure_score) mogu biti potcenjeni ako relevantan deo terena nije u vidnom polju kamere. Ovo ograničenje je inherentno izvoru podataka.</w:t>
+      </w:r>
+    </w:p>
+    <w:p>
+      <w:pPr>
+        <w:spacing w:after="160" w:line="276"/>
+        <w:ind w:firstLine="397"/>
+        <w:jc w:val="both"/>
+      </w:pPr>
+      <w:r>
+        <w:rPr>
+          <w:rFonts w:ascii="Calibri" w:cs="Calibri" w:eastAsia="Calibri" w:hAnsi="Calibri"/>
+          <w:sz w:val="22"/>
+          <w:szCs w:val="22"/>
+        </w:rPr>
+        <w:t xml:space="preserve">Deveto, koordinate su u StatsBomb sistemu (0-120 x 0-80), a radijus defanzivnog pritiska i širina gola su izraženi u fizičkim jedinicama (jardi/metri). Konverzija je primenjenja linerano (1 SB jedinica = 105/120 = 0,875m za x-osu), ali ovo treba jasno navesti jer StatsBomb ne objavljuje zvanično mapiranje na fizičke dimenzije terena.</w:t>
       </w:r>
     </w:p>
     <w:p>

</xml_diff>

<commit_message>
Critical fix: open_angle_ratio_360 back in pipeline, SHAP/text updated to goalkeeper_distance as top 360 feature, LR=66.43 df=11, bootstrap 0.024
</commit_message>
<xml_diff>
--- a/xg_rad_nacrt.docx
+++ b/xg_rad_nacrt.docx
@@ -295,7 +295,7 @@
           <w:sz w:val="22"/>
           <w:szCs w:val="22"/>
         </w:rPr>
-        <w:t xml:space="preserve">Glavni nalaz rada je da Model B konzistentno nadmašuje Model A na svim metrikama diskriminacije i kalibracije, i u Stratified K-Fold i u Leave-One-Tournament-Out validaciji, te da se taj doprinos održava kroz sva tri turnira. Otvorenost ugla ka golu, izvedena iz StatsBomb 360 podataka, pokazala se kao drugi najuticajniji atribut u SHAP analizi, odmah iza ugla šuta. Rad takođe pokazuje da je geometrija šuta (udaljenost, ugao) statistički slična kroz sva tri turnira, dok se stopa konverzije šuteva u gol značajno razlikuje po turniru, što ukazuje da razlike u performansu modela između turnira potiču pre iz varijacija u finalizaciji nego iz razlika u kvalitetu stvorenih šansi.</w:t>
+        <w:t xml:space="preserve">Glavni nalaz rada je da Model B konzistentno poboljšava ROC AUC i PR AUC u odnosu na Model A, dok su razlike u kalibrisanom Brier skoru male. Ovaj doprinos se održava kroz sva tri turnira. Udaljenost golmana iz freeze-frame podataka (goalkeeper_distance_360) pokazala se kao najuticajniji 360 atribut u SHAP analizi, drugi ukupno posle ugla šuta. Ablation analiza pokazuje da najveći deo inkrementalne vrednosti dolazi iz informacije o zagušenosti prostora (CONE), zatim iz defanzivnog pritiska (PRESSURE) i pozicije golmana (GK), dok otvorenost ugla ka golu sama ne donosi merljiv doprinos izvan kombinacije sa ostalim 360 atributima.</w:t>
       </w:r>
     </w:p>
     <w:p>
@@ -4628,7 +4628,7 @@
                 <w:sz w:val="19"/>
                 <w:szCs w:val="19"/>
               </w:rPr>
-              <w:t xml:space="preserve">0,769</w:t>
+              <w:t xml:space="preserve">0,771</w:t>
             </w:r>
           </w:p>
         </w:tc>
@@ -4660,7 +4660,7 @@
                 <w:sz w:val="19"/>
                 <w:szCs w:val="19"/>
               </w:rPr>
-              <w:t xml:space="preserve">0,320</w:t>
+              <w:t xml:space="preserve">0,319</w:t>
             </w:r>
           </w:p>
         </w:tc>
@@ -4692,7 +4692,7 @@
                 <w:sz w:val="19"/>
                 <w:szCs w:val="19"/>
               </w:rPr>
-              <w:t xml:space="preserve">0,372</w:t>
+              <w:t xml:space="preserve">0,371</w:t>
             </w:r>
           </w:p>
         </w:tc>
@@ -5030,22 +5030,22 @@
           <w:sz w:val="22"/>
           <w:szCs w:val="22"/>
         </w:rPr>
-        <w:t xml:space="preserve">gde su ℓ_A i ℓ_B logaritmi verodostojnosti Modela A i Modela B, a LR statistika prati hi-kvadrat raspodelu sa brojem stepeni slobode jednakim broju dodatnih parametara u Modelu B. Oba modela su fitovana na identičnom skupu od 3.968 šuteva (bez penala), kako bi poređenje log-likelihood vrednosti bilo validno. Rezultat je LR = 64,80, sa 10 stepeni slobode, što odgovara p-vrednosti od približno 4,42×10⁻¹⁰, odlučno odbacujući nultu hipotezu da StatsBomb 360 atributi ne doprinose modelu. Ovaj nalaz je dodatno potkrepljen i informacionim kriterijumima: Akaikeov informacioni kriterijum (AIC) iznosi 2.141,44 za Model A i 2.096,63 za Model B (favorizuje B), a Bajesov informacioni kriterijum (BIC) 2.204,30 naspram 2.222,35 (favorizuje A, što je metodološki očekivano jer BIC strože kažnjava dodatne parametre na uzorcima ove veličine).</w:t>
-      </w:r>
-    </w:p>
-    <w:p>
-      <w:pPr>
-        <w:spacing w:after="160" w:line="276"/>
-        <w:ind w:firstLine="397"/>
-        <w:jc w:val="both"/>
-      </w:pPr>
-      <w:r>
-        <w:rPr>
-          <w:rFonts w:ascii="Calibri" w:cs="Calibri" w:eastAsia="Calibri" w:hAnsi="Calibri"/>
-          <w:sz w:val="22"/>
-          <w:szCs w:val="22"/>
-        </w:rPr>
-        <w:t xml:space="preserve">Za XGBoost, modeli nisu ugnježdeni na isti parametarski način, pa Likelihood Ratio test nije primenjiv. Umesto toga, sprovedena je bootstrap analiza razlike ROC AUC na kompletnim out-of-fold (OOF) predikcijama iz svih LOTO foldova. Za svaki šut u datasetu postoji tačno jedna predikcija dobijena iz modela koji ga nikada nije video tokom treninga. Na ovim parnim (shot-level) predikcijama sprovedeno je 2.000 bootstrap iteracija. Opažena razlika ROC AUC (Model B minus Model A) iznosi 0,061, a 95% interval poverenja iznosi [0,043, 0,079]. Pošto interval ne sadrži nulu, razlika se smatra statistički značajnom na nivou alfa = 0,05. Napomena: ova razlika (0,061) je veća od razlike u Tabeli 3 (0,010) jer bootstrap koristi pooled OOF AUC (svi šutevi zajedno kao jedan skup), dok Tabela 3 prikazuje neponderisani prosek AUC-ova izračunatih odvojeno po turniru; pooled pristup daje veći raspon jer ne prosečava preko različito teških turnira.</w:t>
+        <w:t xml:space="preserve">gde su ℓ_A i ℓ_B logaritmi verodostojnosti Modela A i Modela B, a LR statistika prati hi-kvadrat raspodelu sa brojem stepeni slobode jednakim broju dodatnih parametara u Modelu B. Oba modela su fitovana na identičnom skupu od 3.968 šuteva (bez penala), kako bi poređenje log-likelihood vrednosti bilo validno. Rezultat je LR = 66,43, sa 11 stepeni slobode, što odgovara p-vrednosti od približno 5,79×10⁻¹⁰, odlučno odbacujući nultu hipotezu da StatsBomb 360 atributi ne doprinose modelu. Ovaj nalaz je dodatno potkrepljen i Akaikeovim informacionim kriterijumom: AIC iznosi 2.141,44 za Model A i 2.097,01 za Model B (favorizuje B). Bajesov informacioni kriterijum (BIC) iznosi 2.204,30 naspram 2.229,01 (favorizuje A, što je metodološki očekivano jer BIC strože kažnjava dodatne parametre).</w:t>
+      </w:r>
+    </w:p>
+    <w:p>
+      <w:pPr>
+        <w:spacing w:after="160" w:line="276"/>
+        <w:ind w:firstLine="397"/>
+        <w:jc w:val="both"/>
+      </w:pPr>
+      <w:r>
+        <w:rPr>
+          <w:rFonts w:ascii="Calibri" w:cs="Calibri" w:eastAsia="Calibri" w:hAnsi="Calibri"/>
+          <w:sz w:val="22"/>
+          <w:szCs w:val="22"/>
+        </w:rPr>
+        <w:t xml:space="preserve">Za poređenje modela van parametarskog okvira logističke regresije, sprovedena je bootstrap analiza razlike ROC AUC na kompletnim out-of-fold (OOF) predikcijama iz svih LOTO foldova. Pooled OOF ROC AUC iznosi 0,680 za Model A i 0,703 za Model B. Opažena razlika (Model B minus Model A) iznosi 0,024, a 95% bootstrap interval poverenja (2.000 iteracija) iznosi [0,013, 0,034]. Pošto interval ne sadrži nulu, razlika se smatra statistički značajnom na nivou alfa = 0,05. Napomena: ova pooled OOF razlika (0,024) se razlikuje od razlike u Tabeli 3 (0,011) jer Tabela 3 prikazuje neponderisani prosek AUC-ova izračunatih odvojeno po turniru, dok pooled pristup računa jedan AUC na svim šutevima zajedno.</w:t>
       </w:r>
     </w:p>
     <w:p>
@@ -5075,7 +5075,7 @@
           <w:sz w:val="22"/>
           <w:szCs w:val="22"/>
         </w:rPr>
-        <w:t xml:space="preserve">U pripremi ovih testova, iz analize su izbačena dva šuta (0,05% od 3.968) zbog rezidualne nedostajuće vrednosti u atributu otvorenosti ugla, nastale u ekstremnom geometrijskom slučaju gde je ugao šuta jednak nuli. Ovo je odvojeno i znatno manje od izdvajanja penala (135 šuteva) opisanog u poglavlju 2, i odnosi se isključivo na Model B varijante.</w:t>
+        <w:t xml:space="preserve">Napomena o Likelihood Ratio testu: LR test je primenjen isključivo na neponderisanom, nepenalizovanom logističkom modelu (bez class_weight i bez regularizacije), jer ponderisanje klasa menja efektivnu likelihood funkciju. Prediktivni modeli koriste se za Brier/AUC izveštavanje; inferencijalni model služi isključivo za formalni test značajnosti.</w:t>
       </w:r>
     </w:p>
     <w:p>
@@ -6490,7 +6490,7 @@
           <w:sz w:val="22"/>
           <w:szCs w:val="22"/>
         </w:rPr>
-        <w:t xml:space="preserve">Centralni nalaz rada je da Model B konzistentno i u svim primenjenim validacionim šemama nadmašuje Model A, i u pogledu diskriminacije i u pogledu kalibracije. Doprinos nije dramatičan u apsolutnom iznosu (na primer, oko 0,02 razlike u ROC AUC), ali je dosledan kroz sve kombinacije algoritma i validacione šeme, što povećava pouzdanost zaključka da je reč o stvarnom, ne slučajnom efektu. Konkretnija i možda informativnija potvrda dolazi iz SHAP analize, gde se otvorenost ugla ka golu, atribut koji ne postoji bez StatsBomb 360 podataka, plasira kao drugi najuticajniji atribut u celom modelu.</w:t>
+        <w:t xml:space="preserve">Centralni nalaz rada je da Model B konzistentno poboljšava diskriminaciju (ROC AUC, PR AUC) u odnosu na Model A, dok su razlike u kalibrisanom Brier skoru male ali dosledne. Doprinos nije dramatičan u apsolutnom iznosu (oko 0,01 razlike u ROC AUC), ali je dosledan kroz sve kombinacije algoritma i validacione šeme, što povećava pouzdanost zaključka da 360 atributi sadrže dodatnu prediktivnu informaciju. Konkretnija potvrda dolazi iz SHAP analize, gde se udaljenost golmana (goalkeeper_distance_360) plasira kao najuticajniji 360 atribut u modelu, odmah iza ugla šuta.</w:t>
       </w:r>
     </w:p>
     <w:p>
@@ -6747,7 +6747,7 @@
           <w:sz w:val="22"/>
           <w:szCs w:val="22"/>
         </w:rPr>
-        <w:t xml:space="preserve">Otvorenost ugla ka golu, atribut izveden direktno iz StatsBomb 360 podataka, pokazala se kao drugi najuticajniji prediktor u fitovanom XGBoost modelu, odmah iza ugla šuta. Ovo je nalaz o prediktivnoj asocijaciji, ne o uzročnom efektu: SHAP objašnjava ponašanje konkretnog modela, ali ne dokazuje da promena otvorenosti gola uzrokuje promenu ishoda. Istovremeno, formalna provera distribucijskog pomaka (KS test) pokazala je da su marginalne raspodele udaljenosti i ugla šuta statistički slične kroz sva tri turnira, dok se stopa konverzije značajno razlikuje. Ovo ne dokazuje jednakost ukupnog kvaliteta šansi (mogu se razlikovati zajednička raspodela, tip asistencije, brzina lopte i drugi faktori), ali sugeriše da razlike u performansu modela između turnira ne potiču iz grubih razlika u geometrijskoj distribuciji šuteva.</w:t>
+        <w:t xml:space="preserve">Udaljenost golmana iz freeze-frame podataka (goalkeeper_distance_360) pokazala se kao najuticajniji 360 prediktor u fitovanom XGBoost modelu, odmah iza ugla šuta. Otvorenost ugla ka golu (open_angle_ratio_360), iako uključena u Model B, rangira se tek na 14. mestu po SHAP važnosti — njen doprinos postoji pretežno u interakciji sa ostalim 360 atributima, ne samostalno. Ovo je nalaz o prediktivnoj asocijaciji, ne o uzročnom efektu. Istovremeno, nije pronađen dokaz da se marginalne raspodele udaljenosti i ugla šuta razlikuju između turnira (KS test); razlika u konverziji stoga nije objašnjena tim dvema posmatranim geometrijskim karakteristikama, a mogući izvori uključuju završnicu, golmanski učinak i slučajnu varijaciju.</w:t>
       </w:r>
     </w:p>
     <w:p>

</xml_diff>

<commit_message>
All review fixes: open_angle in feature list+ablation, SHAP=GK not open_angle, KS softened, class_weight per fold, no duplicates, consistent naming
</commit_message>
<xml_diff>
--- a/xg_rad_nacrt.docx
+++ b/xg_rad_nacrt.docx
@@ -626,7 +626,7 @@
           <w:sz w:val="22"/>
           <w:szCs w:val="22"/>
         </w:rPr>
-        <w:t xml:space="preserve">Atribut otvorenosti ugla ka golu (open_goal_angle_ratio), izveden iz StatsBomb 360 podataka, predstavlja udeo ugla šuta koji nije zaklonjen protivničkim igračima. Za svakog protivnika koji se geometrijski nalazi između šutera i gola, procenjuje se ugaona „senka” koju njegovo telo baca prema šuteru, a zatim se sve preklapajuće senke spajaju da se izbegne dvostruko računanje istog dela gola blokiranog od dva igrača koji stoje jedan iza drugog:</w:t>
+        <w:t xml:space="preserve">Atribut otvorenosti ugla ka golu (open_angle_ratio_360), izveden iz StatsBomb 360 podataka, predstavlja udeo ugla šuta koji nije zaklonjen protivničkim igračima. Za svakog protivnika koji se geometrijski nalazi između šutera i gola, procenjuje se ugaona „senka” koju njegovo telo baca prema šuteru, a zatim se sve preklapajuće senke spajaju da se izbegne dvostruko računanje istog dela gola blokiranog od dva igrača koji stoje jedan iza drugog:</w:t>
       </w:r>
     </w:p>
     <w:p>
@@ -2324,7 +2324,7 @@
           <w:sz w:val="22"/>
           <w:szCs w:val="22"/>
         </w:rPr>
-        <w:t xml:space="preserve">Neuravnoteženost klasa: odnos ne-gol prema gol je približno 9,7 prema 1, što je ocenjeno kao umerena, ne ekstremna neuravnoteženost. Rešeno je ponderisanjem klasa (class_weight u logističkoj regresiji, scale_pos_weight u XGBoost-u) izvedenim direktno iz stvarnog odnosa klasa u podacima, bez veštačkog resampling-a.</w:t>
+        <w:t xml:space="preserve">Neuravnoteženost klasa: odnos ne-gol prema gol je približno 9,7 prema 1. Rešeno je ponderisanjem klasa (class_weight u logističkoj regresiji, scale_pos_weight u XGBoost-u), gde se odnos klasa i odgovarajuće težine izračunavaju zasebno isključivo na trening delu svakog spoljnog folda, bez veštačkog resampling-a. Grupisanje retkih kategorija (Corner i Free Kick u Set Piece) definisano je unapred na osnovu semantičke sličnosti tipova šuteva, ne na osnovu posmatranja ishoda.</w:t>
       </w:r>
     </w:p>
     <w:p>
@@ -2365,7 +2365,7 @@
           <w:sz w:val="22"/>
           <w:szCs w:val="22"/>
         </w:rPr>
-        <w:t xml:space="preserve">Centralna teza rada zahteva eksplicitno poređenje dva modela, ne samo apsolutnu procenu jednog modela. Model A koristi isključivo klasične event atribute: udaljenost od gola, ugao šuta, da li je šut prvim dodirom, da li je šut jedan-na-jedan, deo tela i tip šuta. Model B sadrži sve atribute Modela A, uz dodatak StatsBomb 360 prostornih atributa: udaljenost golmana, broj branilaca u konusu šuta, broj protivnika između šutera i gola, protivnici u kaznenom prostoru, broj branilaca unutar 5m i 10m, najbliža udaljenost branioca od linije šuta, broj branilaca unutar 1m i 2m od linije šuta, i kontinuiranu meru defanzivnog pritiska (pressure_score).</w:t>
+        <w:t xml:space="preserve">Centralna teza rada zahteva eksplicitno poređenje dva modela, ne samo apsolutnu procenu jednog modela. Model A koristi isključivo klasične event atribute: udaljenost od gola, ugao šuta, da li je šut prvim dodirom, da li je šut jedan-na-jedan, deo tela i tip šuta. Model B sadrži sve atribute Modela A, uz dodatak StatsBomb 360 prostornih atributa (ukupno 11): udaljenost golmana, broj branilaca u konusu šuta, broj protivnika između šutera i gola, protivnici u kaznenom prostoru, broj branilaca unutar 5m i 10m, najbliža udaljenost branioca od linije šuta, broj branilaca unutar 1m i 2m od linije šuta, kontinuiranu meru defanzivnog pritiska (pressure_score), i otvorenost ugla ka golu (open_angle_ratio_360).</w:t>
       </w:r>
     </w:p>
     <w:p>
@@ -3128,7 +3128,7 @@
           <w:sz w:val="22"/>
           <w:szCs w:val="22"/>
         </w:rPr>
-        <w:t xml:space="preserve">Formalni Kolmogorov-Smirnov test pokazao je da se raspodela udaljenosti od gola i ugla šuta statistički ne razlikuju značajno između bilo koja dva turnira (p &gt; 0,05 za sve parove). Ovo je ključan nalaz za tumačenje razlike u stopi konverzije: ako geometrija šuta, odnosno gde se šutira, nije različita na Evropskom prvenstvu 2024, a stopa konverzije jeste niža, razlika potiče iz finalizacije šanse (kvalitet izvedbe, slučajnost, golmani), a ne iz kvaliteta ili lokacije stvorenih šansi.</w:t>
+        <w:t xml:space="preserve">Formalni Kolmogorov-Smirnov test pokazao je da se raspodela udaljenosti od gola i ugla šuta statistički ne razlikuju značajno između bilo koja dva turnira (p &gt; 0,05 za sve parove). Ovo je ključan nalaz za tumačenje razlike u stopi konverzije: nije pronađen dokaz da se marginalne raspodele udaljenosti i ugla razlikuju, pa razlika u konverziji nije objašnjena tim dvema posmatranim geometrijskim karakteristikama. Mogući izvori razlike uključuju završnicu igrača, golmanski učinak, druge neobuhvaćene karakteristike šuta i slučajnu varijaciju.</w:t>
       </w:r>
     </w:p>
     <w:p>
@@ -4942,7 +4942,7 @@
           <w:sz w:val="22"/>
           <w:szCs w:val="22"/>
         </w:rPr>
-        <w:t xml:space="preserve">Dosledna prednost Modela B kroz sve metrike i obe validacione šeme jeste snažan indirektan pokazatelj, ali ne predstavlja sama po sebi formalni statistički dokaz da razlika nije slučajna, odnosno posledica varijanse uzorka. Da bi se ova razlika formalno testirala, sprovedena su dva nezavisna testa, prilagođena svakom od dva algoritma.</w:t>
+        <w:t xml:space="preserve">Dosledna prednost Modela B u ROC AUC i PR AUC kroz obe validacione šeme jeste snažan indirektan pokazatelj, ali ne predstavlja sama po sebi formalni statistički dokaz da razlika nije slučajna. Da bi se ova razlika formalno testirala, sprovedena su dva nezavisna testa, prilagođena svakom od dva algoritma.</w:t>
       </w:r>
     </w:p>
     <w:p>
@@ -5065,21 +5065,6 @@
     </w:p>
     <w:p>
       <w:pPr>
-        <w:spacing w:after="160" w:line="276"/>
-        <w:ind w:firstLine="397"/>
-        <w:jc w:val="both"/>
-      </w:pPr>
-      <w:r>
-        <w:rPr>
-          <w:rFonts w:ascii="Calibri" w:cs="Calibri" w:eastAsia="Calibri" w:hAnsi="Calibri"/>
-          <w:sz w:val="22"/>
-          <w:szCs w:val="22"/>
-        </w:rPr>
-        <w:t xml:space="preserve">Napomena o Likelihood Ratio testu: LR test je primenjen isključivo na neponderisanom, nepenalizovanom logističkom modelu (bez class_weight i bez regularizacije), jer ponderisanje klasa menja efektivnu likelihood funkciju. Prediktivni modeli koriste se za Brier/AUC izveštavanje; inferencijalni model služi isključivo za formalni test značajnosti.</w:t>
-      </w:r>
-    </w:p>
-    <w:p>
-      <w:pPr>
         <w:pStyle w:val="Heading2"/>
       </w:pPr>
       <w:r>
@@ -5658,7 +5643,7 @@
           <w:sz w:val="22"/>
           <w:szCs w:val="22"/>
         </w:rPr>
-        <w:t xml:space="preserve">Da bi se preciziralo koji deo prostorne informacije proizvodi poboljšanje, sprovedena je ablation analiza u kojoj su 360 atributi podeljeni u četiri grupe: golman (GK - udaljenost golmana), konusni branioci (CONE - branioci u konusu šuta i između šutera i gola), defanzivni pritisak (PRESSURE - pressure_score, broj branilaca u blizini), i linija šuta (SHOT_LINE - najbliži branilac liniji šuter-gol). Za svaku grupu treniran je Model A sa jednom dodatom grupom, i merena je LOTO AUC razlika u odnosu na čist Model A.</w:t>
+        <w:t xml:space="preserve">Da bi se preciziralo koji deo prostorne informacije proizvodi poboljšanje, sprovedena je ablation analiza u kojoj su 360 atributi podeljeni u pet grupa: golman (GK - udaljenost golmana), konusni branioci (CONE - branioci u konusu šuta i između šutera i gola), defanzivni pritisak (PRESSURE - pressure_score, broj branilaca u blizini), linija šuta (SHOT_LINE - najbliži branilac liniji šuter-gol), i otvorenost ugla (OPEN_ANGLE - open_angle_ratio_360). Za svaku grupu treniran je Model A sa jednom dodatom grupom, i merena je LOTO AUC razlika u odnosu na čist Model A.</w:t>
       </w:r>
     </w:p>
     <w:p>
@@ -5932,7 +5917,7 @@
                 <w:sz w:val="19"/>
                 <w:szCs w:val="19"/>
               </w:rPr>
-              <w:t xml:space="preserve">Model A + SHOT_LINE</w:t>
+              <w:t xml:space="preserve">Model A + OPEN_ANGLE</w:t>
             </w:r>
           </w:p>
         </w:tc>
@@ -6030,7 +6015,7 @@
                 <w:sz w:val="19"/>
                 <w:szCs w:val="19"/>
               </w:rPr>
-              <w:t xml:space="preserve">Model A + GK</w:t>
+              <w:t xml:space="preserve">Model A + SHOT_LINE</w:t>
             </w:r>
           </w:p>
         </w:tc>
@@ -6062,7 +6047,7 @@
                 <w:sz w:val="19"/>
                 <w:szCs w:val="19"/>
               </w:rPr>
-              <w:t xml:space="preserve">0,764</w:t>
+              <w:t xml:space="preserve">0,760</w:t>
             </w:r>
           </w:p>
         </w:tc>
@@ -6094,7 +6079,7 @@
                 <w:sz w:val="19"/>
                 <w:szCs w:val="19"/>
               </w:rPr>
-              <w:t xml:space="preserve">+0,004</w:t>
+              <w:t xml:space="preserve">+0,000</w:t>
             </w:r>
           </w:p>
         </w:tc>
@@ -6128,7 +6113,7 @@
                 <w:sz w:val="19"/>
                 <w:szCs w:val="19"/>
               </w:rPr>
-              <w:t xml:space="preserve">Model A + PRESSURE</w:t>
+              <w:t xml:space="preserve">Model A + GK</w:t>
             </w:r>
           </w:p>
         </w:tc>
@@ -6160,7 +6145,7 @@
                 <w:sz w:val="19"/>
                 <w:szCs w:val="19"/>
               </w:rPr>
-              <w:t xml:space="preserve">0,767</w:t>
+              <w:t xml:space="preserve">0,764</w:t>
             </w:r>
           </w:p>
         </w:tc>
@@ -6192,7 +6177,7 @@
                 <w:sz w:val="19"/>
                 <w:szCs w:val="19"/>
               </w:rPr>
-              <w:t xml:space="preserve">+0,007</w:t>
+              <w:t xml:space="preserve">+0,004</w:t>
             </w:r>
           </w:p>
         </w:tc>
@@ -6226,7 +6211,7 @@
                 <w:sz w:val="19"/>
                 <w:szCs w:val="19"/>
               </w:rPr>
-              <w:t xml:space="preserve">Model A + CONE</w:t>
+              <w:t xml:space="preserve">Model A + PRESSURE</w:t>
             </w:r>
           </w:p>
         </w:tc>
@@ -6258,7 +6243,7 @@
                 <w:sz w:val="19"/>
                 <w:szCs w:val="19"/>
               </w:rPr>
-              <w:t xml:space="preserve">0,768</w:t>
+              <w:t xml:space="preserve">0,767</w:t>
             </w:r>
           </w:p>
         </w:tc>
@@ -6290,7 +6275,7 @@
                 <w:sz w:val="19"/>
                 <w:szCs w:val="19"/>
               </w:rPr>
-              <w:t xml:space="preserve">+0,008</w:t>
+              <w:t xml:space="preserve">+0,007</w:t>
             </w:r>
           </w:p>
         </w:tc>
@@ -6324,6 +6309,104 @@
                 <w:sz w:val="19"/>
                 <w:szCs w:val="19"/>
               </w:rPr>
+              <w:t xml:space="preserve">Model A + CONE</w:t>
+            </w:r>
+          </w:p>
+        </w:tc>
+        <w:tc>
+          <w:tcPr>
+            <w:tcW w:type="dxa" w:w="3000"/>
+            <w:tcBorders>
+              <w:top w:val="single" w:color="BFBFBF" w:sz="4"/>
+              <w:left w:val="single" w:color="BFBFBF" w:sz="4"/>
+              <w:bottom w:val="single" w:color="BFBFBF" w:sz="4"/>
+              <w:right w:val="single" w:color="BFBFBF" w:sz="4"/>
+            </w:tcBorders>
+            <w:shd w:fill="F2F2F2" w:val="clear"/>
+            <w:tcMar>
+              <w:top w:type="dxa" w:w="60"/>
+              <w:left w:type="dxa" w:w="120"/>
+              <w:bottom w:type="dxa" w:w="60"/>
+              <w:right w:type="dxa" w:w="120"/>
+            </w:tcMar>
+            <w:vAlign w:val="center"/>
+          </w:tcPr>
+          <w:p>
+            <w:pPr>
+              <w:jc w:val="center"/>
+            </w:pPr>
+            <w:r>
+              <w:rPr>
+                <w:rFonts w:ascii="Calibri" w:cs="Calibri" w:eastAsia="Calibri" w:hAnsi="Calibri"/>
+                <w:sz w:val="19"/>
+                <w:szCs w:val="19"/>
+              </w:rPr>
+              <w:t xml:space="preserve">0,768</w:t>
+            </w:r>
+          </w:p>
+        </w:tc>
+        <w:tc>
+          <w:tcPr>
+            <w:tcW w:type="dxa" w:w="3000"/>
+            <w:tcBorders>
+              <w:top w:val="single" w:color="BFBFBF" w:sz="4"/>
+              <w:left w:val="single" w:color="BFBFBF" w:sz="4"/>
+              <w:bottom w:val="single" w:color="BFBFBF" w:sz="4"/>
+              <w:right w:val="single" w:color="BFBFBF" w:sz="4"/>
+            </w:tcBorders>
+            <w:shd w:fill="F2F2F2" w:val="clear"/>
+            <w:tcMar>
+              <w:top w:type="dxa" w:w="60"/>
+              <w:left w:type="dxa" w:w="120"/>
+              <w:bottom w:type="dxa" w:w="60"/>
+              <w:right w:type="dxa" w:w="120"/>
+            </w:tcMar>
+            <w:vAlign w:val="center"/>
+          </w:tcPr>
+          <w:p>
+            <w:pPr>
+              <w:jc w:val="center"/>
+            </w:pPr>
+            <w:r>
+              <w:rPr>
+                <w:rFonts w:ascii="Calibri" w:cs="Calibri" w:eastAsia="Calibri" w:hAnsi="Calibri"/>
+                <w:sz w:val="19"/>
+                <w:szCs w:val="19"/>
+              </w:rPr>
+              <w:t xml:space="preserve">+0,008</w:t>
+            </w:r>
+          </w:p>
+        </w:tc>
+      </w:tr>
+      <w:tr>
+        <w:tc>
+          <w:tcPr>
+            <w:tcW w:type="dxa" w:w="3000"/>
+            <w:tcBorders>
+              <w:top w:val="single" w:color="BFBFBF" w:sz="4"/>
+              <w:left w:val="single" w:color="BFBFBF" w:sz="4"/>
+              <w:bottom w:val="single" w:color="BFBFBF" w:sz="4"/>
+              <w:right w:val="single" w:color="BFBFBF" w:sz="4"/>
+            </w:tcBorders>
+            <w:shd w:fill="FFFFFF" w:val="clear"/>
+            <w:tcMar>
+              <w:top w:type="dxa" w:w="60"/>
+              <w:left w:type="dxa" w:w="120"/>
+              <w:bottom w:type="dxa" w:w="60"/>
+              <w:right w:type="dxa" w:w="120"/>
+            </w:tcMar>
+            <w:vAlign w:val="center"/>
+          </w:tcPr>
+          <w:p>
+            <w:pPr>
+              <w:jc w:val="left"/>
+            </w:pPr>
+            <w:r>
+              <w:rPr>
+                <w:rFonts w:ascii="Calibri" w:cs="Calibri" w:eastAsia="Calibri" w:hAnsi="Calibri"/>
+                <w:sz w:val="19"/>
+                <w:szCs w:val="19"/>
+              </w:rPr>
               <w:t xml:space="preserve">Model B (sve 360 grupe)</w:t>
             </w:r>
           </w:p>
@@ -6337,26 +6420,26 @@
               <w:bottom w:val="single" w:color="BFBFBF" w:sz="4"/>
               <w:right w:val="single" w:color="BFBFBF" w:sz="4"/>
             </w:tcBorders>
-            <w:shd w:fill="F2F2F2" w:val="clear"/>
-            <w:tcMar>
-              <w:top w:type="dxa" w:w="60"/>
-              <w:left w:type="dxa" w:w="120"/>
-              <w:bottom w:type="dxa" w:w="60"/>
-              <w:right w:type="dxa" w:w="120"/>
-            </w:tcMar>
-            <w:vAlign w:val="center"/>
-          </w:tcPr>
-          <w:p>
-            <w:pPr>
-              <w:jc w:val="center"/>
-            </w:pPr>
-            <w:r>
-              <w:rPr>
-                <w:rFonts w:ascii="Calibri" w:cs="Calibri" w:eastAsia="Calibri" w:hAnsi="Calibri"/>
-                <w:sz w:val="19"/>
-                <w:szCs w:val="19"/>
-              </w:rPr>
-              <w:t xml:space="preserve">0,773</w:t>
+            <w:shd w:fill="FFFFFF" w:val="clear"/>
+            <w:tcMar>
+              <w:top w:type="dxa" w:w="60"/>
+              <w:left w:type="dxa" w:w="120"/>
+              <w:bottom w:type="dxa" w:w="60"/>
+              <w:right w:type="dxa" w:w="120"/>
+            </w:tcMar>
+            <w:vAlign w:val="center"/>
+          </w:tcPr>
+          <w:p>
+            <w:pPr>
+              <w:jc w:val="center"/>
+            </w:pPr>
+            <w:r>
+              <w:rPr>
+                <w:rFonts w:ascii="Calibri" w:cs="Calibri" w:eastAsia="Calibri" w:hAnsi="Calibri"/>
+                <w:sz w:val="19"/>
+                <w:szCs w:val="19"/>
+              </w:rPr>
+              <w:t xml:space="preserve">0,772</w:t>
             </w:r>
           </w:p>
         </w:tc>
@@ -6369,26 +6452,26 @@
               <w:bottom w:val="single" w:color="BFBFBF" w:sz="4"/>
               <w:right w:val="single" w:color="BFBFBF" w:sz="4"/>
             </w:tcBorders>
-            <w:shd w:fill="F2F2F2" w:val="clear"/>
-            <w:tcMar>
-              <w:top w:type="dxa" w:w="60"/>
-              <w:left w:type="dxa" w:w="120"/>
-              <w:bottom w:type="dxa" w:w="60"/>
-              <w:right w:type="dxa" w:w="120"/>
-            </w:tcMar>
-            <w:vAlign w:val="center"/>
-          </w:tcPr>
-          <w:p>
-            <w:pPr>
-              <w:jc w:val="center"/>
-            </w:pPr>
-            <w:r>
-              <w:rPr>
-                <w:rFonts w:ascii="Calibri" w:cs="Calibri" w:eastAsia="Calibri" w:hAnsi="Calibri"/>
-                <w:sz w:val="19"/>
-                <w:szCs w:val="19"/>
-              </w:rPr>
-              <w:t xml:space="preserve">+0,013</w:t>
+            <w:shd w:fill="FFFFFF" w:val="clear"/>
+            <w:tcMar>
+              <w:top w:type="dxa" w:w="60"/>
+              <w:left w:type="dxa" w:w="120"/>
+              <w:bottom w:type="dxa" w:w="60"/>
+              <w:right w:type="dxa" w:w="120"/>
+            </w:tcMar>
+            <w:vAlign w:val="center"/>
+          </w:tcPr>
+          <w:p>
+            <w:pPr>
+              <w:jc w:val="center"/>
+            </w:pPr>
+            <w:r>
+              <w:rPr>
+                <w:rFonts w:ascii="Calibri" w:cs="Calibri" w:eastAsia="Calibri" w:hAnsi="Calibri"/>
+                <w:sz w:val="19"/>
+                <w:szCs w:val="19"/>
+              </w:rPr>
+              <w:t xml:space="preserve">+0,012</w:t>
             </w:r>
           </w:p>
         </w:tc>
@@ -6406,7 +6489,7 @@
           <w:sz w:val="22"/>
           <w:szCs w:val="22"/>
         </w:rPr>
-        <w:t xml:space="preserve">Rezultati pokazuju da najveći deo inkrementalne vrednosti dolazi iz informacije o broju i rasporedu protivnika u konusu šuta (CONE, +0,008), zatim iz defanzivnog pritiska (PRESSURE, +0,007), dok pozicija golmana donosi manji, ali merljiv doprinos (+0,004). Udaljenost branioca od linije šuta (SHOT_LINE) ne donosi praktično nikakav inkrementalni doprinos kad se doda sama, bez ostalih 360 atributa. Zaključak je da nije ceo 360 sloj podjednako vredan: najveći deo poboljšanja dolazi iz geometrijske informacije o zagušenosti prostora između šutera i gola. Napomena: ROC AUC za pun Model B u Tabeli 5 (0,773) blago se razlikuje od vrednosti u Tabeli 3 (0,769) jer ablation analiza koristi logističku regresiju bez hiperparametarskog podešavanja (GridSearchCV), za razliku od Tabele 3 gde je model optimizovan unutar svakog folda.</w:t>
+        <w:t xml:space="preserve">Rezultati pokazuju da najveći deo inkrementalne vrednosti dolazi iz informacije o broju i rasporedu protivnika u konusu šuta (CONE, +0,008), zatim iz defanzivnog pritiska (PRESSURE, +0,007), dok pozicija golmana donosi manji, ali merljiv doprinos (+0,004). Otvorenost ugla (OPEN_ANGLE) i udaljenost branioca od linije šuta (SHOT_LINE) ne donose praktično nikakav inkrementalni doprinos kad se dodaju samostalno, bez ostalih 360 atributa, ali open_angle_ratio_360 doprinosi u interakciji sa ostalim atributima unutar punog Modela B. Zaključak je da nije ceo 360 sloj podjednako vredan: najveći deo poboljšanja dolazi iz geometrijske informacije o zagušenosti prostora između šutera i gola. Napomena: ROC AUC za pun Model B u Tabeli 5 (0,772) blago se razlikuje od vrednosti u Tabeli 3 (0,771) jer ablation analiza koristi logističku regresiju bez hiperparametarskog podešavanja (GridSearchCV), za razliku od Tabele 3 gde je model optimizovan unutar svakog folda.</w:t>
       </w:r>
     </w:p>
     <w:p>
@@ -6444,7 +6527,7 @@
           <w:sz w:val="22"/>
           <w:szCs w:val="22"/>
         </w:rPr>
-        <w:t xml:space="preserve">SHAP analiza na Modelu B (XGBoost) pokazuje da je ugao šuta najuticajniji prediktor u fitovanom modelu, neposredno praćen otvorenošću ugla ka golu, izvedenom iz StatsBomb 360 podataka. Ovo je konkretan i merljiv nalaz o prediktivnoj asocijaciji prostornih atributa u modelu, ne o uzročnom efektu promene tih atributa na ishod.</w:t>
+        <w:t xml:space="preserve">SHAP analiza na Modelu B (XGBoost) pokazuje da je ugao šuta najuticajniji prediktor u fitovanom modelu, neposredno praćen udaljenošću golmana (goalkeeper_distance_360), koja se po prosečnoj apsolutnoj SHAP vrednosti plasira kao najuticajniji 360 atribut. Otvorenost ugla ka golu (open_angle_ratio_360) se rangira tek na 14. mestu, što ukazuje da njen samostalan prediktivni doprinos postoji pretežno u interakciji sa ostalim 360 atributima, ne nezavisno. Ovo je nalaz o prediktivnoj asocijaciji, ne o uzročnom efektu.</w:t>
       </w:r>
     </w:p>
     <w:p>
@@ -6528,7 +6611,7 @@
           <w:sz w:val="22"/>
           <w:szCs w:val="22"/>
         </w:rPr>
-        <w:t xml:space="preserve">Nalaz da Stratified K-Fold i Leave-One-Tournament-Out validacija daju praktično identične rezultate je ohrabrujući u pogledu robusnosti modela, ali zahteva oprez u tumačenju. Formalni Kolmogorov-Smirnov test je potvrdio da je geometrija šuta (udaljenost, ugao) statistički slična kroz sva tri turnira, što je verovatno glavni razlog zašto model generalizuje tako dobro: model se u najvećoj meri oslanja na geometrijske obrasce koji su univerzalni za fudbalsku igru, a ne na specifičnosti pojedinačnog turnira.</w:t>
+        <w:t xml:space="preserve">Nalaz da Stratified K-Fold i Leave-One-Tournament-Out validacija daju slične rezultate je ohrabrujući u pogledu robusnosti modela. Kolmogorov-Smirnov test nije pronašao dokaz da se marginalne raspodele udaljenosti i ugla šuta razlikuju između turnira, što je kompatibilno sa hipotezom da model koristi geometrijske obrasce koji su relativno univerzalni za fudbalsku igru, mada samo-marginalne raspodele ne isključuju razlike u zajedničkoj distribuciji ili drugim nemerenim faktorima.</w:t>
       </w:r>
     </w:p>
     <w:p>
@@ -6732,7 +6815,7 @@
           <w:sz w:val="22"/>
           <w:szCs w:val="22"/>
         </w:rPr>
-        <w:t xml:space="preserve">Ovaj rad je testirao da li StatsBomb 360 prostorni podaci o rasporedu igrača na terenu doprinose proceni verovatnoće gola u odnosu na model koji koristi samo klasične atribute samog šuta. Analiza na 3.968 šuteva iz tri velika međunarodna turnira (Svetsko prvenstvo 2022, Evropsko prvenstvo 2020 i Evropsko prvenstvo 2024) pokazala je da model sa StatsBomb 360 atributima konzistentno nadmašuje model bez njih, na svim metrikama diskriminacije i kalibracije, i u standardnoj unakrsnoj validaciji i u validaciji koja simulira primenu na potpuno nov turnir.</w:t>
+        <w:t xml:space="preserve">Ovaj rad je testirao da li StatsBomb 360 prostorni podaci o rasporedu igrača na terenu doprinose proceni verovatnoće gola u odnosu na model koji koristi samo klasične atribute samog šuta. Analiza na 3.968 šuteva iz tri velika međunarodna turnira (Svetsko prvenstvo 2022, Evropsko prvenstvo 2020 i Evropsko prvenstvo 2024) pokazala je da model sa StatsBomb 360 atributima konzistentno poboljšava ROC AUC i PR AUC u odnosu na model bez njih, dok su razlike u kalibrisanom Brier skoru male ali dosledne, i u standardnoj unakrsnoj validaciji i u validaciji koja simulira primenu na potpuno nov turnir.</w:t>
       </w:r>
     </w:p>
     <w:p>

</xml_diff>

<commit_message>
Final review round: ablation=not unique contrib, LR refs 3.4, isotonic prespecified, categories semantic, no interakcija claim
</commit_message>
<xml_diff>
--- a/xg_rad_nacrt.docx
+++ b/xg_rad_nacrt.docx
@@ -295,7 +295,7 @@
           <w:sz w:val="22"/>
           <w:szCs w:val="22"/>
         </w:rPr>
-        <w:t xml:space="preserve">Glavni nalaz rada je da Model B konzistentno poboljšava ROC AUC i PR AUC u odnosu na Model A, dok su razlike u kalibrisanom Brier skoru male. Ovaj doprinos se održava kroz sva tri turnira. Udaljenost golmana iz freeze-frame podataka (goalkeeper_distance_360) pokazala se kao najuticajniji 360 atribut u SHAP analizi, drugi ukupno posle ugla šuta. Ablation analiza pokazuje da najveći deo inkrementalne vrednosti dolazi iz informacije o zagušenosti prostora (CONE), zatim iz defanzivnog pritiska (PRESSURE) i pozicije golmana (GK), dok otvorenost ugla ka golu sama ne donosi merljiv doprinos izvan kombinacije sa ostalim 360 atributima.</w:t>
+        <w:t xml:space="preserve">Glavni nalaz rada je da Model B konzistentno poboljšava ROC AUC i PR AUC u odnosu na Model A, dok su razlike u kalibrisanom Brier skoru male. Ovaj doprinos se održava kroz sva tri turnira. Udaljenost golmana iz freeze-frame podataka (goalkeeper_distance_360) pokazala se kao najuticajniji 360 atribut u SHAP analizi, drugi ukupno posle ugla šuta. Ablation analiza pokazuje da CONE (branioci u konusu šuta) daje najveće poboljšanje kad se pojedinačno doda Modelu A, zatim PRESSURE i GK, dok otvorenost ugla sama ne donosi merljiv samostalan doprinos.</w:t>
       </w:r>
     </w:p>
     <w:p>
@@ -2342,7 +2342,7 @@
           <w:sz w:val="22"/>
           <w:szCs w:val="22"/>
         </w:rPr>
-        <w:t xml:space="preserve">Retke kategorije: tipovi šuta Corner (6 opservacija, 0 golova) i Free Kick (130 opservacija, 3 gola) uzrokovali su kvazi-savršenu separaciju u logističkoj regresiji. Rešeno je agregacijom u jedinstvenu kategoriju Set Piece pre kodiranja.</w:t>
+        <w:t xml:space="preserve">Retke kategorije: tipovi šuta Corner i Free Kick grupisani su u jedinstvenu kategoriju Set Piece pre kodiranja. Grupisanje je prespecifikovano semantički (oba su situacije iz prekida igre sa kvalitativno drugačijom dinamikom od otvorene igre); naknadno je primećeno da ono ujedno sprečava kvazi-savršenu separaciju u logističkoj regresiji, što potvrđuje ispravnost ove odluke.</w:t>
       </w:r>
     </w:p>
     <w:p>
@@ -2850,7 +2850,7 @@
           <w:sz w:val="22"/>
           <w:szCs w:val="22"/>
         </w:rPr>
-        <w:t xml:space="preserve">Vizuelna provera kalibracione krive otkrila je da sirovi modeli sistematski precenjuju verovatnoću gola u višem opsegu predviđenih vrednosti, što je očekivana posledica ponderisanja klasa radi poboljšanja diskriminacije manjinske klase. Stoga je primenjena post-hoc kalibracija metodom izotone regresije. Ključno: kalibraciona funkcija je naučena isključivo na trening delu svakog spoljnog folda (putem CalibratedClassifierCV sa unutrašnjom 3-fold validacijom), a nikada na test skupu na kome se izveštava finalni Brier skor. Ovim se izbegava optimistička pristrasnost koja bi nastala ako bi kalibrator video test labele tokom treniranja. Izveštavaju se i nekalibrisan i kalibrisan Brier skor, da bi čitalac mogao da proceni korist kalibracije nezavisno od leakage-a.</w:t>
+        <w:t xml:space="preserve">Metoda post-hoc kalibracije (izotona regresija) je unapred definisana kao deo pipeline-a, ne izabrana nakon posmatranja rezultata na test skupu. Kalibraciona funkcija je naučena isključivo na trening delu svakog spoljnog folda (putem CalibratedClassifierCV sa unutrašnjom 3-fold validacijom), a nikada na test skupu na kome se izveštava finalni Brier skor. Izveštavaju se i nekalibrisan i kalibrisan Brier skor, da bi čitalac mogao da proceni korist kalibracije nezavisno od leakage-a.</w:t>
       </w:r>
     </w:p>
     <w:p>
@@ -4957,7 +4957,7 @@
           <w:sz w:val="22"/>
           <w:szCs w:val="22"/>
         </w:rPr>
-        <w:t xml:space="preserve">Za logističku regresiju, Model A je formalno ugnježden u Model B: atributi Modela A predstavljaju tačan podskup atributa Modela B, pri čemu su dodatni atributi StatsBomb 360 prostorni atributi (udaljenost golmana, broj branilaca u konusu šuta, protivnici između šutera i gola, protivnici u kaznenom prostoru, najbliža udaljenost branioca od linije šuta, branioci unutar 1m i 2m od linije šuta, i defanzivni pritisak). Ugnježdena struktura modela dozvoljava primenu Likelihood Ratio (LR) testa, koji poredi logaritme verodostojnosti (log-likelihood) dva modela:</w:t>
+        <w:t xml:space="preserve">Za logističku regresiju, Model A je formalno ugnježden u Model B: atributi Modela A predstavljaju tačan podskup atributa Modela B, pri čemu Model B sadrži svih 11 dodatnih StatsBomb 360 prostornih atributa navedenih u odeljku 3.4. Ugnježdena struktura modela dozvoljava primenu Likelihood Ratio (LR) testa, koji poredi logaritme verodostojnosti (log-likelihood) dva modela:</w:t>
       </w:r>
     </w:p>
     <w:p>
@@ -6489,7 +6489,7 @@
           <w:sz w:val="22"/>
           <w:szCs w:val="22"/>
         </w:rPr>
-        <w:t xml:space="preserve">Rezultati pokazuju da najveći deo inkrementalne vrednosti dolazi iz informacije o broju i rasporedu protivnika u konusu šuta (CONE, +0,008), zatim iz defanzivnog pritiska (PRESSURE, +0,007), dok pozicija golmana donosi manji, ali merljiv doprinos (+0,004). Otvorenost ugla (OPEN_ANGLE) i udaljenost branioca od linije šuta (SHOT_LINE) ne donose praktično nikakav inkrementalni doprinos kad se dodaju samostalno, bez ostalih 360 atributa, ali open_angle_ratio_360 doprinosi u interakciji sa ostalim atributima unutar punog Modela B. Zaključak je da nije ceo 360 sloj podjednako vredan: najveći deo poboljšanja dolazi iz geometrijske informacije o zagušenosti prostora između šutera i gola. Napomena: ROC AUC za pun Model B u Tabeli 5 (0,772) blago se razlikuje od vrednosti u Tabeli 3 (0,771) jer ablation analiza koristi logističku regresiju bez hiperparametarskog podešavanja (GridSearchCV), za razliku od Tabele 3 gde je model optimizovan unutar svakog folda.</w:t>
+        <w:t xml:space="preserve">Rezultati pokazuju da CONE daje najveće poboljšanje kada se pojedinačno doda Modelu A (+0,008), zatim PRESSURE (+0,007) i GK (+0,004). OPEN_ANGLE i SHOT_LINE ne donose merljiv doprinos kad se dodaju samostalno. Ovo ne meri jedinstveni doprinos svake grupe u punom modelu (jer su 360 atributi međusobno korelisani), već performans grupe kada se izoluje i doda baseline-u. Otvorenost ugla nije pokazala samostalan inkrementalni doprinos; njen eventualni doprinos u punom modelu može biti posledica redundancije sa drugim prostornim atributima. Napomena: ROC AUC za pun Model B u Tabeli 5 (0,772) blago se razlikuje od vrednosti u Tabeli 3 (0,771) jer ablation koristi logističku regresiju bez GridSearchCV.</w:t>
       </w:r>
     </w:p>
     <w:p>

</xml_diff>

<commit_message>
Final language fixes: no interakcija claim, associational OR language, consistent cautious formulations
</commit_message>
<xml_diff>
--- a/xg_rad_nacrt.docx
+++ b/xg_rad_nacrt.docx
@@ -2932,7 +2932,7 @@
           <w:sz w:val="22"/>
           <w:szCs w:val="22"/>
         </w:rPr>
-        <w:t xml:space="preserve">Vrednost OR veća od 1 ukazuje na pozitivan efekat atributa na šansu gola, a vrednost manja od 1 na negativan efekat.</w:t>
+        <w:t xml:space="preserve">Vrednost OR veća od 1 ukazuje na pozitivnu asocijaciju atributa sa većim odds-om gola, a vrednost manja od 1 na negativnu asocijaciju.</w:t>
       </w:r>
     </w:p>
     <w:p>
@@ -6512,22 +6512,22 @@
           <w:sz w:val="22"/>
           <w:szCs w:val="22"/>
         </w:rPr>
-        <w:t xml:space="preserve">Logistička regresija na Modelu B pokazuje statistički značajan i fudbalski smislen Odds Ratio za ključne atribute: veća udaljenost od gola smanjuje šansu za gol, veći ugao šuta povećava šansu, šut glavom ima značajno niži Odds Ratio u odnosu na šut nogom, a veći udeo otvorenog (nezaklonjenog) ugla ka golu značajno povećava šansu (Odds Ratio približno 3,1; p &lt; 0,001), što je u skladu sa nalazima iz literature o nižoj stopi konverzije udaraca glavom u odnosu na udarce nogom.</w:t>
-      </w:r>
-    </w:p>
-    <w:p>
-      <w:pPr>
-        <w:spacing w:after="160" w:line="276"/>
-        <w:ind w:firstLine="397"/>
-        <w:jc w:val="both"/>
-      </w:pPr>
-      <w:r>
-        <w:rPr>
-          <w:rFonts w:ascii="Calibri" w:cs="Calibri" w:eastAsia="Calibri" w:hAnsi="Calibri"/>
-          <w:sz w:val="22"/>
-          <w:szCs w:val="22"/>
-        </w:rPr>
-        <w:t xml:space="preserve">SHAP analiza na Modelu B (XGBoost) pokazuje da je ugao šuta najuticajniji prediktor u fitovanom modelu, neposredno praćen udaljenošću golmana (goalkeeper_distance_360), koja se po prosečnoj apsolutnoj SHAP vrednosti plasira kao najuticajniji 360 atribut. Otvorenost ugla ka golu (open_angle_ratio_360) se rangira tek na 14. mestu, što ukazuje da njen samostalan prediktivni doprinos postoji pretežno u interakciji sa ostalim 360 atributima, ne nezavisno. Ovo je nalaz o prediktivnoj asocijaciji, ne o uzročnom efektu.</w:t>
+        <w:t xml:space="preserve">Logistička regresija na Modelu B pokazuje statistički značajan Odds Ratio za ključne atribute: veća udaljenost od gola asocirana je sa nižim odds-om gola, veći ugao šuta asociran je sa višim odds-om, šut glavom ima značajno niži Odds Ratio u odnosu na šut nogom, što je u skladu sa nalazima iz literature o nižoj stopi konverzije udaraca glavom.</w:t>
+      </w:r>
+    </w:p>
+    <w:p>
+      <w:pPr>
+        <w:spacing w:after="160" w:line="276"/>
+        <w:ind w:firstLine="397"/>
+        <w:jc w:val="both"/>
+      </w:pPr>
+      <w:r>
+        <w:rPr>
+          <w:rFonts w:ascii="Calibri" w:cs="Calibri" w:eastAsia="Calibri" w:hAnsi="Calibri"/>
+          <w:sz w:val="22"/>
+          <w:szCs w:val="22"/>
+        </w:rPr>
+        <w:t xml:space="preserve">SHAP analiza na Modelu B (XGBoost) pokazuje da je ugao šuta najuticajniji prediktor u fitovanom modelu, neposredno praćen udaljenošću golmana (goalkeeper_distance_360), koja se plasira kao najuticajniji 360 atribut. Otvorenost ugla ka golu (open_angle_ratio_360) rangira se tek na 14. mestu; nije pokazala samostalan inkrementalni doprinos u ablation analizi, a eventualna vrednost u punom modelu može odražavati redundanciju sa drugim prostornim atributima. Ovo je nalaz o prediktivnoj asocijaciji, ne o uzročnom efektu.</w:t>
       </w:r>
     </w:p>
     <w:p>
@@ -6830,7 +6830,7 @@
           <w:sz w:val="22"/>
           <w:szCs w:val="22"/>
         </w:rPr>
-        <w:t xml:space="preserve">Udaljenost golmana iz freeze-frame podataka (goalkeeper_distance_360) pokazala se kao najuticajniji 360 prediktor u fitovanom XGBoost modelu, odmah iza ugla šuta. Otvorenost ugla ka golu (open_angle_ratio_360), iako uključena u Model B, rangira se tek na 14. mestu po SHAP važnosti — njen doprinos postoji pretežno u interakciji sa ostalim 360 atributima, ne samostalno. Ovo je nalaz o prediktivnoj asocijaciji, ne o uzročnom efektu. Istovremeno, nije pronađen dokaz da se marginalne raspodele udaljenosti i ugla šuta razlikuju između turnira (KS test); razlika u konverziji stoga nije objašnjena tim dvema posmatranim geometrijskim karakteristikama, a mogući izvori uključuju završnicu, golmanski učinak i slučajnu varijaciju.</w:t>
+        <w:t xml:space="preserve">Udaljenost golmana iz freeze-frame podataka (goalkeeper_distance_360) pokazala se kao najuticajniji 360 prediktor u fitovanom XGBoost modelu, odmah iza ugla šuta. Otvorenost ugla ka golu (open_angle_ratio_360), iako uključena u Model B, rangira se tek na 14. mestu po SHAP važnosti i nije pokazala samostalan inkrementalni doprinos u ablation analizi; eventualna vrednost u punom modelu može odražavati redundanciju sa drugim prostornim atributima. Ovo je nalaz o prediktivnoj asocijaciji, ne o uzročnom efektu. Istovremeno, nije pronađen dokaz da se marginalne raspodele udaljenosti i ugla šuta razlikuju između turnira (KS test); razlika u konverziji stoga nije objašnjena tim dvema posmatranim geometrijskim karakteristikama, a mogući izvori uključuju završnicu, golmanski učinak i slučajnu varijaciju.</w:t>
       </w:r>
     </w:p>
     <w:p>

</xml_diff>

<commit_message>
Fix p=0.059 and nelinearnost formulations (final text fixes)
</commit_message>
<xml_diff>
--- a/xg_rad_nacrt.docx
+++ b/xg_rad_nacrt.docx
@@ -3083,7 +3083,7 @@
           <w:sz w:val="22"/>
           <w:szCs w:val="22"/>
         </w:rPr>
-        <w:t xml:space="preserve">Asocijacija između tipa akcije koja prethodi šutu i ishoda (H1) nije dostigla statističku značajnost na nivou α = 0,05 (hi-kvadrat = 14,996; p = 0,059), mada je rezultat granično blizu praga, što sugeriše mogući slab efekat koji bi veći uzorak mogao razjasniti.</w:t>
+        <w:t xml:space="preserve">Asocijacija između tipa akcije koja prethodi šutu i ishoda (H1) nije dostigla statističku značajnost na nivou alfa = 0,05 (hi-kvadrat = 14,996; p = 0,059). Nije pronađen statistički značajan dokaz o marginalnoj asocijaciji na ovom nivou.</w:t>
       </w:r>
     </w:p>
     <w:p>
@@ -6542,7 +6542,7 @@
           <w:sz w:val="22"/>
           <w:szCs w:val="22"/>
         </w:rPr>
-        <w:t xml:space="preserve">Zanimljiv je nesklad između dva pristupa interpretaciji za atribut najbliže udaljenosti branioca od linije šuta: u logističkoj regresiji ovaj atribut nije statistički značajan (p = 0,645), dok se u SHAP analizi XGBoost modela plasira na petom mestu po uticaju, odmah iza udaljenosti golmana. Ovaj nesklad sugeriše da efekat ovog atributa nije linearan, odnosno da ga logistička regresija ne uspeva u potpunosti da uhvati, dok XGBoost prirodno modeluje takav nelinearni ili interakcijski efekat. Ovo je dodatni argument u prilog korišćenju oba modela paralelno, jer se njihove interpretacije međusobno nadopunjuju.</w:t>
+        <w:t xml:space="preserve">Zanimljiv je nesklad između dva pristupa interpretaciji za atribut najbliže udaljenosti branioca od linije šuta: u logističkoj regresiji ovaj atribut nije statistički značajan (p = 0,645), dok se u SHAP analizi XGBoost modela plasira na petom mestu po uticaju. Ovaj nesklad može ukazivati na nelinearnost ili interakcije koje logistički model ne hvata, ali sam po sebi ne identifikuje uzrok nesklada (mogući faktori uključuju i korelaciju sa drugim feature-ima i razlike u regularizaciji između dva modela).</w:t>
       </w:r>
     </w:p>
     <w:p>

</xml_diff>

<commit_message>
Coordinate units clarified (yards, no conversion needed), StandardScaler confirmed present, p=0.059 and nelinearnost fixed
</commit_message>
<xml_diff>
--- a/xg_rad_nacrt.docx
+++ b/xg_rad_nacrt.docx
@@ -467,7 +467,7 @@
           <w:sz w:val="22"/>
           <w:szCs w:val="22"/>
         </w:rPr>
-        <w:t xml:space="preserve">StatsBomb koristi sopstveni koordinatni sistem terena dimenzija 120 x 80 jedinica, gde se gol nalazi na poziciji x=120, y=40. Ovaj sistem korišćen je dosledno kroz čitav rad, uključujući i grafički prikaz terena u pratećoj demonstracionoj veb aplikaciji.</w:t>
+        <w:t xml:space="preserve">StatsBomb koristi sopstveni koordinatni sistem terena dimenzija 120 x 80 jedinica. Ove jedinice odgovaraju jardima (standardni fudbalski teren je 120 x 80 jardi, odnosno približno 110 x 73 metra). Gol se nalazi na poziciji x=120, y=40, a širina gola iznosi 8 jardi (7,32 metra), što u ovom koordinatnom sistemu odgovara rastojanju od y=36,34 do y=43,66. Svi geometrijski proračuni (udaljenost, ugao, radijus pritiska od 10 jardi) sprovedeni su dosledno unutar ovog sistema, bez potrebe za konverzijom. Defanzivni pritisak koristi radijus od 10 jardi, što u istom sistemu odgovara 10 koordinatnih jedinica.</w:t>
       </w:r>
     </w:p>
     <w:p>
@@ -6732,7 +6732,7 @@
           <w:sz w:val="22"/>
           <w:szCs w:val="22"/>
         </w:rPr>
-        <w:t xml:space="preserve">Peto, atributi nisu skalirani pre primene L2-regularizovane logističke regresije, što znači da regularizacioni parametar C neravnomerno penalizuje koeficijente atributa različitih skala. S obzirom na to da je optimalni C približno 0,85 (relativno slaba regularizacija), efekat ovog propusta procenjuje se kao zanemarljiv, ali se navodi kao metodološka nepreciznost.</w:t>
+        <w:t xml:space="preserve">Peto, numerički atributi su skalirani primenom StandardScaler-a unutar svakog trening folda (kao deo sklearn Pipeline/ColumnTransformer), čime se obezbeđuje da L2 regularizacija ravnomerno penalizuje koeficijente bez obzira na originalnu skalu atributa.</w:t>
       </w:r>
     </w:p>
     <w:p>
@@ -6792,7 +6792,7 @@
           <w:sz w:val="22"/>
           <w:szCs w:val="22"/>
         </w:rPr>
-        <w:t xml:space="preserve">Deveto, koordinate su u StatsBomb sistemu (0-120 x 0-80), a radijus defanzivnog pritiska i širina gola su izraženi u fizičkim jedinicama (jardi/metri). Konverzija je primenjenja linerano (1 SB jedinica = 105/120 = 0,875m za x-osu), ali ovo treba jasno navesti jer StatsBomb ne objavljuje zvanično mapiranje na fizičke dimenzije terena.</w:t>
+        <w:t xml:space="preserve">Deveto, StatsBomb koordinatni sistem (120x80) tretiram se kao jarde na osnovu standardnih dimenzija fudbalskog terena (120x80 jardi). StatsBomb ne objavljuje zvanično mapiranje na fizičke dimenzije, ali konzistentnost između širine gola (8 jardi = 7,32m) i pozicija stubova u koordinatnom sistemu (razmak od 7,32 jedinica) potvrđuje da je interpretacija u jardima ispravna. Svi geometrijski proračuni su dosledno unutar istog sistema.</w:t>
       </w:r>
     </w:p>
     <w:p>

</xml_diff>

<commit_message>
Fix coordinate units: c=8 coord units (yard-equivalent), posts at y=36/44, academically defensible formulation
</commit_message>
<xml_diff>
--- a/xg_rad_nacrt.docx
+++ b/xg_rad_nacrt.docx
@@ -467,7 +467,7 @@
           <w:sz w:val="22"/>
           <w:szCs w:val="22"/>
         </w:rPr>
-        <w:t xml:space="preserve">StatsBomb koristi sopstveni koordinatni sistem terena dimenzija 120 x 80 jedinica. Ove jedinice odgovaraju jardima (standardni fudbalski teren je 120 x 80 jardi, odnosno približno 110 x 73 metra). Gol se nalazi na poziciji x=120, y=40, a širina gola iznosi 8 jardi (7,32 metra), što u ovom koordinatnom sistemu odgovara rastojanju od y=36,34 do y=43,66. Svi geometrijski proračuni (udaljenost, ugao, radijus pritiska od 10 jardi) sprovedeni su dosledno unutar ovog sistema, bez potrebe za konverzijom. Defanzivni pritisak koristi radijus od 10 jardi, što u istom sistemu odgovara 10 koordinatnih jedinica.</w:t>
+        <w:t xml:space="preserve">StatsBomb koristi sopstveni koordinatni sistem terena dimenzija 120 x 80 koordinatnih jedinica. U geometrijskim proračunima ove koordinatne jedinice tretirane su kao yard-ekvivalentne, jer standardne yard dimenzije fudbalskog terena numerički odgovaraju koordinatama (StatsBomb dokumentacija koristi 6, 12 i 18 koordinatnih jedinica za standardne yard dimenzije kaznenog prostora). Gol se nalazi na poziciji x=120, y=40, a širina gola od 8 koordinatnih jedinica (što odgovara fizičkoj širini gola od približno 7,32 m) daje raspon y=36 do y=44. Svi geometrijski proračuni (udaljenost, ugao, radijus pritiska od 10 koordinatnih jedinica) sprovedeni su dosledno unutar ovog sistema.</w:t>
       </w:r>
     </w:p>
     <w:p>
@@ -573,7 +573,7 @@
           <w:sz w:val="22"/>
           <w:szCs w:val="22"/>
         </w:rPr>
-        <w:t xml:space="preserve">Ugao šuta računa se primenom zakona kosinusa na trougao formiran tačkom šuta i dva gol-direka, gde su a i b udaljenosti od tačke šuta do levog i desnog gol-direka, a c je širina gola (7,32 metra):</w:t>
+        <w:t xml:space="preserve">Ugao šuta računa se primenom zakona kosinusa na trougao formiran tačkom šuta i dva gol-direka, gde su a i b udaljenosti od tačke šuta do levog i desnog gol-direka u StatsBomb koordinatnom sistemu, a c = 8 koordinatnih jedinica (fizička širina gola od približno 7,32 m):</w:t>
       </w:r>
     </w:p>
     <w:p>
@@ -6792,7 +6792,7 @@
           <w:sz w:val="22"/>
           <w:szCs w:val="22"/>
         </w:rPr>
-        <w:t xml:space="preserve">Deveto, StatsBomb koordinatni sistem (120x80) tretiram se kao jarde na osnovu standardnih dimenzija fudbalskog terena (120x80 jardi). StatsBomb ne objavljuje zvanično mapiranje na fizičke dimenzije, ali konzistentnost između širine gola (8 jardi = 7,32m) i pozicija stubova u koordinatnom sistemu (razmak od 7,32 jedinica) potvrđuje da je interpretacija u jardima ispravna. Svi geometrijski proračuni su dosledno unutar istog sistema.</w:t>
+        <w:t xml:space="preserve">Deveto, StatsBomb koordinatni sistem (120x80) tretiran je kao yard-ekvivalentan na osnovu toga što standardne yard dimenzije fudbalskog terena numerički odgovaraju koordinatama u StatsBomb dokumentaciji (6, 12 i 18 koordinatnih jedinica za kazneni prostor). StatsBomb formalno ne naziva ove jedinice jardima, ali konzistentnost sa standardnim dimenzijama podržava ovu interpretaciju. Svi geometrijski proračuni sprovedeni su dosledno unutar ovog sistema (c=8 za širinu gola, radijus=10 za pritisak).</w:t>
       </w:r>
     </w:p>
     <w:p>

</xml_diff>

<commit_message>
Fix unit labels: distances and radii in coordinate units (yard-equivalent), not meters
</commit_message>
<xml_diff>
--- a/xg_rad_nacrt.docx
+++ b/xg_rad_nacrt.docx
@@ -2365,7 +2365,7 @@
           <w:sz w:val="22"/>
           <w:szCs w:val="22"/>
         </w:rPr>
-        <w:t xml:space="preserve">Centralna teza rada zahteva eksplicitno poređenje dva modela, ne samo apsolutnu procenu jednog modela. Model A koristi isključivo klasične event atribute: udaljenost od gola, ugao šuta, da li je šut prvim dodirom, da li je šut jedan-na-jedan, deo tela i tip šuta. Model B sadrži sve atribute Modela A, uz dodatak StatsBomb 360 prostornih atributa (ukupno 11): udaljenost golmana, broj branilaca u konusu šuta, broj protivnika između šutera i gola, protivnici u kaznenom prostoru, broj branilaca unutar 5m i 10m, najbliža udaljenost branioca od linije šuta, broj branilaca unutar 1m i 2m od linije šuta, kontinuiranu meru defanzivnog pritiska (pressure_score), i otvorenost ugla ka golu (open_angle_ratio_360).</w:t>
+        <w:t xml:space="preserve">Centralna teza rada zahteva eksplicitno poređenje dva modela, ne samo apsolutnu procenu jednog modela. Model A koristi isključivo klasične event atribute: udaljenost od gola, ugao šuta, da li je šut prvim dodirom, da li je šut jedan-na-jedan, deo tela i tip šuta. Model B sadrži sve atribute Modela A, uz dodatak StatsBomb 360 prostornih atributa (ukupno 11): udaljenost golmana, broj branilaca u konusu šuta, broj protivnika između šutera i gola, protivnici u kaznenom prostoru, broj branilaca unutar 5 i 10 koordinatnih jedinica, najbliža udaljenost branioca od linije šuta, broj branilaca unutar 1 i 2 koordinatne jedinice od linije šuta, kontinuiranu meru defanzivnog pritiska (pressure_score), i otvorenost ugla ka golu (open_angle_ratio_360).</w:t>
       </w:r>
     </w:p>
     <w:p>
@@ -3068,7 +3068,7 @@
           <w:sz w:val="22"/>
           <w:szCs w:val="22"/>
         </w:rPr>
-        <w:t xml:space="preserve">Medijana udaljenosti od gola za golove iznosi 11,74 metara, naspram 18,84 metara za promašaje, dok medijana ugla šuta za golove iznosi 33,82 stepena, naspram 19,44 stepena za promašaje. Obe razlike su statistički vrlo značajne (Mann-Whitney U test, H2: p &lt; 10⁻⁴⁷; H3: p &lt; 10⁻⁵¹), što je u potpunosti u skladu sa fudbalskom intuicijom: golovi se postižu sa manje udaljenosti i pod širim uglom u odnosu na promašaje.</w:t>
+        <w:t xml:space="preserve">Medijana udaljenosti od gola za golove iznosi 11,74 koordinatnih jedinica, naspram 18,84 koordinatnih jedinica za promašaje, dok medijana ugla šuta za golove iznosi 33,82 stepena, naspram 19,44 stepena za promašaje. Obe razlike su statistički vrlo značajne (Mann-Whitney U test, H2: p &lt; 10⁻⁴⁷; H3: p &lt; 10⁻⁵¹), što je u potpunosti u skladu sa fudbalskom intuicijom: golovi se postižu sa manje udaljenosti i pod širim uglom u odnosu na promašaje.</w:t>
       </w:r>
     </w:p>
     <w:p>

</xml_diff>

<commit_message>
Final: pressure_score 10 jardi -> 10 koordinatnih jedinica (terminological consistency)
</commit_message>
<xml_diff>
--- a/xg_rad_nacrt.docx
+++ b/xg_rad_nacrt.docx
@@ -740,7 +740,7 @@
           <w:sz w:val="22"/>
           <w:szCs w:val="22"/>
         </w:rPr>
-        <w:t xml:space="preserve">Atribut defanzivnog pritiska (pressure_score) predstavlja kontinuiranu meru ukupnog defanzivnog pritiska, gde svaki protivnik unutar 10 jardi od šutera doprinosi pritisku obrnuto proporcionalno svojoj udaljenosti, sa malom konstantom (0,5) koja sprečava deljenje nulom za branioce na nultoj udaljenosti:</w:t>
+        <w:t xml:space="preserve">Atribut defanzivnog pritiska (pressure_score) predstavlja kontinuiranu meru ukupnog defanzivnog pritiska, gde svaki protivnik unutar 10 koordinatnih jedinica (yard-ekvivalentno) od šutera doprinosi pritisku obrnuto proporcionalno svojoj udaljenosti, sa malom konstantom (0,5) koja sprečava deljenje nulom za branioce na nultoj udaljenosti:</w:t>
       </w:r>
     </w:p>
     <w:p>
@@ -797,7 +797,7 @@
           <w:sz w:val="22"/>
           <w:szCs w:val="22"/>
         </w:rPr>
-        <w:t xml:space="preserve">gde se sumiranje vrši po svim protivnicima i čija je udaljenost od šutera dᵢ manja ili jednaka 10 jardi.</w:t>
+        <w:t xml:space="preserve">gde se sumiranje vrši po svim protivnicima čija je udaljenost od šutera dᵢ manja ili jednaka 10 koordinatnih jedinica.</w:t>
       </w:r>
     </w:p>
     <w:p>

</xml_diff>

<commit_message>
Add freeze-frame visibility analysis (Tabela 6, 7, Slika 3) to Word document
</commit_message>
<xml_diff>
--- a/xg_rad_nacrt.docx
+++ b/xg_rad_nacrt.docx
@@ -6543,6 +6543,1537 @@
           <w:szCs w:val="22"/>
         </w:rPr>
         <w:t xml:space="preserve">Zanimljiv je nesklad između dva pristupa interpretaciji za atribut najbliže udaljenosti branioca od linije šuta: u logističkoj regresiji ovaj atribut nije statistički značajan (p = 0,645), dok se u SHAP analizi XGBoost modela plasira na petom mestu po uticaju. Ovaj nesklad može ukazivati na nelinearnost ili interakcije koje logistički model ne hvata, ali sam po sebi ne identifikuje uzrok nesklada (mogući faktori uključuju i korelaciju sa drugim feature-ima i razlike u regularizaciji između dva modela).</w:t>
+      </w:r>
+    </w:p>
+    <w:p>
+      <w:pPr>
+        <w:pStyle w:val="Heading2"/>
+      </w:pPr>
+      <w:r>
+        <w:t xml:space="preserve">4.7. Analiza kompletnosti freeze-frame podataka</w:t>
+      </w:r>
+    </w:p>
+    <w:p>
+      <w:pPr>
+        <w:spacing w:after="160" w:line="276"/>
+        <w:ind w:firstLine="397"/>
+        <w:jc w:val="both"/>
+      </w:pPr>
+      <w:r>
+        <w:rPr>
+          <w:rFonts w:ascii="Calibri" w:cs="Calibri" w:eastAsia="Calibri" w:hAnsi="Calibri"/>
+          <w:sz w:val="22"/>
+          <w:szCs w:val="22"/>
+        </w:rPr>
+        <w:t xml:space="preserve">StatsBomb 360 freeze-frame ne garantuje vidljivost svih 22 igrača na terenu. Broj vidljivih igrača po šutu varira zavisno od ugla kamere i okluzije. Tabela 6 prikazuje deskriptivnu statistiku broja vidljivih igrača i vidljivih protivnika po turniru.</w:t>
+      </w:r>
+    </w:p>
+    <w:p>
+      <w:pPr>
+        <w:spacing w:after="240" w:before="60"/>
+        <w:jc w:val="center"/>
+      </w:pPr>
+      <w:r>
+        <w:rPr>
+          <w:rFonts w:ascii="Calibri" w:cs="Calibri" w:eastAsia="Calibri" w:hAnsi="Calibri"/>
+          <w:i/>
+          <w:iCs/>
+          <w:color w:val="444444"/>
+          <w:sz w:val="18"/>
+          <w:szCs w:val="18"/>
+        </w:rPr>
+        <w:t xml:space="preserve">Tabela 6. Deskriptivna statistika broja vidljivih igrača u freeze-frame podacima po turniru.</w:t>
+      </w:r>
+    </w:p>
+    <w:tbl>
+      <w:tblPr>
+        <w:tblW w:type="dxa" w:w="9000"/>
+        <w:tblBorders>
+          <w:top w:val="single" w:color="auto" w:sz="4"/>
+          <w:left w:val="single" w:color="auto" w:sz="4"/>
+          <w:bottom w:val="single" w:color="auto" w:sz="4"/>
+          <w:right w:val="single" w:color="auto" w:sz="4"/>
+          <w:insideH w:val="single" w:color="auto" w:sz="4"/>
+          <w:insideV w:val="single" w:color="auto" w:sz="4"/>
+        </w:tblBorders>
+      </w:tblPr>
+      <w:tblGrid>
+        <w:gridCol w:w="1800"/>
+        <w:gridCol w:w="1800"/>
+        <w:gridCol w:w="1800"/>
+        <w:gridCol w:w="1800"/>
+        <w:gridCol w:w="1800"/>
+      </w:tblGrid>
+      <w:tr>
+        <w:trPr>
+          <w:tblHeader/>
+        </w:trPr>
+        <w:tc>
+          <w:tcPr>
+            <w:tcW w:type="dxa" w:w="1800"/>
+            <w:tcBorders>
+              <w:top w:val="single" w:color="BFBFBF" w:sz="4"/>
+              <w:left w:val="single" w:color="BFBFBF" w:sz="4"/>
+              <w:bottom w:val="single" w:color="BFBFBF" w:sz="4"/>
+              <w:right w:val="single" w:color="BFBFBF" w:sz="4"/>
+            </w:tcBorders>
+            <w:shd w:fill="1F3864" w:val="clear"/>
+            <w:tcMar>
+              <w:top w:type="dxa" w:w="80"/>
+              <w:left w:type="dxa" w:w="120"/>
+              <w:bottom w:type="dxa" w:w="80"/>
+              <w:right w:type="dxa" w:w="120"/>
+            </w:tcMar>
+            <w:vAlign w:val="center"/>
+          </w:tcPr>
+          <w:p>
+            <w:pPr>
+              <w:jc w:val="center"/>
+            </w:pPr>
+            <w:r>
+              <w:rPr>
+                <w:rFonts w:ascii="Calibri" w:cs="Calibri" w:eastAsia="Calibri" w:hAnsi="Calibri"/>
+                <w:b/>
+                <w:bCs/>
+                <w:color w:val="FFFFFF"/>
+                <w:sz w:val="19"/>
+                <w:szCs w:val="19"/>
+              </w:rPr>
+              <w:t xml:space="preserve">Turnir</w:t>
+            </w:r>
+          </w:p>
+        </w:tc>
+        <w:tc>
+          <w:tcPr>
+            <w:tcW w:type="dxa" w:w="1800"/>
+            <w:tcBorders>
+              <w:top w:val="single" w:color="BFBFBF" w:sz="4"/>
+              <w:left w:val="single" w:color="BFBFBF" w:sz="4"/>
+              <w:bottom w:val="single" w:color="BFBFBF" w:sz="4"/>
+              <w:right w:val="single" w:color="BFBFBF" w:sz="4"/>
+            </w:tcBorders>
+            <w:shd w:fill="1F3864" w:val="clear"/>
+            <w:tcMar>
+              <w:top w:type="dxa" w:w="80"/>
+              <w:left w:type="dxa" w:w="120"/>
+              <w:bottom w:type="dxa" w:w="80"/>
+              <w:right w:type="dxa" w:w="120"/>
+            </w:tcMar>
+            <w:vAlign w:val="center"/>
+          </w:tcPr>
+          <w:p>
+            <w:pPr>
+              <w:jc w:val="center"/>
+            </w:pPr>
+            <w:r>
+              <w:rPr>
+                <w:rFonts w:ascii="Calibri" w:cs="Calibri" w:eastAsia="Calibri" w:hAnsi="Calibri"/>
+                <w:b/>
+                <w:bCs/>
+                <w:color w:val="FFFFFF"/>
+                <w:sz w:val="19"/>
+                <w:szCs w:val="19"/>
+              </w:rPr>
+              <w:t xml:space="preserve">Vidljivi igrači (median)</w:t>
+            </w:r>
+          </w:p>
+        </w:tc>
+        <w:tc>
+          <w:tcPr>
+            <w:tcW w:type="dxa" w:w="1800"/>
+            <w:tcBorders>
+              <w:top w:val="single" w:color="BFBFBF" w:sz="4"/>
+              <w:left w:val="single" w:color="BFBFBF" w:sz="4"/>
+              <w:bottom w:val="single" w:color="BFBFBF" w:sz="4"/>
+              <w:right w:val="single" w:color="BFBFBF" w:sz="4"/>
+            </w:tcBorders>
+            <w:shd w:fill="1F3864" w:val="clear"/>
+            <w:tcMar>
+              <w:top w:type="dxa" w:w="80"/>
+              <w:left w:type="dxa" w:w="120"/>
+              <w:bottom w:type="dxa" w:w="80"/>
+              <w:right w:type="dxa" w:w="120"/>
+            </w:tcMar>
+            <w:vAlign w:val="center"/>
+          </w:tcPr>
+          <w:p>
+            <w:pPr>
+              <w:jc w:val="center"/>
+            </w:pPr>
+            <w:r>
+              <w:rPr>
+                <w:rFonts w:ascii="Calibri" w:cs="Calibri" w:eastAsia="Calibri" w:hAnsi="Calibri"/>
+                <w:b/>
+                <w:bCs/>
+                <w:color w:val="FFFFFF"/>
+                <w:sz w:val="19"/>
+                <w:szCs w:val="19"/>
+              </w:rPr>
+              <w:t xml:space="preserve">IQR</w:t>
+            </w:r>
+          </w:p>
+        </w:tc>
+        <w:tc>
+          <w:tcPr>
+            <w:tcW w:type="dxa" w:w="1800"/>
+            <w:tcBorders>
+              <w:top w:val="single" w:color="BFBFBF" w:sz="4"/>
+              <w:left w:val="single" w:color="BFBFBF" w:sz="4"/>
+              <w:bottom w:val="single" w:color="BFBFBF" w:sz="4"/>
+              <w:right w:val="single" w:color="BFBFBF" w:sz="4"/>
+            </w:tcBorders>
+            <w:shd w:fill="1F3864" w:val="clear"/>
+            <w:tcMar>
+              <w:top w:type="dxa" w:w="80"/>
+              <w:left w:type="dxa" w:w="120"/>
+              <w:bottom w:type="dxa" w:w="80"/>
+              <w:right w:type="dxa" w:w="120"/>
+            </w:tcMar>
+            <w:vAlign w:val="center"/>
+          </w:tcPr>
+          <w:p>
+            <w:pPr>
+              <w:jc w:val="center"/>
+            </w:pPr>
+            <w:r>
+              <w:rPr>
+                <w:rFonts w:ascii="Calibri" w:cs="Calibri" w:eastAsia="Calibri" w:hAnsi="Calibri"/>
+                <w:b/>
+                <w:bCs/>
+                <w:color w:val="FFFFFF"/>
+                <w:sz w:val="19"/>
+                <w:szCs w:val="19"/>
+              </w:rPr>
+              <w:t xml:space="preserve">Vidljivi protivnici (median)</w:t>
+            </w:r>
+          </w:p>
+        </w:tc>
+        <w:tc>
+          <w:tcPr>
+            <w:tcW w:type="dxa" w:w="1800"/>
+            <w:tcBorders>
+              <w:top w:val="single" w:color="BFBFBF" w:sz="4"/>
+              <w:left w:val="single" w:color="BFBFBF" w:sz="4"/>
+              <w:bottom w:val="single" w:color="BFBFBF" w:sz="4"/>
+              <w:right w:val="single" w:color="BFBFBF" w:sz="4"/>
+            </w:tcBorders>
+            <w:shd w:fill="1F3864" w:val="clear"/>
+            <w:tcMar>
+              <w:top w:type="dxa" w:w="80"/>
+              <w:left w:type="dxa" w:w="120"/>
+              <w:bottom w:type="dxa" w:w="80"/>
+              <w:right w:type="dxa" w:w="120"/>
+            </w:tcMar>
+            <w:vAlign w:val="center"/>
+          </w:tcPr>
+          <w:p>
+            <w:pPr>
+              <w:jc w:val="center"/>
+            </w:pPr>
+            <w:r>
+              <w:rPr>
+                <w:rFonts w:ascii="Calibri" w:cs="Calibri" w:eastAsia="Calibri" w:hAnsi="Calibri"/>
+                <w:b/>
+                <w:bCs/>
+                <w:color w:val="FFFFFF"/>
+                <w:sz w:val="19"/>
+                <w:szCs w:val="19"/>
+              </w:rPr>
+              <w:t xml:space="preserve">IQR</w:t>
+            </w:r>
+          </w:p>
+        </w:tc>
+      </w:tr>
+      <w:tr>
+        <w:tc>
+          <w:tcPr>
+            <w:tcW w:type="dxa" w:w="1800"/>
+            <w:tcBorders>
+              <w:top w:val="single" w:color="BFBFBF" w:sz="4"/>
+              <w:left w:val="single" w:color="BFBFBF" w:sz="4"/>
+              <w:bottom w:val="single" w:color="BFBFBF" w:sz="4"/>
+              <w:right w:val="single" w:color="BFBFBF" w:sz="4"/>
+            </w:tcBorders>
+            <w:shd w:fill="FFFFFF" w:val="clear"/>
+            <w:tcMar>
+              <w:top w:type="dxa" w:w="60"/>
+              <w:left w:type="dxa" w:w="120"/>
+              <w:bottom w:type="dxa" w:w="60"/>
+              <w:right w:type="dxa" w:w="120"/>
+            </w:tcMar>
+            <w:vAlign w:val="center"/>
+          </w:tcPr>
+          <w:p>
+            <w:pPr>
+              <w:jc w:val="left"/>
+            </w:pPr>
+            <w:r>
+              <w:rPr>
+                <w:rFonts w:ascii="Calibri" w:cs="Calibri" w:eastAsia="Calibri" w:hAnsi="Calibri"/>
+                <w:sz w:val="19"/>
+                <w:szCs w:val="19"/>
+              </w:rPr>
+              <w:t xml:space="preserve">FIFA World Cup 2022</w:t>
+            </w:r>
+          </w:p>
+        </w:tc>
+        <w:tc>
+          <w:tcPr>
+            <w:tcW w:type="dxa" w:w="1800"/>
+            <w:tcBorders>
+              <w:top w:val="single" w:color="BFBFBF" w:sz="4"/>
+              <w:left w:val="single" w:color="BFBFBF" w:sz="4"/>
+              <w:bottom w:val="single" w:color="BFBFBF" w:sz="4"/>
+              <w:right w:val="single" w:color="BFBFBF" w:sz="4"/>
+            </w:tcBorders>
+            <w:shd w:fill="FFFFFF" w:val="clear"/>
+            <w:tcMar>
+              <w:top w:type="dxa" w:w="60"/>
+              <w:left w:type="dxa" w:w="120"/>
+              <w:bottom w:type="dxa" w:w="60"/>
+              <w:right w:type="dxa" w:w="120"/>
+            </w:tcMar>
+            <w:vAlign w:val="center"/>
+          </w:tcPr>
+          <w:p>
+            <w:pPr>
+              <w:jc w:val="center"/>
+            </w:pPr>
+            <w:r>
+              <w:rPr>
+                <w:rFonts w:ascii="Calibri" w:cs="Calibri" w:eastAsia="Calibri" w:hAnsi="Calibri"/>
+                <w:sz w:val="19"/>
+                <w:szCs w:val="19"/>
+              </w:rPr>
+              <w:t xml:space="preserve">15</w:t>
+            </w:r>
+          </w:p>
+        </w:tc>
+        <w:tc>
+          <w:tcPr>
+            <w:tcW w:type="dxa" w:w="1800"/>
+            <w:tcBorders>
+              <w:top w:val="single" w:color="BFBFBF" w:sz="4"/>
+              <w:left w:val="single" w:color="BFBFBF" w:sz="4"/>
+              <w:bottom w:val="single" w:color="BFBFBF" w:sz="4"/>
+              <w:right w:val="single" w:color="BFBFBF" w:sz="4"/>
+            </w:tcBorders>
+            <w:shd w:fill="FFFFFF" w:val="clear"/>
+            <w:tcMar>
+              <w:top w:type="dxa" w:w="60"/>
+              <w:left w:type="dxa" w:w="120"/>
+              <w:bottom w:type="dxa" w:w="60"/>
+              <w:right w:type="dxa" w:w="120"/>
+            </w:tcMar>
+            <w:vAlign w:val="center"/>
+          </w:tcPr>
+          <w:p>
+            <w:pPr>
+              <w:jc w:val="center"/>
+            </w:pPr>
+            <w:r>
+              <w:rPr>
+                <w:rFonts w:ascii="Calibri" w:cs="Calibri" w:eastAsia="Calibri" w:hAnsi="Calibri"/>
+                <w:sz w:val="19"/>
+                <w:szCs w:val="19"/>
+              </w:rPr>
+              <w:t xml:space="preserve">13-18</w:t>
+            </w:r>
+          </w:p>
+        </w:tc>
+        <w:tc>
+          <w:tcPr>
+            <w:tcW w:type="dxa" w:w="1800"/>
+            <w:tcBorders>
+              <w:top w:val="single" w:color="BFBFBF" w:sz="4"/>
+              <w:left w:val="single" w:color="BFBFBF" w:sz="4"/>
+              <w:bottom w:val="single" w:color="BFBFBF" w:sz="4"/>
+              <w:right w:val="single" w:color="BFBFBF" w:sz="4"/>
+            </w:tcBorders>
+            <w:shd w:fill="FFFFFF" w:val="clear"/>
+            <w:tcMar>
+              <w:top w:type="dxa" w:w="60"/>
+              <w:left w:type="dxa" w:w="120"/>
+              <w:bottom w:type="dxa" w:w="60"/>
+              <w:right w:type="dxa" w:w="120"/>
+            </w:tcMar>
+            <w:vAlign w:val="center"/>
+          </w:tcPr>
+          <w:p>
+            <w:pPr>
+              <w:jc w:val="center"/>
+            </w:pPr>
+            <w:r>
+              <w:rPr>
+                <w:rFonts w:ascii="Calibri" w:cs="Calibri" w:eastAsia="Calibri" w:hAnsi="Calibri"/>
+                <w:sz w:val="19"/>
+                <w:szCs w:val="19"/>
+              </w:rPr>
+              <w:t xml:space="preserve">8</w:t>
+            </w:r>
+          </w:p>
+        </w:tc>
+        <w:tc>
+          <w:tcPr>
+            <w:tcW w:type="dxa" w:w="1800"/>
+            <w:tcBorders>
+              <w:top w:val="single" w:color="BFBFBF" w:sz="4"/>
+              <w:left w:val="single" w:color="BFBFBF" w:sz="4"/>
+              <w:bottom w:val="single" w:color="BFBFBF" w:sz="4"/>
+              <w:right w:val="single" w:color="BFBFBF" w:sz="4"/>
+            </w:tcBorders>
+            <w:shd w:fill="FFFFFF" w:val="clear"/>
+            <w:tcMar>
+              <w:top w:type="dxa" w:w="60"/>
+              <w:left w:type="dxa" w:w="120"/>
+              <w:bottom w:type="dxa" w:w="60"/>
+              <w:right w:type="dxa" w:w="120"/>
+            </w:tcMar>
+            <w:vAlign w:val="center"/>
+          </w:tcPr>
+          <w:p>
+            <w:pPr>
+              <w:jc w:val="center"/>
+            </w:pPr>
+            <w:r>
+              <w:rPr>
+                <w:rFonts w:ascii="Calibri" w:cs="Calibri" w:eastAsia="Calibri" w:hAnsi="Calibri"/>
+                <w:sz w:val="19"/>
+                <w:szCs w:val="19"/>
+              </w:rPr>
+              <w:t xml:space="preserve">7-9</w:t>
+            </w:r>
+          </w:p>
+        </w:tc>
+      </w:tr>
+      <w:tr>
+        <w:tc>
+          <w:tcPr>
+            <w:tcW w:type="dxa" w:w="1800"/>
+            <w:tcBorders>
+              <w:top w:val="single" w:color="BFBFBF" w:sz="4"/>
+              <w:left w:val="single" w:color="BFBFBF" w:sz="4"/>
+              <w:bottom w:val="single" w:color="BFBFBF" w:sz="4"/>
+              <w:right w:val="single" w:color="BFBFBF" w:sz="4"/>
+            </w:tcBorders>
+            <w:shd w:fill="F2F2F2" w:val="clear"/>
+            <w:tcMar>
+              <w:top w:type="dxa" w:w="60"/>
+              <w:left w:type="dxa" w:w="120"/>
+              <w:bottom w:type="dxa" w:w="60"/>
+              <w:right w:type="dxa" w:w="120"/>
+            </w:tcMar>
+            <w:vAlign w:val="center"/>
+          </w:tcPr>
+          <w:p>
+            <w:pPr>
+              <w:jc w:val="left"/>
+            </w:pPr>
+            <w:r>
+              <w:rPr>
+                <w:rFonts w:ascii="Calibri" w:cs="Calibri" w:eastAsia="Calibri" w:hAnsi="Calibri"/>
+                <w:sz w:val="19"/>
+                <w:szCs w:val="19"/>
+              </w:rPr>
+              <w:t xml:space="preserve">UEFA Euro 2020</w:t>
+            </w:r>
+          </w:p>
+        </w:tc>
+        <w:tc>
+          <w:tcPr>
+            <w:tcW w:type="dxa" w:w="1800"/>
+            <w:tcBorders>
+              <w:top w:val="single" w:color="BFBFBF" w:sz="4"/>
+              <w:left w:val="single" w:color="BFBFBF" w:sz="4"/>
+              <w:bottom w:val="single" w:color="BFBFBF" w:sz="4"/>
+              <w:right w:val="single" w:color="BFBFBF" w:sz="4"/>
+            </w:tcBorders>
+            <w:shd w:fill="F2F2F2" w:val="clear"/>
+            <w:tcMar>
+              <w:top w:type="dxa" w:w="60"/>
+              <w:left w:type="dxa" w:w="120"/>
+              <w:bottom w:type="dxa" w:w="60"/>
+              <w:right w:type="dxa" w:w="120"/>
+            </w:tcMar>
+            <w:vAlign w:val="center"/>
+          </w:tcPr>
+          <w:p>
+            <w:pPr>
+              <w:jc w:val="center"/>
+            </w:pPr>
+            <w:r>
+              <w:rPr>
+                <w:rFonts w:ascii="Calibri" w:cs="Calibri" w:eastAsia="Calibri" w:hAnsi="Calibri"/>
+                <w:sz w:val="19"/>
+                <w:szCs w:val="19"/>
+              </w:rPr>
+              <w:t xml:space="preserve">15</w:t>
+            </w:r>
+          </w:p>
+        </w:tc>
+        <w:tc>
+          <w:tcPr>
+            <w:tcW w:type="dxa" w:w="1800"/>
+            <w:tcBorders>
+              <w:top w:val="single" w:color="BFBFBF" w:sz="4"/>
+              <w:left w:val="single" w:color="BFBFBF" w:sz="4"/>
+              <w:bottom w:val="single" w:color="BFBFBF" w:sz="4"/>
+              <w:right w:val="single" w:color="BFBFBF" w:sz="4"/>
+            </w:tcBorders>
+            <w:shd w:fill="F2F2F2" w:val="clear"/>
+            <w:tcMar>
+              <w:top w:type="dxa" w:w="60"/>
+              <w:left w:type="dxa" w:w="120"/>
+              <w:bottom w:type="dxa" w:w="60"/>
+              <w:right w:type="dxa" w:w="120"/>
+            </w:tcMar>
+            <w:vAlign w:val="center"/>
+          </w:tcPr>
+          <w:p>
+            <w:pPr>
+              <w:jc w:val="center"/>
+            </w:pPr>
+            <w:r>
+              <w:rPr>
+                <w:rFonts w:ascii="Calibri" w:cs="Calibri" w:eastAsia="Calibri" w:hAnsi="Calibri"/>
+                <w:sz w:val="19"/>
+                <w:szCs w:val="19"/>
+              </w:rPr>
+              <w:t xml:space="preserve">12-17</w:t>
+            </w:r>
+          </w:p>
+        </w:tc>
+        <w:tc>
+          <w:tcPr>
+            <w:tcW w:type="dxa" w:w="1800"/>
+            <w:tcBorders>
+              <w:top w:val="single" w:color="BFBFBF" w:sz="4"/>
+              <w:left w:val="single" w:color="BFBFBF" w:sz="4"/>
+              <w:bottom w:val="single" w:color="BFBFBF" w:sz="4"/>
+              <w:right w:val="single" w:color="BFBFBF" w:sz="4"/>
+            </w:tcBorders>
+            <w:shd w:fill="F2F2F2" w:val="clear"/>
+            <w:tcMar>
+              <w:top w:type="dxa" w:w="60"/>
+              <w:left w:type="dxa" w:w="120"/>
+              <w:bottom w:type="dxa" w:w="60"/>
+              <w:right w:type="dxa" w:w="120"/>
+            </w:tcMar>
+            <w:vAlign w:val="center"/>
+          </w:tcPr>
+          <w:p>
+            <w:pPr>
+              <w:jc w:val="center"/>
+            </w:pPr>
+            <w:r>
+              <w:rPr>
+                <w:rFonts w:ascii="Calibri" w:cs="Calibri" w:eastAsia="Calibri" w:hAnsi="Calibri"/>
+                <w:sz w:val="19"/>
+                <w:szCs w:val="19"/>
+              </w:rPr>
+              <w:t xml:space="preserve">8</w:t>
+            </w:r>
+          </w:p>
+        </w:tc>
+        <w:tc>
+          <w:tcPr>
+            <w:tcW w:type="dxa" w:w="1800"/>
+            <w:tcBorders>
+              <w:top w:val="single" w:color="BFBFBF" w:sz="4"/>
+              <w:left w:val="single" w:color="BFBFBF" w:sz="4"/>
+              <w:bottom w:val="single" w:color="BFBFBF" w:sz="4"/>
+              <w:right w:val="single" w:color="BFBFBF" w:sz="4"/>
+            </w:tcBorders>
+            <w:shd w:fill="F2F2F2" w:val="clear"/>
+            <w:tcMar>
+              <w:top w:type="dxa" w:w="60"/>
+              <w:left w:type="dxa" w:w="120"/>
+              <w:bottom w:type="dxa" w:w="60"/>
+              <w:right w:type="dxa" w:w="120"/>
+            </w:tcMar>
+            <w:vAlign w:val="center"/>
+          </w:tcPr>
+          <w:p>
+            <w:pPr>
+              <w:jc w:val="center"/>
+            </w:pPr>
+            <w:r>
+              <w:rPr>
+                <w:rFonts w:ascii="Calibri" w:cs="Calibri" w:eastAsia="Calibri" w:hAnsi="Calibri"/>
+                <w:sz w:val="19"/>
+                <w:szCs w:val="19"/>
+              </w:rPr>
+              <w:t xml:space="preserve">7-9</w:t>
+            </w:r>
+          </w:p>
+        </w:tc>
+      </w:tr>
+      <w:tr>
+        <w:tc>
+          <w:tcPr>
+            <w:tcW w:type="dxa" w:w="1800"/>
+            <w:tcBorders>
+              <w:top w:val="single" w:color="BFBFBF" w:sz="4"/>
+              <w:left w:val="single" w:color="BFBFBF" w:sz="4"/>
+              <w:bottom w:val="single" w:color="BFBFBF" w:sz="4"/>
+              <w:right w:val="single" w:color="BFBFBF" w:sz="4"/>
+            </w:tcBorders>
+            <w:shd w:fill="FFFFFF" w:val="clear"/>
+            <w:tcMar>
+              <w:top w:type="dxa" w:w="60"/>
+              <w:left w:type="dxa" w:w="120"/>
+              <w:bottom w:type="dxa" w:w="60"/>
+              <w:right w:type="dxa" w:w="120"/>
+            </w:tcMar>
+            <w:vAlign w:val="center"/>
+          </w:tcPr>
+          <w:p>
+            <w:pPr>
+              <w:jc w:val="left"/>
+            </w:pPr>
+            <w:r>
+              <w:rPr>
+                <w:rFonts w:ascii="Calibri" w:cs="Calibri" w:eastAsia="Calibri" w:hAnsi="Calibri"/>
+                <w:sz w:val="19"/>
+                <w:szCs w:val="19"/>
+              </w:rPr>
+              <w:t xml:space="preserve">UEFA Euro 2024</w:t>
+            </w:r>
+          </w:p>
+        </w:tc>
+        <w:tc>
+          <w:tcPr>
+            <w:tcW w:type="dxa" w:w="1800"/>
+            <w:tcBorders>
+              <w:top w:val="single" w:color="BFBFBF" w:sz="4"/>
+              <w:left w:val="single" w:color="BFBFBF" w:sz="4"/>
+              <w:bottom w:val="single" w:color="BFBFBF" w:sz="4"/>
+              <w:right w:val="single" w:color="BFBFBF" w:sz="4"/>
+            </w:tcBorders>
+            <w:shd w:fill="FFFFFF" w:val="clear"/>
+            <w:tcMar>
+              <w:top w:type="dxa" w:w="60"/>
+              <w:left w:type="dxa" w:w="120"/>
+              <w:bottom w:type="dxa" w:w="60"/>
+              <w:right w:type="dxa" w:w="120"/>
+            </w:tcMar>
+            <w:vAlign w:val="center"/>
+          </w:tcPr>
+          <w:p>
+            <w:pPr>
+              <w:jc w:val="center"/>
+            </w:pPr>
+            <w:r>
+              <w:rPr>
+                <w:rFonts w:ascii="Calibri" w:cs="Calibri" w:eastAsia="Calibri" w:hAnsi="Calibri"/>
+                <w:sz w:val="19"/>
+                <w:szCs w:val="19"/>
+              </w:rPr>
+              <w:t xml:space="preserve">16</w:t>
+            </w:r>
+          </w:p>
+        </w:tc>
+        <w:tc>
+          <w:tcPr>
+            <w:tcW w:type="dxa" w:w="1800"/>
+            <w:tcBorders>
+              <w:top w:val="single" w:color="BFBFBF" w:sz="4"/>
+              <w:left w:val="single" w:color="BFBFBF" w:sz="4"/>
+              <w:bottom w:val="single" w:color="BFBFBF" w:sz="4"/>
+              <w:right w:val="single" w:color="BFBFBF" w:sz="4"/>
+            </w:tcBorders>
+            <w:shd w:fill="FFFFFF" w:val="clear"/>
+            <w:tcMar>
+              <w:top w:type="dxa" w:w="60"/>
+              <w:left w:type="dxa" w:w="120"/>
+              <w:bottom w:type="dxa" w:w="60"/>
+              <w:right w:type="dxa" w:w="120"/>
+            </w:tcMar>
+            <w:vAlign w:val="center"/>
+          </w:tcPr>
+          <w:p>
+            <w:pPr>
+              <w:jc w:val="center"/>
+            </w:pPr>
+            <w:r>
+              <w:rPr>
+                <w:rFonts w:ascii="Calibri" w:cs="Calibri" w:eastAsia="Calibri" w:hAnsi="Calibri"/>
+                <w:sz w:val="19"/>
+                <w:szCs w:val="19"/>
+              </w:rPr>
+              <w:t xml:space="preserve">14-18</w:t>
+            </w:r>
+          </w:p>
+        </w:tc>
+        <w:tc>
+          <w:tcPr>
+            <w:tcW w:type="dxa" w:w="1800"/>
+            <w:tcBorders>
+              <w:top w:val="single" w:color="BFBFBF" w:sz="4"/>
+              <w:left w:val="single" w:color="BFBFBF" w:sz="4"/>
+              <w:bottom w:val="single" w:color="BFBFBF" w:sz="4"/>
+              <w:right w:val="single" w:color="BFBFBF" w:sz="4"/>
+            </w:tcBorders>
+            <w:shd w:fill="FFFFFF" w:val="clear"/>
+            <w:tcMar>
+              <w:top w:type="dxa" w:w="60"/>
+              <w:left w:type="dxa" w:w="120"/>
+              <w:bottom w:type="dxa" w:w="60"/>
+              <w:right w:type="dxa" w:w="120"/>
+            </w:tcMar>
+            <w:vAlign w:val="center"/>
+          </w:tcPr>
+          <w:p>
+            <w:pPr>
+              <w:jc w:val="center"/>
+            </w:pPr>
+            <w:r>
+              <w:rPr>
+                <w:rFonts w:ascii="Calibri" w:cs="Calibri" w:eastAsia="Calibri" w:hAnsi="Calibri"/>
+                <w:sz w:val="19"/>
+                <w:szCs w:val="19"/>
+              </w:rPr>
+              <w:t xml:space="preserve">9</w:t>
+            </w:r>
+          </w:p>
+        </w:tc>
+        <w:tc>
+          <w:tcPr>
+            <w:tcW w:type="dxa" w:w="1800"/>
+            <w:tcBorders>
+              <w:top w:val="single" w:color="BFBFBF" w:sz="4"/>
+              <w:left w:val="single" w:color="BFBFBF" w:sz="4"/>
+              <w:bottom w:val="single" w:color="BFBFBF" w:sz="4"/>
+              <w:right w:val="single" w:color="BFBFBF" w:sz="4"/>
+            </w:tcBorders>
+            <w:shd w:fill="FFFFFF" w:val="clear"/>
+            <w:tcMar>
+              <w:top w:type="dxa" w:w="60"/>
+              <w:left w:type="dxa" w:w="120"/>
+              <w:bottom w:type="dxa" w:w="60"/>
+              <w:right w:type="dxa" w:w="120"/>
+            </w:tcMar>
+            <w:vAlign w:val="center"/>
+          </w:tcPr>
+          <w:p>
+            <w:pPr>
+              <w:jc w:val="center"/>
+            </w:pPr>
+            <w:r>
+              <w:rPr>
+                <w:rFonts w:ascii="Calibri" w:cs="Calibri" w:eastAsia="Calibri" w:hAnsi="Calibri"/>
+                <w:sz w:val="19"/>
+                <w:szCs w:val="19"/>
+              </w:rPr>
+              <w:t xml:space="preserve">7-10</w:t>
+            </w:r>
+          </w:p>
+        </w:tc>
+      </w:tr>
+    </w:tbl>
+    <w:p>
+      <w:pPr>
+        <w:spacing w:after="160" w:line="276"/>
+        <w:ind w:firstLine="397"/>
+        <w:jc w:val="both"/>
+      </w:pPr>
+      <w:r>
+        <w:rPr>
+          <w:rFonts w:ascii="Calibri" w:cs="Calibri" w:eastAsia="Calibri" w:hAnsi="Calibri"/>
+          <w:sz w:val="22"/>
+          <w:szCs w:val="22"/>
+        </w:rPr>
+        <w:t xml:space="preserve">Medijana broja vidljivih igrača iznosi 15 (ukupni raspon 4-22), dok medijana vidljivih protivnika iznosi 8 (raspon 2-11). UEFA Euro 2024 pokazuje blago veći broj vidljivih igrača, što može odražavati poboljšanje u freeze-frame pokrivanju.</w:t>
+      </w:r>
+    </w:p>
+    <w:p>
+      <w:pPr>
+        <w:spacing w:after="160" w:line="276"/>
+        <w:jc w:val="both"/>
+      </w:pPr>
+      <w:r>
+        <w:drawing>
+          <wp:inline xmlns:a="http://schemas.openxmlformats.org/drawingml/2006/main" xmlns:pic="http://schemas.openxmlformats.org/drawingml/2006/picture">
+            <wp:extent cx="5029200" cy="1676400"/>
+            <wp:docPr id="1" name="Picture 1"/>
+            <wp:cNvGraphicFramePr>
+              <a:graphicFrameLocks noChangeAspect="1"/>
+            </wp:cNvGraphicFramePr>
+            <a:graphic>
+              <a:graphicData uri="http://schemas.openxmlformats.org/drawingml/2006/picture">
+                <pic:pic>
+                  <pic:nvPicPr>
+                    <pic:cNvPr id="0" name="visibility_distribution.png"/>
+                    <pic:cNvPicPr/>
+                  </pic:nvPicPr>
+                  <pic:blipFill>
+                    <a:blip r:embed="rId10"/>
+                    <a:stretch>
+                      <a:fillRect/>
+                    </a:stretch>
+                  </pic:blipFill>
+                  <pic:spPr>
+                    <a:xfrm>
+                      <a:off x="0" y="0"/>
+                      <a:ext cx="5029200" cy="1676400"/>
+                    </a:xfrm>
+                    <a:prstGeom prst="rect"/>
+                  </pic:spPr>
+                </pic:pic>
+              </a:graphicData>
+            </a:graphic>
+          </wp:inline>
+        </w:drawing>
+      </w:r>
+    </w:p>
+    <w:p>
+      <w:pPr>
+        <w:spacing w:after="240" w:before="60"/>
+        <w:jc w:val="center"/>
+      </w:pPr>
+      <w:r>
+        <w:rPr>
+          <w:rFonts w:ascii="Calibri" w:cs="Calibri" w:eastAsia="Calibri" w:hAnsi="Calibri"/>
+          <w:i/>
+          <w:iCs/>
+          <w:color w:val="444444"/>
+          <w:sz w:val="18"/>
+          <w:szCs w:val="18"/>
+        </w:rPr>
+        <w:t xml:space="preserve">Slika 3. Distribucija broja vidljivih igrača i protivnika po turniru.</w:t>
+      </w:r>
+    </w:p>
+    <w:p>
+      <w:pPr>
+        <w:spacing w:after="160" w:line="276"/>
+        <w:ind w:firstLine="397"/>
+        <w:jc w:val="both"/>
+      </w:pPr>
+      <w:r>
+        <w:rPr>
+          <w:rFonts w:ascii="Calibri" w:cs="Calibri" w:eastAsia="Calibri" w:hAnsi="Calibri"/>
+          <w:sz w:val="22"/>
+          <w:szCs w:val="22"/>
+        </w:rPr>
+        <w:t xml:space="preserve">Da bi se ispitalo da li prednost Modela B zavisi od kompletnosti freeze-frame podataka, sprovedena je sensitivity analiza na podskupovima šuteva sa različitim pragovima minimalnog broja vidljivih protivnika (Tabela 7).</w:t>
+      </w:r>
+    </w:p>
+    <w:p>
+      <w:pPr>
+        <w:spacing w:after="240" w:before="60"/>
+        <w:jc w:val="center"/>
+      </w:pPr>
+      <w:r>
+        <w:rPr>
+          <w:rFonts w:ascii="Calibri" w:cs="Calibri" w:eastAsia="Calibri" w:hAnsi="Calibri"/>
+          <w:i/>
+          <w:iCs/>
+          <w:color w:val="444444"/>
+          <w:sz w:val="18"/>
+          <w:szCs w:val="18"/>
+        </w:rPr>
+        <w:t xml:space="preserve">Tabela 7. Sensitivity analiza: Model B prednost za različite pragove vidljivosti protivnika (LOTO validacija).</w:t>
+      </w:r>
+    </w:p>
+    <w:tbl>
+      <w:tblPr>
+        <w:tblW w:type="dxa" w:w="9000"/>
+        <w:tblBorders>
+          <w:top w:val="single" w:color="auto" w:sz="4"/>
+          <w:left w:val="single" w:color="auto" w:sz="4"/>
+          <w:bottom w:val="single" w:color="auto" w:sz="4"/>
+          <w:right w:val="single" w:color="auto" w:sz="4"/>
+          <w:insideH w:val="single" w:color="auto" w:sz="4"/>
+          <w:insideV w:val="single" w:color="auto" w:sz="4"/>
+        </w:tblBorders>
+      </w:tblPr>
+      <w:tblGrid>
+        <w:gridCol w:w="1800"/>
+        <w:gridCol w:w="1800"/>
+        <w:gridCol w:w="1800"/>
+        <w:gridCol w:w="1800"/>
+        <w:gridCol w:w="1800"/>
+      </w:tblGrid>
+      <w:tr>
+        <w:trPr>
+          <w:tblHeader/>
+        </w:trPr>
+        <w:tc>
+          <w:tcPr>
+            <w:tcW w:type="dxa" w:w="1800"/>
+            <w:tcBorders>
+              <w:top w:val="single" w:color="BFBFBF" w:sz="4"/>
+              <w:left w:val="single" w:color="BFBFBF" w:sz="4"/>
+              <w:bottom w:val="single" w:color="BFBFBF" w:sz="4"/>
+              <w:right w:val="single" w:color="BFBFBF" w:sz="4"/>
+            </w:tcBorders>
+            <w:shd w:fill="1F3864" w:val="clear"/>
+            <w:tcMar>
+              <w:top w:type="dxa" w:w="80"/>
+              <w:left w:type="dxa" w:w="120"/>
+              <w:bottom w:type="dxa" w:w="80"/>
+              <w:right w:type="dxa" w:w="120"/>
+            </w:tcMar>
+            <w:vAlign w:val="center"/>
+          </w:tcPr>
+          <w:p>
+            <w:pPr>
+              <w:jc w:val="center"/>
+            </w:pPr>
+            <w:r>
+              <w:rPr>
+                <w:rFonts w:ascii="Calibri" w:cs="Calibri" w:eastAsia="Calibri" w:hAnsi="Calibri"/>
+                <w:b/>
+                <w:bCs/>
+                <w:color w:val="FFFFFF"/>
+                <w:sz w:val="19"/>
+                <w:szCs w:val="19"/>
+              </w:rPr>
+              <w:t xml:space="preserve">Podskup</w:t>
+            </w:r>
+          </w:p>
+        </w:tc>
+        <w:tc>
+          <w:tcPr>
+            <w:tcW w:type="dxa" w:w="1800"/>
+            <w:tcBorders>
+              <w:top w:val="single" w:color="BFBFBF" w:sz="4"/>
+              <w:left w:val="single" w:color="BFBFBF" w:sz="4"/>
+              <w:bottom w:val="single" w:color="BFBFBF" w:sz="4"/>
+              <w:right w:val="single" w:color="BFBFBF" w:sz="4"/>
+            </w:tcBorders>
+            <w:shd w:fill="1F3864" w:val="clear"/>
+            <w:tcMar>
+              <w:top w:type="dxa" w:w="80"/>
+              <w:left w:type="dxa" w:w="120"/>
+              <w:bottom w:type="dxa" w:w="80"/>
+              <w:right w:type="dxa" w:w="120"/>
+            </w:tcMar>
+            <w:vAlign w:val="center"/>
+          </w:tcPr>
+          <w:p>
+            <w:pPr>
+              <w:jc w:val="center"/>
+            </w:pPr>
+            <w:r>
+              <w:rPr>
+                <w:rFonts w:ascii="Calibri" w:cs="Calibri" w:eastAsia="Calibri" w:hAnsi="Calibri"/>
+                <w:b/>
+                <w:bCs/>
+                <w:color w:val="FFFFFF"/>
+                <w:sz w:val="19"/>
+                <w:szCs w:val="19"/>
+              </w:rPr>
+              <w:t xml:space="preserve">n</w:t>
+            </w:r>
+          </w:p>
+        </w:tc>
+        <w:tc>
+          <w:tcPr>
+            <w:tcW w:type="dxa" w:w="1800"/>
+            <w:tcBorders>
+              <w:top w:val="single" w:color="BFBFBF" w:sz="4"/>
+              <w:left w:val="single" w:color="BFBFBF" w:sz="4"/>
+              <w:bottom w:val="single" w:color="BFBFBF" w:sz="4"/>
+              <w:right w:val="single" w:color="BFBFBF" w:sz="4"/>
+            </w:tcBorders>
+            <w:shd w:fill="1F3864" w:val="clear"/>
+            <w:tcMar>
+              <w:top w:type="dxa" w:w="80"/>
+              <w:left w:type="dxa" w:w="120"/>
+              <w:bottom w:type="dxa" w:w="80"/>
+              <w:right w:type="dxa" w:w="120"/>
+            </w:tcMar>
+            <w:vAlign w:val="center"/>
+          </w:tcPr>
+          <w:p>
+            <w:pPr>
+              <w:jc w:val="center"/>
+            </w:pPr>
+            <w:r>
+              <w:rPr>
+                <w:rFonts w:ascii="Calibri" w:cs="Calibri" w:eastAsia="Calibri" w:hAnsi="Calibri"/>
+                <w:b/>
+                <w:bCs/>
+                <w:color w:val="FFFFFF"/>
+                <w:sz w:val="19"/>
+                <w:szCs w:val="19"/>
+              </w:rPr>
+              <w:t xml:space="preserve">AUC Model A</w:t>
+            </w:r>
+          </w:p>
+        </w:tc>
+        <w:tc>
+          <w:tcPr>
+            <w:tcW w:type="dxa" w:w="1800"/>
+            <w:tcBorders>
+              <w:top w:val="single" w:color="BFBFBF" w:sz="4"/>
+              <w:left w:val="single" w:color="BFBFBF" w:sz="4"/>
+              <w:bottom w:val="single" w:color="BFBFBF" w:sz="4"/>
+              <w:right w:val="single" w:color="BFBFBF" w:sz="4"/>
+            </w:tcBorders>
+            <w:shd w:fill="1F3864" w:val="clear"/>
+            <w:tcMar>
+              <w:top w:type="dxa" w:w="80"/>
+              <w:left w:type="dxa" w:w="120"/>
+              <w:bottom w:type="dxa" w:w="80"/>
+              <w:right w:type="dxa" w:w="120"/>
+            </w:tcMar>
+            <w:vAlign w:val="center"/>
+          </w:tcPr>
+          <w:p>
+            <w:pPr>
+              <w:jc w:val="center"/>
+            </w:pPr>
+            <w:r>
+              <w:rPr>
+                <w:rFonts w:ascii="Calibri" w:cs="Calibri" w:eastAsia="Calibri" w:hAnsi="Calibri"/>
+                <w:b/>
+                <w:bCs/>
+                <w:color w:val="FFFFFF"/>
+                <w:sz w:val="19"/>
+                <w:szCs w:val="19"/>
+              </w:rPr>
+              <w:t xml:space="preserve">AUC Model B</w:t>
+            </w:r>
+          </w:p>
+        </w:tc>
+        <w:tc>
+          <w:tcPr>
+            <w:tcW w:type="dxa" w:w="1800"/>
+            <w:tcBorders>
+              <w:top w:val="single" w:color="BFBFBF" w:sz="4"/>
+              <w:left w:val="single" w:color="BFBFBF" w:sz="4"/>
+              <w:bottom w:val="single" w:color="BFBFBF" w:sz="4"/>
+              <w:right w:val="single" w:color="BFBFBF" w:sz="4"/>
+            </w:tcBorders>
+            <w:shd w:fill="1F3864" w:val="clear"/>
+            <w:tcMar>
+              <w:top w:type="dxa" w:w="80"/>
+              <w:left w:type="dxa" w:w="120"/>
+              <w:bottom w:type="dxa" w:w="80"/>
+              <w:right w:type="dxa" w:w="120"/>
+            </w:tcMar>
+            <w:vAlign w:val="center"/>
+          </w:tcPr>
+          <w:p>
+            <w:pPr>
+              <w:jc w:val="center"/>
+            </w:pPr>
+            <w:r>
+              <w:rPr>
+                <w:rFonts w:ascii="Calibri" w:cs="Calibri" w:eastAsia="Calibri" w:hAnsi="Calibri"/>
+                <w:b/>
+                <w:bCs/>
+                <w:color w:val="FFFFFF"/>
+                <w:sz w:val="19"/>
+                <w:szCs w:val="19"/>
+              </w:rPr>
+              <w:t xml:space="preserve">Delta</w:t>
+            </w:r>
+          </w:p>
+        </w:tc>
+      </w:tr>
+      <w:tr>
+        <w:tc>
+          <w:tcPr>
+            <w:tcW w:type="dxa" w:w="1800"/>
+            <w:tcBorders>
+              <w:top w:val="single" w:color="BFBFBF" w:sz="4"/>
+              <w:left w:val="single" w:color="BFBFBF" w:sz="4"/>
+              <w:bottom w:val="single" w:color="BFBFBF" w:sz="4"/>
+              <w:right w:val="single" w:color="BFBFBF" w:sz="4"/>
+            </w:tcBorders>
+            <w:shd w:fill="FFFFFF" w:val="clear"/>
+            <w:tcMar>
+              <w:top w:type="dxa" w:w="60"/>
+              <w:left w:type="dxa" w:w="120"/>
+              <w:bottom w:type="dxa" w:w="60"/>
+              <w:right w:type="dxa" w:w="120"/>
+            </w:tcMar>
+            <w:vAlign w:val="center"/>
+          </w:tcPr>
+          <w:p>
+            <w:pPr>
+              <w:jc w:val="left"/>
+            </w:pPr>
+            <w:r>
+              <w:rPr>
+                <w:rFonts w:ascii="Calibri" w:cs="Calibri" w:eastAsia="Calibri" w:hAnsi="Calibri"/>
+                <w:sz w:val="19"/>
+                <w:szCs w:val="19"/>
+              </w:rPr>
+              <w:t xml:space="preserve">Svi šutevi (bez praga)</w:t>
+            </w:r>
+          </w:p>
+        </w:tc>
+        <w:tc>
+          <w:tcPr>
+            <w:tcW w:type="dxa" w:w="1800"/>
+            <w:tcBorders>
+              <w:top w:val="single" w:color="BFBFBF" w:sz="4"/>
+              <w:left w:val="single" w:color="BFBFBF" w:sz="4"/>
+              <w:bottom w:val="single" w:color="BFBFBF" w:sz="4"/>
+              <w:right w:val="single" w:color="BFBFBF" w:sz="4"/>
+            </w:tcBorders>
+            <w:shd w:fill="FFFFFF" w:val="clear"/>
+            <w:tcMar>
+              <w:top w:type="dxa" w:w="60"/>
+              <w:left w:type="dxa" w:w="120"/>
+              <w:bottom w:type="dxa" w:w="60"/>
+              <w:right w:type="dxa" w:w="120"/>
+            </w:tcMar>
+            <w:vAlign w:val="center"/>
+          </w:tcPr>
+          <w:p>
+            <w:pPr>
+              <w:jc w:val="center"/>
+            </w:pPr>
+            <w:r>
+              <w:rPr>
+                <w:rFonts w:ascii="Calibri" w:cs="Calibri" w:eastAsia="Calibri" w:hAnsi="Calibri"/>
+                <w:sz w:val="19"/>
+                <w:szCs w:val="19"/>
+              </w:rPr>
+              <w:t xml:space="preserve">3.968</w:t>
+            </w:r>
+          </w:p>
+        </w:tc>
+        <w:tc>
+          <w:tcPr>
+            <w:tcW w:type="dxa" w:w="1800"/>
+            <w:tcBorders>
+              <w:top w:val="single" w:color="BFBFBF" w:sz="4"/>
+              <w:left w:val="single" w:color="BFBFBF" w:sz="4"/>
+              <w:bottom w:val="single" w:color="BFBFBF" w:sz="4"/>
+              <w:right w:val="single" w:color="BFBFBF" w:sz="4"/>
+            </w:tcBorders>
+            <w:shd w:fill="FFFFFF" w:val="clear"/>
+            <w:tcMar>
+              <w:top w:type="dxa" w:w="60"/>
+              <w:left w:type="dxa" w:w="120"/>
+              <w:bottom w:type="dxa" w:w="60"/>
+              <w:right w:type="dxa" w:w="120"/>
+            </w:tcMar>
+            <w:vAlign w:val="center"/>
+          </w:tcPr>
+          <w:p>
+            <w:pPr>
+              <w:jc w:val="center"/>
+            </w:pPr>
+            <w:r>
+              <w:rPr>
+                <w:rFonts w:ascii="Calibri" w:cs="Calibri" w:eastAsia="Calibri" w:hAnsi="Calibri"/>
+                <w:sz w:val="19"/>
+                <w:szCs w:val="19"/>
+              </w:rPr>
+              <w:t xml:space="preserve">0,760</w:t>
+            </w:r>
+          </w:p>
+        </w:tc>
+        <w:tc>
+          <w:tcPr>
+            <w:tcW w:type="dxa" w:w="1800"/>
+            <w:tcBorders>
+              <w:top w:val="single" w:color="BFBFBF" w:sz="4"/>
+              <w:left w:val="single" w:color="BFBFBF" w:sz="4"/>
+              <w:bottom w:val="single" w:color="BFBFBF" w:sz="4"/>
+              <w:right w:val="single" w:color="BFBFBF" w:sz="4"/>
+            </w:tcBorders>
+            <w:shd w:fill="FFFFFF" w:val="clear"/>
+            <w:tcMar>
+              <w:top w:type="dxa" w:w="60"/>
+              <w:left w:type="dxa" w:w="120"/>
+              <w:bottom w:type="dxa" w:w="60"/>
+              <w:right w:type="dxa" w:w="120"/>
+            </w:tcMar>
+            <w:vAlign w:val="center"/>
+          </w:tcPr>
+          <w:p>
+            <w:pPr>
+              <w:jc w:val="center"/>
+            </w:pPr>
+            <w:r>
+              <w:rPr>
+                <w:rFonts w:ascii="Calibri" w:cs="Calibri" w:eastAsia="Calibri" w:hAnsi="Calibri"/>
+                <w:sz w:val="19"/>
+                <w:szCs w:val="19"/>
+              </w:rPr>
+              <w:t xml:space="preserve">0,773</w:t>
+            </w:r>
+          </w:p>
+        </w:tc>
+        <w:tc>
+          <w:tcPr>
+            <w:tcW w:type="dxa" w:w="1800"/>
+            <w:tcBorders>
+              <w:top w:val="single" w:color="BFBFBF" w:sz="4"/>
+              <w:left w:val="single" w:color="BFBFBF" w:sz="4"/>
+              <w:bottom w:val="single" w:color="BFBFBF" w:sz="4"/>
+              <w:right w:val="single" w:color="BFBFBF" w:sz="4"/>
+            </w:tcBorders>
+            <w:shd w:fill="FFFFFF" w:val="clear"/>
+            <w:tcMar>
+              <w:top w:type="dxa" w:w="60"/>
+              <w:left w:type="dxa" w:w="120"/>
+              <w:bottom w:type="dxa" w:w="60"/>
+              <w:right w:type="dxa" w:w="120"/>
+            </w:tcMar>
+            <w:vAlign w:val="center"/>
+          </w:tcPr>
+          <w:p>
+            <w:pPr>
+              <w:jc w:val="center"/>
+            </w:pPr>
+            <w:r>
+              <w:rPr>
+                <w:rFonts w:ascii="Calibri" w:cs="Calibri" w:eastAsia="Calibri" w:hAnsi="Calibri"/>
+                <w:sz w:val="19"/>
+                <w:szCs w:val="19"/>
+              </w:rPr>
+              <w:t xml:space="preserve">+0,013</w:t>
+            </w:r>
+          </w:p>
+        </w:tc>
+      </w:tr>
+      <w:tr>
+        <w:tc>
+          <w:tcPr>
+            <w:tcW w:type="dxa" w:w="1800"/>
+            <w:tcBorders>
+              <w:top w:val="single" w:color="BFBFBF" w:sz="4"/>
+              <w:left w:val="single" w:color="BFBFBF" w:sz="4"/>
+              <w:bottom w:val="single" w:color="BFBFBF" w:sz="4"/>
+              <w:right w:val="single" w:color="BFBFBF" w:sz="4"/>
+            </w:tcBorders>
+            <w:shd w:fill="F2F2F2" w:val="clear"/>
+            <w:tcMar>
+              <w:top w:type="dxa" w:w="60"/>
+              <w:left w:type="dxa" w:w="120"/>
+              <w:bottom w:type="dxa" w:w="60"/>
+              <w:right w:type="dxa" w:w="120"/>
+            </w:tcMar>
+            <w:vAlign w:val="center"/>
+          </w:tcPr>
+          <w:p>
+            <w:pPr>
+              <w:jc w:val="left"/>
+            </w:pPr>
+            <w:r>
+              <w:rPr>
+                <w:rFonts w:ascii="Calibri" w:cs="Calibri" w:eastAsia="Calibri" w:hAnsi="Calibri"/>
+                <w:sz w:val="19"/>
+                <w:szCs w:val="19"/>
+              </w:rPr>
+              <w:t xml:space="preserve">&gt;=5 vidljivih protivnika</w:t>
+            </w:r>
+          </w:p>
+        </w:tc>
+        <w:tc>
+          <w:tcPr>
+            <w:tcW w:type="dxa" w:w="1800"/>
+            <w:tcBorders>
+              <w:top w:val="single" w:color="BFBFBF" w:sz="4"/>
+              <w:left w:val="single" w:color="BFBFBF" w:sz="4"/>
+              <w:bottom w:val="single" w:color="BFBFBF" w:sz="4"/>
+              <w:right w:val="single" w:color="BFBFBF" w:sz="4"/>
+            </w:tcBorders>
+            <w:shd w:fill="F2F2F2" w:val="clear"/>
+            <w:tcMar>
+              <w:top w:type="dxa" w:w="60"/>
+              <w:left w:type="dxa" w:w="120"/>
+              <w:bottom w:type="dxa" w:w="60"/>
+              <w:right w:type="dxa" w:w="120"/>
+            </w:tcMar>
+            <w:vAlign w:val="center"/>
+          </w:tcPr>
+          <w:p>
+            <w:pPr>
+              <w:jc w:val="center"/>
+            </w:pPr>
+            <w:r>
+              <w:rPr>
+                <w:rFonts w:ascii="Calibri" w:cs="Calibri" w:eastAsia="Calibri" w:hAnsi="Calibri"/>
+                <w:sz w:val="19"/>
+                <w:szCs w:val="19"/>
+              </w:rPr>
+              <w:t xml:space="preserve">3.704</w:t>
+            </w:r>
+          </w:p>
+        </w:tc>
+        <w:tc>
+          <w:tcPr>
+            <w:tcW w:type="dxa" w:w="1800"/>
+            <w:tcBorders>
+              <w:top w:val="single" w:color="BFBFBF" w:sz="4"/>
+              <w:left w:val="single" w:color="BFBFBF" w:sz="4"/>
+              <w:bottom w:val="single" w:color="BFBFBF" w:sz="4"/>
+              <w:right w:val="single" w:color="BFBFBF" w:sz="4"/>
+            </w:tcBorders>
+            <w:shd w:fill="F2F2F2" w:val="clear"/>
+            <w:tcMar>
+              <w:top w:type="dxa" w:w="60"/>
+              <w:left w:type="dxa" w:w="120"/>
+              <w:bottom w:type="dxa" w:w="60"/>
+              <w:right w:type="dxa" w:w="120"/>
+            </w:tcMar>
+            <w:vAlign w:val="center"/>
+          </w:tcPr>
+          <w:p>
+            <w:pPr>
+              <w:jc w:val="center"/>
+            </w:pPr>
+            <w:r>
+              <w:rPr>
+                <w:rFonts w:ascii="Calibri" w:cs="Calibri" w:eastAsia="Calibri" w:hAnsi="Calibri"/>
+                <w:sz w:val="19"/>
+                <w:szCs w:val="19"/>
+              </w:rPr>
+              <w:t xml:space="preserve">0,756</w:t>
+            </w:r>
+          </w:p>
+        </w:tc>
+        <w:tc>
+          <w:tcPr>
+            <w:tcW w:type="dxa" w:w="1800"/>
+            <w:tcBorders>
+              <w:top w:val="single" w:color="BFBFBF" w:sz="4"/>
+              <w:left w:val="single" w:color="BFBFBF" w:sz="4"/>
+              <w:bottom w:val="single" w:color="BFBFBF" w:sz="4"/>
+              <w:right w:val="single" w:color="BFBFBF" w:sz="4"/>
+            </w:tcBorders>
+            <w:shd w:fill="F2F2F2" w:val="clear"/>
+            <w:tcMar>
+              <w:top w:type="dxa" w:w="60"/>
+              <w:left w:type="dxa" w:w="120"/>
+              <w:bottom w:type="dxa" w:w="60"/>
+              <w:right w:type="dxa" w:w="120"/>
+            </w:tcMar>
+            <w:vAlign w:val="center"/>
+          </w:tcPr>
+          <w:p>
+            <w:pPr>
+              <w:jc w:val="center"/>
+            </w:pPr>
+            <w:r>
+              <w:rPr>
+                <w:rFonts w:ascii="Calibri" w:cs="Calibri" w:eastAsia="Calibri" w:hAnsi="Calibri"/>
+                <w:sz w:val="19"/>
+                <w:szCs w:val="19"/>
+              </w:rPr>
+              <w:t xml:space="preserve">0,765</w:t>
+            </w:r>
+          </w:p>
+        </w:tc>
+        <w:tc>
+          <w:tcPr>
+            <w:tcW w:type="dxa" w:w="1800"/>
+            <w:tcBorders>
+              <w:top w:val="single" w:color="BFBFBF" w:sz="4"/>
+              <w:left w:val="single" w:color="BFBFBF" w:sz="4"/>
+              <w:bottom w:val="single" w:color="BFBFBF" w:sz="4"/>
+              <w:right w:val="single" w:color="BFBFBF" w:sz="4"/>
+            </w:tcBorders>
+            <w:shd w:fill="F2F2F2" w:val="clear"/>
+            <w:tcMar>
+              <w:top w:type="dxa" w:w="60"/>
+              <w:left w:type="dxa" w:w="120"/>
+              <w:bottom w:type="dxa" w:w="60"/>
+              <w:right w:type="dxa" w:w="120"/>
+            </w:tcMar>
+            <w:vAlign w:val="center"/>
+          </w:tcPr>
+          <w:p>
+            <w:pPr>
+              <w:jc w:val="center"/>
+            </w:pPr>
+            <w:r>
+              <w:rPr>
+                <w:rFonts w:ascii="Calibri" w:cs="Calibri" w:eastAsia="Calibri" w:hAnsi="Calibri"/>
+                <w:sz w:val="19"/>
+                <w:szCs w:val="19"/>
+              </w:rPr>
+              <w:t xml:space="preserve">+0,009</w:t>
+            </w:r>
+          </w:p>
+        </w:tc>
+      </w:tr>
+      <w:tr>
+        <w:tc>
+          <w:tcPr>
+            <w:tcW w:type="dxa" w:w="1800"/>
+            <w:tcBorders>
+              <w:top w:val="single" w:color="BFBFBF" w:sz="4"/>
+              <w:left w:val="single" w:color="BFBFBF" w:sz="4"/>
+              <w:bottom w:val="single" w:color="BFBFBF" w:sz="4"/>
+              <w:right w:val="single" w:color="BFBFBF" w:sz="4"/>
+            </w:tcBorders>
+            <w:shd w:fill="FFFFFF" w:val="clear"/>
+            <w:tcMar>
+              <w:top w:type="dxa" w:w="60"/>
+              <w:left w:type="dxa" w:w="120"/>
+              <w:bottom w:type="dxa" w:w="60"/>
+              <w:right w:type="dxa" w:w="120"/>
+            </w:tcMar>
+            <w:vAlign w:val="center"/>
+          </w:tcPr>
+          <w:p>
+            <w:pPr>
+              <w:jc w:val="left"/>
+            </w:pPr>
+            <w:r>
+              <w:rPr>
+                <w:rFonts w:ascii="Calibri" w:cs="Calibri" w:eastAsia="Calibri" w:hAnsi="Calibri"/>
+                <w:sz w:val="19"/>
+                <w:szCs w:val="19"/>
+              </w:rPr>
+              <w:t xml:space="preserve">&gt;=8 vidljivih protivnika</w:t>
+            </w:r>
+          </w:p>
+        </w:tc>
+        <w:tc>
+          <w:tcPr>
+            <w:tcW w:type="dxa" w:w="1800"/>
+            <w:tcBorders>
+              <w:top w:val="single" w:color="BFBFBF" w:sz="4"/>
+              <w:left w:val="single" w:color="BFBFBF" w:sz="4"/>
+              <w:bottom w:val="single" w:color="BFBFBF" w:sz="4"/>
+              <w:right w:val="single" w:color="BFBFBF" w:sz="4"/>
+            </w:tcBorders>
+            <w:shd w:fill="FFFFFF" w:val="clear"/>
+            <w:tcMar>
+              <w:top w:type="dxa" w:w="60"/>
+              <w:left w:type="dxa" w:w="120"/>
+              <w:bottom w:type="dxa" w:w="60"/>
+              <w:right w:type="dxa" w:w="120"/>
+            </w:tcMar>
+            <w:vAlign w:val="center"/>
+          </w:tcPr>
+          <w:p>
+            <w:pPr>
+              <w:jc w:val="center"/>
+            </w:pPr>
+            <w:r>
+              <w:rPr>
+                <w:rFonts w:ascii="Calibri" w:cs="Calibri" w:eastAsia="Calibri" w:hAnsi="Calibri"/>
+                <w:sz w:val="19"/>
+                <w:szCs w:val="19"/>
+              </w:rPr>
+              <w:t xml:space="preserve">2.643</w:t>
+            </w:r>
+          </w:p>
+        </w:tc>
+        <w:tc>
+          <w:tcPr>
+            <w:tcW w:type="dxa" w:w="1800"/>
+            <w:tcBorders>
+              <w:top w:val="single" w:color="BFBFBF" w:sz="4"/>
+              <w:left w:val="single" w:color="BFBFBF" w:sz="4"/>
+              <w:bottom w:val="single" w:color="BFBFBF" w:sz="4"/>
+              <w:right w:val="single" w:color="BFBFBF" w:sz="4"/>
+            </w:tcBorders>
+            <w:shd w:fill="FFFFFF" w:val="clear"/>
+            <w:tcMar>
+              <w:top w:type="dxa" w:w="60"/>
+              <w:left w:type="dxa" w:w="120"/>
+              <w:bottom w:type="dxa" w:w="60"/>
+              <w:right w:type="dxa" w:w="120"/>
+            </w:tcMar>
+            <w:vAlign w:val="center"/>
+          </w:tcPr>
+          <w:p>
+            <w:pPr>
+              <w:jc w:val="center"/>
+            </w:pPr>
+            <w:r>
+              <w:rPr>
+                <w:rFonts w:ascii="Calibri" w:cs="Calibri" w:eastAsia="Calibri" w:hAnsi="Calibri"/>
+                <w:sz w:val="19"/>
+                <w:szCs w:val="19"/>
+              </w:rPr>
+              <w:t xml:space="preserve">0,747</w:t>
+            </w:r>
+          </w:p>
+        </w:tc>
+        <w:tc>
+          <w:tcPr>
+            <w:tcW w:type="dxa" w:w="1800"/>
+            <w:tcBorders>
+              <w:top w:val="single" w:color="BFBFBF" w:sz="4"/>
+              <w:left w:val="single" w:color="BFBFBF" w:sz="4"/>
+              <w:bottom w:val="single" w:color="BFBFBF" w:sz="4"/>
+              <w:right w:val="single" w:color="BFBFBF" w:sz="4"/>
+            </w:tcBorders>
+            <w:shd w:fill="FFFFFF" w:val="clear"/>
+            <w:tcMar>
+              <w:top w:type="dxa" w:w="60"/>
+              <w:left w:type="dxa" w:w="120"/>
+              <w:bottom w:type="dxa" w:w="60"/>
+              <w:right w:type="dxa" w:w="120"/>
+            </w:tcMar>
+            <w:vAlign w:val="center"/>
+          </w:tcPr>
+          <w:p>
+            <w:pPr>
+              <w:jc w:val="center"/>
+            </w:pPr>
+            <w:r>
+              <w:rPr>
+                <w:rFonts w:ascii="Calibri" w:cs="Calibri" w:eastAsia="Calibri" w:hAnsi="Calibri"/>
+                <w:sz w:val="19"/>
+                <w:szCs w:val="19"/>
+              </w:rPr>
+              <w:t xml:space="preserve">0,757</w:t>
+            </w:r>
+          </w:p>
+        </w:tc>
+        <w:tc>
+          <w:tcPr>
+            <w:tcW w:type="dxa" w:w="1800"/>
+            <w:tcBorders>
+              <w:top w:val="single" w:color="BFBFBF" w:sz="4"/>
+              <w:left w:val="single" w:color="BFBFBF" w:sz="4"/>
+              <w:bottom w:val="single" w:color="BFBFBF" w:sz="4"/>
+              <w:right w:val="single" w:color="BFBFBF" w:sz="4"/>
+            </w:tcBorders>
+            <w:shd w:fill="FFFFFF" w:val="clear"/>
+            <w:tcMar>
+              <w:top w:type="dxa" w:w="60"/>
+              <w:left w:type="dxa" w:w="120"/>
+              <w:bottom w:type="dxa" w:w="60"/>
+              <w:right w:type="dxa" w:w="120"/>
+            </w:tcMar>
+            <w:vAlign w:val="center"/>
+          </w:tcPr>
+          <w:p>
+            <w:pPr>
+              <w:jc w:val="center"/>
+            </w:pPr>
+            <w:r>
+              <w:rPr>
+                <w:rFonts w:ascii="Calibri" w:cs="Calibri" w:eastAsia="Calibri" w:hAnsi="Calibri"/>
+                <w:sz w:val="19"/>
+                <w:szCs w:val="19"/>
+              </w:rPr>
+              <w:t xml:space="preserve">+0,011</w:t>
+            </w:r>
+          </w:p>
+        </w:tc>
+      </w:tr>
+    </w:tbl>
+    <w:p>
+      <w:pPr>
+        <w:spacing w:after="160" w:line="276"/>
+        <w:ind w:firstLine="397"/>
+        <w:jc w:val="both"/>
+      </w:pPr>
+      <w:r>
+        <w:rPr>
+          <w:rFonts w:ascii="Calibri" w:cs="Calibri" w:eastAsia="Calibri" w:hAnsi="Calibri"/>
+          <w:sz w:val="22"/>
+          <w:szCs w:val="22"/>
+        </w:rPr>
+        <w:t xml:space="preserve">Model B zadržava prednost na svim pragovima vidljivosti. Smanjenje delta vrednosti za striktnije pragove (sa +0,013 na +0,009) je umereno i može odražavati gubitak statističke snage (manji uzorak) jednako kao i realni efekat kompletnosti podataka. Ključni zaključak je da prednost Modela B nije artefakt nepotpunih freeze-frame podataka.</w:t>
       </w:r>
     </w:p>
     <w:p>

</xml_diff>

<commit_message>
Fix all table numbers to match StratifiedGroupKFold pipeline output, update methodology text
</commit_message>
<xml_diff>
--- a/xg_rad_nacrt.docx
+++ b/xg_rad_nacrt.docx
@@ -2654,7 +2654,7 @@
           <w:sz w:val="22"/>
           <w:szCs w:val="22"/>
         </w:rPr>
-        <w:t xml:space="preserve">Hiperparametri su podešavani metodom Randomized Search uz unutrašnju petokratnu StratifiedGroupKFold po meču unakrsnu validaciju, čime je obezbeđeno da test podaci nikada nisu učestvovali u procesu podešavanja.</w:t>
+        <w:t xml:space="preserve">Hiperparametri su podešavani metodom Grid Search uz unutrašnju trokratnu StratifiedGroupKFold po meču unakrsnu validaciju, čime je obezbeđeno da test podaci nikada nisu učestvovali u procesu podešavanja, a šutevi iz istog meča uvek ostaju u istom foldu.</w:t>
       </w:r>
     </w:p>
     <w:p>
@@ -2695,7 +2695,7 @@
           <w:sz w:val="22"/>
           <w:szCs w:val="22"/>
         </w:rPr>
-        <w:t xml:space="preserve">StratifiedGroupKFold po meču (5 foldova): koliko model radi na podacima iz iste distribucije kao i podaci za treniranje.</w:t>
+        <w:t xml:space="preserve">StratifiedGroupKFold po meču (5 foldova): koliko model radi na podacima iz iste distribucije kao i podaci za treniranje, uz strogi uslov da svi šutevi iz jedne utakmice ostaju u istom foldu (sprečava curenje informacija unutar meča).</w:t>
       </w:r>
     </w:p>
     <w:p>
@@ -2728,7 +2728,7 @@
           <w:sz w:val="22"/>
           <w:szCs w:val="22"/>
         </w:rPr>
-        <w:t xml:space="preserve">Ovakav dvostepeni pristup namerno je odabran jer K-Fold i Leave-One-Tournament-Out odgovaraju na različita pitanja: prvi procenjuje performans unutar poznate distribucije, a drugi procenjuje robusnost modela na potpuno nov kontekst. Treba napomenuti da Leave-One-Tournament-Out validacija sa samo tri turnira ima ograničenu statističku snagu za procenu varijanse generalizacije, te da su Evropsko prvenstvo 2020 i Evropsko prvenstvo 2024 strukturno sličniji jedan drugom (isto takmičenje, različite edicije) nego Svetskom prvenstvu, što treba imati u vidu pri tumačenju rezultata.</w:t>
+        <w:t xml:space="preserve">Ovakav dvostepeni pristup namerno je odabran jer StratifiedGroupKFold i Leave-One-Tournament-Out odgovaraju na različita pitanja: prvi procenjuje performans unutar poznate distribucije uz kontrolu grupne strukture (šutevi iz istog meča ne curi u test), a drugi procenjuje robusnost modela na potpuno nov kontekst. Treba napomenuti da Leave-One-Tournament-Out validacija sa samo tri turnira ima ograničenu statističku snagu za procenu varijanse generalizacije, te da su Evropsko prvenstvo 2020 i Evropsko prvenstvo 2024 strukturno sličniji jedan drugom (isto takmičenje, različite edicije) nego Svetskom prvenstvu, što treba imati u vidu pri tumačenju rezultata.</w:t>
       </w:r>
     </w:p>
     <w:p>
@@ -3578,7 +3578,7 @@
                 <w:sz w:val="19"/>
                 <w:szCs w:val="19"/>
               </w:rPr>
-              <w:t xml:space="preserve">0,744</w:t>
+              <w:t xml:space="preserve">0,753</w:t>
             </w:r>
           </w:p>
         </w:tc>
@@ -3610,7 +3610,7 @@
                 <w:sz w:val="19"/>
                 <w:szCs w:val="19"/>
               </w:rPr>
-              <w:t xml:space="preserve">0,289</w:t>
+              <w:t xml:space="preserve">0,301</w:t>
             </w:r>
           </w:p>
         </w:tc>
@@ -3642,7 +3642,7 @@
                 <w:sz w:val="19"/>
                 <w:szCs w:val="19"/>
               </w:rPr>
-              <w:t xml:space="preserve">0,345</w:t>
+              <w:t xml:space="preserve">0,359</w:t>
             </w:r>
           </w:p>
         </w:tc>
@@ -3934,7 +3934,7 @@
                 <w:sz w:val="19"/>
                 <w:szCs w:val="19"/>
               </w:rPr>
-              <w:t xml:space="preserve">0,294</w:t>
+              <w:t xml:space="preserve">0,290</w:t>
             </w:r>
           </w:p>
         </w:tc>
@@ -3966,7 +3966,7 @@
                 <w:sz w:val="19"/>
                 <w:szCs w:val="19"/>
               </w:rPr>
-              <w:t xml:space="preserve">0,376</w:t>
+              <w:t xml:space="preserve">0,365</w:t>
             </w:r>
           </w:p>
         </w:tc>
@@ -4304,7 +4304,7 @@
                 <w:sz w:val="19"/>
                 <w:szCs w:val="19"/>
               </w:rPr>
-              <w:t xml:space="preserve">0,760</w:t>
+              <w:t xml:space="preserve">0,759</w:t>
             </w:r>
           </w:p>
         </w:tc>
@@ -4336,7 +4336,7 @@
                 <w:sz w:val="19"/>
                 <w:szCs w:val="19"/>
               </w:rPr>
-              <w:t xml:space="preserve">0,301</w:t>
+              <w:t xml:space="preserve">0,299</w:t>
             </w:r>
           </w:p>
         </w:tc>
@@ -4368,7 +4368,7 @@
                 <w:sz w:val="19"/>
                 <w:szCs w:val="19"/>
               </w:rPr>
-              <w:t xml:space="preserve">0,350</w:t>
+              <w:t xml:space="preserve">0,346</w:t>
             </w:r>
           </w:p>
         </w:tc>
@@ -4466,7 +4466,7 @@
                 <w:sz w:val="19"/>
                 <w:szCs w:val="19"/>
               </w:rPr>
-              <w:t xml:space="preserve">0,760</w:t>
+              <w:t xml:space="preserve">0,756</w:t>
             </w:r>
           </w:p>
         </w:tc>
@@ -4498,7 +4498,7 @@
                 <w:sz w:val="19"/>
                 <w:szCs w:val="19"/>
               </w:rPr>
-              <w:t xml:space="preserve">0,293</w:t>
+              <w:t xml:space="preserve">0,290</w:t>
             </w:r>
           </w:p>
         </w:tc>
@@ -4530,7 +4530,7 @@
                 <w:sz w:val="19"/>
                 <w:szCs w:val="19"/>
               </w:rPr>
-              <w:t xml:space="preserve">0,354</w:t>
+              <w:t xml:space="preserve">0,352</w:t>
             </w:r>
           </w:p>
         </w:tc>
@@ -4854,7 +4854,7 @@
                 <w:sz w:val="19"/>
                 <w:szCs w:val="19"/>
               </w:rPr>
-              <w:t xml:space="preserve">0,389</w:t>
+              <w:t xml:space="preserve">0,394</w:t>
             </w:r>
           </w:p>
         </w:tc>
@@ -5276,7 +5276,7 @@
                 <w:sz w:val="19"/>
                 <w:szCs w:val="19"/>
               </w:rPr>
-              <w:t xml:space="preserve">0,155</w:t>
+              <w:t xml:space="preserve">0,146</w:t>
             </w:r>
           </w:p>
         </w:tc>
@@ -5374,7 +5374,7 @@
                 <w:sz w:val="19"/>
                 <w:szCs w:val="19"/>
               </w:rPr>
-              <w:t xml:space="preserve">0,107</w:t>
+              <w:t xml:space="preserve">0,095</w:t>
             </w:r>
           </w:p>
         </w:tc>
@@ -5472,7 +5472,7 @@
                 <w:sz w:val="19"/>
                 <w:szCs w:val="19"/>
               </w:rPr>
-              <w:t xml:space="preserve">0,147</w:t>
+              <w:t xml:space="preserve">0,139</w:t>
             </w:r>
           </w:p>
         </w:tc>
@@ -5570,7 +5570,7 @@
                 <w:sz w:val="19"/>
                 <w:szCs w:val="19"/>
               </w:rPr>
-              <w:t xml:space="preserve">0,121</w:t>
+              <w:t xml:space="preserve">0,091</w:t>
             </w:r>
           </w:p>
         </w:tc>
@@ -5602,7 +5602,7 @@
                 <w:sz w:val="19"/>
                 <w:szCs w:val="19"/>
               </w:rPr>
-              <w:t xml:space="preserve">0,075</w:t>
+              <w:t xml:space="preserve">0,076</w:t>
             </w:r>
           </w:p>
         </w:tc>
@@ -5620,7 +5620,7 @@
           <w:sz w:val="22"/>
           <w:szCs w:val="22"/>
         </w:rPr>
-        <w:t xml:space="preserve">Sirovi modeli, pre post-hoc kalibracije, pokazuju sistematsku prekalibrisanost u višem opsegu predviđenih verovatnoća. Primena izotone regresije kao post-hoc kalibracije značajno poboljšava Brier skor za sve četiri kombinacije modela (redukcije od 29% do 51% u zavisnosti od modela i validacione šeme).</w:t>
+        <w:t xml:space="preserve">Sirovi modeli, pre post-hoc kalibracije, pokazuju sistematsku prekalibrisanost u višem opsegu predviđenih verovatnoća. Primena izotone regresije kao post-hoc kalibracije značajno poboljšava Brier skor za sve četiri kombinacije modela (redukcije od 16% do 48% u zavisnosti od modela i validacione šeme).</w:t>
       </w:r>
     </w:p>
     <w:p>
@@ -6145,7 +6145,7 @@
                 <w:sz w:val="19"/>
                 <w:szCs w:val="19"/>
               </w:rPr>
-              <w:t xml:space="preserve">0,764</w:t>
+              <w:t xml:space="preserve">0,765</w:t>
             </w:r>
           </w:p>
         </w:tc>
@@ -6373,7 +6373,7 @@
                 <w:sz w:val="19"/>
                 <w:szCs w:val="19"/>
               </w:rPr>
-              <w:t xml:space="preserve">+0,008</w:t>
+              <w:t xml:space="preserve">+0,007</w:t>
             </w:r>
           </w:p>
         </w:tc>
@@ -6439,7 +6439,7 @@
                 <w:sz w:val="19"/>
                 <w:szCs w:val="19"/>
               </w:rPr>
-              <w:t xml:space="preserve">0,772</w:t>
+              <w:t xml:space="preserve">0,773</w:t>
             </w:r>
           </w:p>
         </w:tc>
@@ -6471,7 +6471,7 @@
                 <w:sz w:val="19"/>
                 <w:szCs w:val="19"/>
               </w:rPr>
-              <w:t xml:space="preserve">+0,012</w:t>
+              <w:t xml:space="preserve">+0,013</w:t>
             </w:r>
           </w:p>
         </w:tc>
@@ -6489,7 +6489,7 @@
           <w:sz w:val="22"/>
           <w:szCs w:val="22"/>
         </w:rPr>
-        <w:t xml:space="preserve">Rezultati pokazuju da CONE daje najveće poboljšanje kada se pojedinačno doda Modelu A (+0,008), zatim PRESSURE (+0,007) i GK (+0,004). OPEN_ANGLE i SHOT_LINE ne donose merljiv doprinos kad se dodaju samostalno. Ovo ne meri jedinstveni doprinos svake grupe u punom modelu (jer su 360 atributi međusobno korelisani), već performans grupe kada se izoluje i doda baseline-u. Otvorenost ugla nije pokazala samostalan inkrementalni doprinos; njen eventualni doprinos u punom modelu može biti posledica redundancije sa drugim prostornim atributima. Napomena: ROC AUC za pun Model B u Tabeli 5 (0,772) blago se razlikuje od vrednosti u Tabeli 3 (0,771) jer ablation koristi logističku regresiju bez GridSearchCV.</w:t>
+        <w:t xml:space="preserve">Rezultati pokazuju da CONE daje najveće poboljšanje kada se pojedinačno doda Modelu A (+0,007), zatim PRESSURE (+0,007) i GK (+0,004). OPEN_ANGLE i SHOT_LINE ne donose merljiv doprinos kad se dodaju samostalno. Ovo ne meri jedinstveni doprinos svake grupe u punom modelu (jer su 360 atributi međusobno korelisani), već performans grupe kada se izoluje i doda baseline-u. Otvorenost ugla nije pokazala samostalan inkrementalni doprinos; njen eventualni doprinos u punom modelu može biti posledica redundancije sa drugim prostornim atributima. Napomena: ROC AUC za pun Model B u Tabeli 5 (0,773) blago se razlikuje od vrednosti u Tabeli 3 (0,777) jer ablation koristi logističku regresiju bez GridSearchCV.</w:t>
       </w:r>
     </w:p>
     <w:p>

</xml_diff>

<commit_message>
Remove VIF=inf duplicate (defenders_in_shot_cone), update all table numbers
</commit_message>
<xml_diff>
--- a/xg_rad_nacrt.docx
+++ b/xg_rad_nacrt.docx
@@ -3740,7 +3740,7 @@
                 <w:sz w:val="19"/>
                 <w:szCs w:val="19"/>
               </w:rPr>
-              <w:t xml:space="preserve">0,772</w:t>
+              <w:t xml:space="preserve">0,770</w:t>
             </w:r>
           </w:p>
         </w:tc>
@@ -3772,7 +3772,7 @@
                 <w:sz w:val="19"/>
                 <w:szCs w:val="19"/>
               </w:rPr>
-              <w:t xml:space="preserve">0,319</w:t>
+              <w:t xml:space="preserve">0,318</w:t>
             </w:r>
           </w:p>
         </w:tc>
@@ -3804,7 +3804,7 @@
                 <w:sz w:val="19"/>
                 <w:szCs w:val="19"/>
               </w:rPr>
-              <w:t xml:space="preserve">0,379</w:t>
+              <w:t xml:space="preserve">0,378</w:t>
             </w:r>
           </w:p>
         </w:tc>
@@ -3902,7 +3902,7 @@
                 <w:sz w:val="19"/>
                 <w:szCs w:val="19"/>
               </w:rPr>
-              <w:t xml:space="preserve">0,758</w:t>
+              <w:t xml:space="preserve">0,760</w:t>
             </w:r>
           </w:p>
         </w:tc>
@@ -3934,7 +3934,7 @@
                 <w:sz w:val="19"/>
                 <w:szCs w:val="19"/>
               </w:rPr>
-              <w:t xml:space="preserve">0,290</w:t>
+              <w:t xml:space="preserve">0,298</w:t>
             </w:r>
           </w:p>
         </w:tc>
@@ -3966,7 +3966,7 @@
                 <w:sz w:val="19"/>
                 <w:szCs w:val="19"/>
               </w:rPr>
-              <w:t xml:space="preserve">0,365</w:t>
+              <w:t xml:space="preserve">0,366</w:t>
             </w:r>
           </w:p>
         </w:tc>
@@ -3998,7 +3998,7 @@
                 <w:sz w:val="19"/>
                 <w:szCs w:val="19"/>
               </w:rPr>
-              <w:t xml:space="preserve">0,076</w:t>
+              <w:t xml:space="preserve">0,075</w:t>
             </w:r>
           </w:p>
         </w:tc>
@@ -4790,7 +4790,7 @@
                 <w:sz w:val="19"/>
                 <w:szCs w:val="19"/>
               </w:rPr>
-              <w:t xml:space="preserve">0,770</w:t>
+              <w:t xml:space="preserve">0,772</w:t>
             </w:r>
           </w:p>
         </w:tc>
@@ -4854,7 +4854,7 @@
                 <w:sz w:val="19"/>
                 <w:szCs w:val="19"/>
               </w:rPr>
-              <w:t xml:space="preserve">0,394</w:t>
+              <w:t xml:space="preserve">0,401</w:t>
             </w:r>
           </w:p>
         </w:tc>
@@ -4886,7 +4886,7 @@
                 <w:sz w:val="19"/>
                 <w:szCs w:val="19"/>
               </w:rPr>
-              <w:t xml:space="preserve">0,075</w:t>
+              <w:t xml:space="preserve">0,074</w:t>
             </w:r>
           </w:p>
         </w:tc>
@@ -5030,22 +5030,22 @@
           <w:sz w:val="22"/>
           <w:szCs w:val="22"/>
         </w:rPr>
-        <w:t xml:space="preserve">gde su ℓ_A i ℓ_B logaritmi verodostojnosti Modela A i Modela B, a LR statistika prati hi-kvadrat raspodelu sa brojem stepeni slobode jednakim broju dodatnih parametara u Modelu B. Oba modela su fitovana na identičnom skupu od 3.967 šuteva (bez penala, bez 1 šuta sa uglom jednakim nuli), kako bi poređenje log-likelihood vrednosti bilo validno. Rezultat je LR = 67,98, sa 11 stepeni slobode, što odgovara p-vrednosti od približno 2,95×10⁻¹⁰, odlučno odbacujući nultu hipotezu da StatsBomb 360 atributi ne doprinose modelu. Akaikeov informacioni kriterijum: AIC iznosi 2.139,93 za Model A i 2.093,95 za Model B (favorizuje B). Bajesov informacioni kriterijum (BIC) iznosi 2.202,79 naspram 2.225,95 (favorizuje A, što je metodološki očekivano jer BIC strože kažnjava dodatne parametre).</w:t>
-      </w:r>
-    </w:p>
-    <w:p>
-      <w:pPr>
-        <w:spacing w:after="160" w:line="276"/>
-        <w:ind w:firstLine="397"/>
-        <w:jc w:val="both"/>
-      </w:pPr>
-      <w:r>
-        <w:rPr>
-          <w:rFonts w:ascii="Calibri" w:cs="Calibri" w:eastAsia="Calibri" w:hAnsi="Calibri"/>
-          <w:sz w:val="22"/>
-          <w:szCs w:val="22"/>
-        </w:rPr>
-        <w:t xml:space="preserve">Za poređenje na nivou pojedinačnih šuteva, sprovedena je bootstrap analiza razlike ROC AUC na kompletnim out-of-fold (OOF) predikcijama iz svih LOTO foldova. Pooled OOF ROC AUC iznosi 0,677 za Model A i 0,688 za Model B. Opažena razlika (Model B minus Model A) iznosi 0,010, a 95% bootstrap interval poverenja (2.000 iteracija) iznosi [-0,015, 0,037]. Interval sadrži nulu, što znači da na nivou pojedinačnog šuta razlika nije statistički značajna na alfa=0,05. Ovo je vredan nalaz koji zaslužuje transparentno prikazivanje: signal od 360 atributa je realan ali umeren. Na nivou turnira (LOTO validacija, Tabela 3), razlika je konzistentna i praktično smislena (+0,018 AUC). LR test potvrđuje da 360 atributi nose stvarnu inkrementalnu informaciju (p=2,95×10⁻¹⁰). Zaključak je da 360 atributi poboljšavaju model konzistentno kroz turnire, ali efekt na nivou pojedinačnog šuta nije toliko jak da preživi konzervativni shot-level bootstrap.</w:t>
+        <w:t xml:space="preserve">gde su ℓ_A i ℓ_B logaritmi verodostojnosti Modela A i Modela B, a LR statistika prati hi-kvadrat raspodelu sa brojem stepeni slobode jednakim broju dodatnih parametara u Modelu B. Oba modela su fitovana na identičnom skupu od 3.967 šuteva (bez penala, bez 1 šuta sa uglom jednakim nuli), kako bi poređenje log-likelihood vrednosti bilo validno. Rezultat je LR = 67,97, sa 11 stepeni slobode, što odgovara p-vrednosti od približno 2,97×10⁻¹⁰, odlučno odbacujući nultu hipotezu da StatsBomb 360 atributi ne doprinose modelu. Akaikeov informacioni kriterijum: AIC iznosi 2.139,93 za Model A i 2.093,96 za Model B (favorizuje B). Bajesov informacioni kriterijum (BIC) iznosi 2.202,79 naspram 2.225,96 (favorizuje A, što je metodološki očekivano jer BIC strože kažnjava dodatne parametre).</w:t>
+      </w:r>
+    </w:p>
+    <w:p>
+      <w:pPr>
+        <w:spacing w:after="160" w:line="276"/>
+        <w:ind w:firstLine="397"/>
+        <w:jc w:val="both"/>
+      </w:pPr>
+      <w:r>
+        <w:rPr>
+          <w:rFonts w:ascii="Calibri" w:cs="Calibri" w:eastAsia="Calibri" w:hAnsi="Calibri"/>
+          <w:sz w:val="22"/>
+          <w:szCs w:val="22"/>
+        </w:rPr>
+        <w:t xml:space="preserve">Za poređenje na nivou pojedinačnih šuteva, sprovedena je bootstrap analiza razlike ROC AUC na kompletnim out-of-fold (OOF) predikcijama iz svih LOTO foldova. Pooled OOF ROC AUC iznosi 0,677 za Model A i 0,675 za Model B. Opažena razlika (Model B minus Model A) iznosi -0,003, a 95% bootstrap interval poverenja (2.000 iteracija) iznosi [-0,047, 0,040]. Interval sadrži nulu, što znači da na nivou pojedinačnog šuta razlika nije statistički značajna na alfa=0,05. Ovo je vredan nalaz koji zaslužuje transparentno prikazivanje: signal od 360 atributa je realan ali umeren. Na nivou turnira (LOTO validacija, Tabela 3), razlika je konzistentna i praktično smislena (+0,017 AUC). LR test potvrđuje da 360 atributi nose stvarnu inkrementalnu informaciju (p=2,97×10⁻¹⁰). Zaključak je da 360 atributi poboljšavaju model konzistentno kroz turnire, ali efekt na nivou pojedinačnog šuta nije toliko jak da preživi konzervativni shot-level bootstrap sa grupnom korekcijom.</w:t>
       </w:r>
     </w:p>
     <w:p>
@@ -5472,7 +5472,7 @@
                 <w:sz w:val="19"/>
                 <w:szCs w:val="19"/>
               </w:rPr>
-              <w:t xml:space="preserve">0,139</w:t>
+              <w:t xml:space="preserve">0,117</w:t>
             </w:r>
           </w:p>
         </w:tc>
@@ -5570,7 +5570,7 @@
                 <w:sz w:val="19"/>
                 <w:szCs w:val="19"/>
               </w:rPr>
-              <w:t xml:space="preserve">0,091</w:t>
+              <w:t xml:space="preserve">0,087</w:t>
             </w:r>
           </w:p>
         </w:tc>
@@ -5602,7 +5602,7 @@
                 <w:sz w:val="19"/>
                 <w:szCs w:val="19"/>
               </w:rPr>
-              <w:t xml:space="preserve">0,076</w:t>
+              <w:t xml:space="preserve">0,075</w:t>
             </w:r>
           </w:p>
         </w:tc>
@@ -5620,7 +5620,7 @@
           <w:sz w:val="22"/>
           <w:szCs w:val="22"/>
         </w:rPr>
-        <w:t xml:space="preserve">Sirovi modeli, pre post-hoc kalibracije, pokazuju sistematsku prekalibrisanost u višem opsegu predviđenih verovatnoća. Primena izotone regresije kao post-hoc kalibracije značajno poboljšava Brier skor za sve četiri kombinacije modela (redukcije od 16% do 48% u zavisnosti od modela i validacione šeme).</w:t>
+        <w:t xml:space="preserve">Sirovi modeli, pre post-hoc kalibracije, pokazuju sistematsku prekalibrisanost u višem opsegu predviđenih verovatnoća. Primena izotone regresije kao post-hoc kalibracije značajno poboljšava Brier skor za sve četiri kombinacije modela (redukcije od 14% do 48% u zavisnosti od modela i validacione šeme).</w:t>
       </w:r>
     </w:p>
     <w:p>

</xml_diff>

<commit_message>
Remove VIF=inf duplicate, fix export paths, add VIF note to methodology, update all numbers
</commit_message>
<xml_diff>
--- a/xg_rad_nacrt.docx
+++ b/xg_rad_nacrt.docx
@@ -2253,6 +2253,21 @@
           <w:szCs w:val="22"/>
         </w:rPr>
         <w:t xml:space="preserve">Nakon ove korekcije, preostale promenljive sa VIF iznad 5 odnose se isključivo na dummy varijable tehnike šuta, naročito na dominantnu kategoriju (technique_Normal, VIF približno 51). Ovo je strukturni artefakt one-hot kodiranja u kombinaciji sa izrazito neravnomernom zastupljenošću kategorija (kategorija Normal čini približno 75% svih šuteva), a ne znak problematične multikolinearnosti između suštinski nezavisnih prediktora. Interpretacija koeficijenata ostaje validna, jer se svaki koeficijent dummy varijable tumači u odnosu na izostavljenu referentnu kategoriju, ne u odnosu na ostale dummy varijable.</w:t>
+      </w:r>
+    </w:p>
+    <w:p>
+      <w:pPr>
+        <w:spacing w:after="160" w:line="276"/>
+        <w:ind w:firstLine="397"/>
+        <w:jc w:val="both"/>
+      </w:pPr>
+      <w:r>
+        <w:rPr>
+          <w:rFonts w:ascii="Calibri" w:cs="Calibri" w:eastAsia="Calibri" w:hAnsi="Calibri"/>
+          <w:sz w:val="22"/>
+          <w:szCs w:val="22"/>
+        </w:rPr>
+        <w:t xml:space="preserve">Dodatno, VIF provera je identifikovala da je atribut defenders_in_shot_cone_360 tačan duplikat atributa opponents_between_shooter_and_goal_360 (VIF=inf, R²=1,0, koeficijent=1,000). Oba atributa su računala isti konstrukt (broj protivnika u trouglu šuter-dva stativa) pod različitim imenima. Duplikat je uklonjen iz finalnog skupa atributa pre formalnog LR testa, čime je eliminisana savršena linearna zavisnost koja je uzrokovala numeričku nestabilnost u nepenalizovanoj logističkoj regresiji.</w:t>
       </w:r>
     </w:p>
     <w:p>

</xml_diff>

<commit_message>
Update document: cluster bootstrap, imputation in pipeline, scoring sensitivity, expanded visibility table, VIF explanation
</commit_message>
<xml_diff>
--- a/xg_rad_nacrt.docx
+++ b/xg_rad_nacrt.docx
@@ -2267,7 +2267,7 @@
           <w:sz w:val="22"/>
           <w:szCs w:val="22"/>
         </w:rPr>
-        <w:t xml:space="preserve">Dodatno, VIF provera je identifikovala da je atribut defenders_in_shot_cone_360 tačan duplikat atributa opponents_between_shooter_and_goal_360 (VIF=inf, R²=1,0, koeficijent=1,000). Oba atributa su računala isti konstrukt (broj protivnika u trouglu šuter-dva stativa) pod različitim imenima. Duplikat je uklonjen iz finalnog skupa atributa pre formalnog LR testa, čime je eliminisana savršena linearna zavisnost koja je uzrokovala numeričku nestabilnost u nepenalizovanoj logističkoj regresiji.</w:t>
+        <w:t xml:space="preserve">Dodatno, VIF provera je identifikovala da je atribut defenders_in_shot_cone_360 tačan duplikat atributa opponents_between_shooter_and_goal_360 (VIF=inf, R²=1,0, koeficijent=1,000). Matematički, defenders_in_shot_cone broji protivnike u trouglu (šuter, levi stativ, desni stativ) bez uslova na x-koordinatu, dok opponents_between dodaje uslov px &gt;= sx (protivnik mora biti ispred šutera). Međutim, pošto je konus definisan ka golu (x=120) i svi šutevi dolaze sa x &lt; 120, uslov px &gt;= sx je empirijski uvek ispunjen za igrače unutar konusa. Rezultat: identične vrednosti na celom datasetu od 3.968 šuteva. Duplikat je uklonjen iz finalnog skupa atributa (zadržan je opponents_between_shooter_and_goal_360 kao deskriptivnije ime).</w:t>
       </w:r>
     </w:p>
     <w:p>
@@ -2865,7 +2865,22 @@
           <w:sz w:val="22"/>
           <w:szCs w:val="22"/>
         </w:rPr>
-        <w:t xml:space="preserve">Metoda post-hoc kalibracije (izotona regresija) je unapred definisana kao deo pipeline-a, ne izabrana nakon posmatranja rezultata na test skupu. Kalibraciona funkcija je naučena isključivo na trening delu svakog spoljnog folda (putem CalibratedClassifierCV sa unutrašnjom 3-fold validacijom), a nikada na test skupu na kome se izveštava finalni Brier skor. Izveštavaju se i nekalibrisan i kalibrisan Brier skor, da bi čitalac mogao da proceni korist kalibracije nezavisno od leakage-a.</w:t>
+        <w:t xml:space="preserve">Metoda post-hoc kalibracije (izotona regresija) je unapred definisana kao deo pipeline-a, ne izabrana nakon posmatranja rezultata na test skupu. Kalibraciona funkcija je naučena isključivo na trening delu svakog spoljnog folda (putem CalibratedClassifierCV sa unutrašnjom StratifiedGroupKFold validacijom po match_id), a nikada na test skupu na kome se izveštava finalni Brier skor. Programski je verifikovano da se skupovi match_id u kalibracionim foldovima ne preklapaju. Izveštavaju se i nekalibrisan i kalibrisan Brier skor, da bi čitalac mogao da proceni korist kalibracije nezavisno od leakage-a.</w:t>
+      </w:r>
+    </w:p>
+    <w:p>
+      <w:pPr>
+        <w:spacing w:after="160" w:line="276"/>
+        <w:ind w:firstLine="397"/>
+        <w:jc w:val="both"/>
+      </w:pPr>
+      <w:r>
+        <w:rPr>
+          <w:rFonts w:ascii="Calibri" w:cs="Calibri" w:eastAsia="Calibri" w:hAnsi="Calibri"/>
+          <w:sz w:val="22"/>
+          <w:szCs w:val="22"/>
+        </w:rPr>
+        <w:t xml:space="preserve">Imputacija nedostajucih vrednosti (medijana za numeričke, konstanta za kategoričke) je ugrađena u sklearn Pipeline (SimpleImputer) i izvršava se isključivo na trening delu svakog folda. Time se sprečava curenje informacija iz test skupa pri imputaciji.</w:t>
       </w:r>
     </w:p>
     <w:p>
@@ -3463,7 +3478,7 @@
                 <w:sz w:val="19"/>
                 <w:szCs w:val="19"/>
               </w:rPr>
-              <w:t xml:space="preserve">0,294</w:t>
+              <w:t xml:space="preserve">0,296</w:t>
             </w:r>
           </w:p>
         </w:tc>
@@ -3495,7 +3510,7 @@
                 <w:sz w:val="19"/>
                 <w:szCs w:val="19"/>
               </w:rPr>
-              <w:t xml:space="preserve">0,362</w:t>
+              <w:t xml:space="preserve">0,358</w:t>
             </w:r>
           </w:p>
         </w:tc>
@@ -3625,7 +3640,7 @@
                 <w:sz w:val="19"/>
                 <w:szCs w:val="19"/>
               </w:rPr>
-              <w:t xml:space="preserve">0,301</w:t>
+              <w:t xml:space="preserve">0,297</w:t>
             </w:r>
           </w:p>
         </w:tc>
@@ -3657,7 +3672,7 @@
                 <w:sz w:val="19"/>
                 <w:szCs w:val="19"/>
               </w:rPr>
-              <w:t xml:space="preserve">0,359</w:t>
+              <w:t xml:space="preserve">0,348</w:t>
             </w:r>
           </w:p>
         </w:tc>
@@ -3787,7 +3802,7 @@
                 <w:sz w:val="19"/>
                 <w:szCs w:val="19"/>
               </w:rPr>
-              <w:t xml:space="preserve">0,318</w:t>
+              <w:t xml:space="preserve">0,322</w:t>
             </w:r>
           </w:p>
         </w:tc>
@@ -3917,7 +3932,7 @@
                 <w:sz w:val="19"/>
                 <w:szCs w:val="19"/>
               </w:rPr>
-              <w:t xml:space="preserve">0,760</w:t>
+              <w:t xml:space="preserve">0,759</w:t>
             </w:r>
           </w:p>
         </w:tc>
@@ -3949,7 +3964,7 @@
                 <w:sz w:val="19"/>
                 <w:szCs w:val="19"/>
               </w:rPr>
-              <w:t xml:space="preserve">0,298</w:t>
+              <w:t xml:space="preserve">0,285</w:t>
             </w:r>
           </w:p>
         </w:tc>
@@ -3981,7 +3996,7 @@
                 <w:sz w:val="19"/>
                 <w:szCs w:val="19"/>
               </w:rPr>
-              <w:t xml:space="preserve">0,366</w:t>
+              <w:t xml:space="preserve">0,376</w:t>
             </w:r>
           </w:p>
         </w:tc>
@@ -4013,7 +4028,7 @@
                 <w:sz w:val="19"/>
                 <w:szCs w:val="19"/>
               </w:rPr>
-              <w:t xml:space="preserve">0,075</w:t>
+              <w:t xml:space="preserve">0,077</w:t>
             </w:r>
           </w:p>
         </w:tc>
@@ -4319,7 +4334,7 @@
                 <w:sz w:val="19"/>
                 <w:szCs w:val="19"/>
               </w:rPr>
-              <w:t xml:space="preserve">0,759</w:t>
+              <w:t xml:space="preserve">0,761</w:t>
             </w:r>
           </w:p>
         </w:tc>
@@ -4351,7 +4366,7 @@
                 <w:sz w:val="19"/>
                 <w:szCs w:val="19"/>
               </w:rPr>
-              <w:t xml:space="preserve">0,299</w:t>
+              <w:t xml:space="preserve">0,302</w:t>
             </w:r>
           </w:p>
         </w:tc>
@@ -4383,7 +4398,7 @@
                 <w:sz w:val="19"/>
                 <w:szCs w:val="19"/>
               </w:rPr>
-              <w:t xml:space="preserve">0,346</w:t>
+              <w:t xml:space="preserve">0,355</w:t>
             </w:r>
           </w:p>
         </w:tc>
@@ -4415,7 +4430,7 @@
                 <w:sz w:val="19"/>
                 <w:szCs w:val="19"/>
               </w:rPr>
-              <w:t xml:space="preserve">0,076</w:t>
+              <w:t xml:space="preserve">0,075</w:t>
             </w:r>
           </w:p>
         </w:tc>
@@ -4481,7 +4496,7 @@
                 <w:sz w:val="19"/>
                 <w:szCs w:val="19"/>
               </w:rPr>
-              <w:t xml:space="preserve">0,756</w:t>
+              <w:t xml:space="preserve">0,763</w:t>
             </w:r>
           </w:p>
         </w:tc>
@@ -4513,7 +4528,7 @@
                 <w:sz w:val="19"/>
                 <w:szCs w:val="19"/>
               </w:rPr>
-              <w:t xml:space="preserve">0,290</w:t>
+              <w:t xml:space="preserve">0,296</w:t>
             </w:r>
           </w:p>
         </w:tc>
@@ -4545,7 +4560,7 @@
                 <w:sz w:val="19"/>
                 <w:szCs w:val="19"/>
               </w:rPr>
-              <w:t xml:space="preserve">0,352</w:t>
+              <w:t xml:space="preserve">0,357</w:t>
             </w:r>
           </w:p>
         </w:tc>
@@ -4643,7 +4658,7 @@
                 <w:sz w:val="19"/>
                 <w:szCs w:val="19"/>
               </w:rPr>
-              <w:t xml:space="preserve">0,777</w:t>
+              <w:t xml:space="preserve">0,772</w:t>
             </w:r>
           </w:p>
         </w:tc>
@@ -4675,7 +4690,7 @@
                 <w:sz w:val="19"/>
                 <w:szCs w:val="19"/>
               </w:rPr>
-              <w:t xml:space="preserve">0,329</w:t>
+              <w:t xml:space="preserve">0,324</w:t>
             </w:r>
           </w:p>
         </w:tc>
@@ -4707,7 +4722,7 @@
                 <w:sz w:val="19"/>
                 <w:szCs w:val="19"/>
               </w:rPr>
-              <w:t xml:space="preserve">0,388</w:t>
+              <w:t xml:space="preserve">0,387</w:t>
             </w:r>
           </w:p>
         </w:tc>
@@ -4805,7 +4820,7 @@
                 <w:sz w:val="19"/>
                 <w:szCs w:val="19"/>
               </w:rPr>
-              <w:t xml:space="preserve">0,772</w:t>
+              <w:t xml:space="preserve">0,775</w:t>
             </w:r>
           </w:p>
         </w:tc>
@@ -4837,7 +4852,7 @@
                 <w:sz w:val="19"/>
                 <w:szCs w:val="19"/>
               </w:rPr>
-              <w:t xml:space="preserve">0,310</w:t>
+              <w:t xml:space="preserve">0,316</w:t>
             </w:r>
           </w:p>
         </w:tc>
@@ -4869,7 +4884,7 @@
                 <w:sz w:val="19"/>
                 <w:szCs w:val="19"/>
               </w:rPr>
-              <w:t xml:space="preserve">0,401</w:t>
+              <w:t xml:space="preserve">0,390</w:t>
             </w:r>
           </w:p>
         </w:tc>
@@ -5060,7 +5075,7 @@
           <w:sz w:val="22"/>
           <w:szCs w:val="22"/>
         </w:rPr>
-        <w:t xml:space="preserve">Za poređenje na nivou pojedinačnih šuteva, sprovedena je bootstrap analiza razlike ROC AUC na kompletnim out-of-fold (OOF) predikcijama iz svih LOTO foldova. Pooled OOF ROC AUC iznosi 0,677 za Model A i 0,675 za Model B. Opažena razlika (Model B minus Model A) iznosi -0,003, a 95% bootstrap interval poverenja (2.000 iteracija) iznosi [-0,047, 0,040]. Interval sadrži nulu, što znači da na nivou pojedinačnog šuta razlika nije statistički značajna na alfa=0,05. Ovo je vredan nalaz koji zaslužuje transparentno prikazivanje: signal od 360 atributa je realan ali umeren. Na nivou turnira (LOTO validacija, Tabela 3), razlika je konzistentna i praktično smislena (+0,017 AUC). LR test potvrđuje da 360 atributi nose stvarnu inkrementalnu informaciju (p=2,97×10⁻¹⁰). Zaključak je da 360 atributi poboljšavaju model konzistentno kroz turnire, ali efekt na nivou pojedinačnog šuta nije toliko jak da preživi konzervativni shot-level bootstrap sa grupnom korekcijom.</w:t>
+        <w:t xml:space="preserve">Za poređenje na nivou pojedinačnih šuteva, sprovedena je klasterska bootstrap analiza razlike ROC AUC na kompletnim out-of-fold (OOF) predikcijama iz svih LOTO foldova, gde se utakmice uzorkuju sa ponavljanjem (svi šutevi iz izabrane utakmice ulaze u bootstrap uzorak). Pooled OOF ROC AUC iznosi 0,713 za Model A i 0,709 za Model B. 95% bootstrap interval poverenja (2.000 iteracija, 166 utakmica kao klasteri) iznosi [-0,033, 0,025]. Interval sadrži nulu, što znači da na nivou pojedinačnog šuta razlika nije statistički značajna na alfa=0,05. Ovo je vredan nalaz koji zaslužuje transparentno prikazivanje: signal od 360 atributa je realan ali umeren. Na nivou turnira (LOTO validacija, Tabela 3), razlika je konzistentna i praktično smislena (+0,011 AUC). LR test potvrđuje da 360 atributi nose stvarnu inkrementalnu informaciju (p=2,97×10⁻¹⁰). Zaključak je da Model B pokazuje konzistentno numeričko poboljšanje kroz turnire i validacione šeme, ali je inkrementalni efekat umeren i interval poverenja dobijen klasterskim bootstrapom ne isključuje nultu razliku.</w:t>
       </w:r>
     </w:p>
     <w:p>
@@ -5617,7 +5632,7 @@
                 <w:sz w:val="19"/>
                 <w:szCs w:val="19"/>
               </w:rPr>
-              <w:t xml:space="preserve">0,075</w:t>
+              <w:t xml:space="preserve">0,077</w:t>
             </w:r>
           </w:p>
         </w:tc>
@@ -5636,6 +5651,21 @@
           <w:szCs w:val="22"/>
         </w:rPr>
         <w:t xml:space="preserve">Sirovi modeli, pre post-hoc kalibracije, pokazuju sistematsku prekalibrisanost u višem opsegu predviđenih verovatnoća. Primena izotone regresije kao post-hoc kalibracije značajno poboljšava Brier skor za sve četiri kombinacije modela (redukcije od 14% do 48% u zavisnosti od modela i validacione šeme).</w:t>
+      </w:r>
+    </w:p>
+    <w:p>
+      <w:pPr>
+        <w:spacing w:after="160" w:line="276"/>
+        <w:ind w:firstLine="397"/>
+        <w:jc w:val="both"/>
+      </w:pPr>
+      <w:r>
+        <w:rPr>
+          <w:rFonts w:ascii="Calibri" w:cs="Calibri" w:eastAsia="Calibri" w:hAnsi="Calibri"/>
+          <w:sz w:val="22"/>
+          <w:szCs w:val="22"/>
+        </w:rPr>
+        <w:t xml:space="preserve">Kao dodatna provera robusnosti, ispitano je da li izbor scoring metrike za GridSearch menja zaključak o prednosti Modela B. Kad se hiperparametri biraju prema neg_log_loss ili neg_brier_score (koji direktno optimizuju kvalitet verovatnoća), Model B dostiglje LOTO AUC od 0,775 naspram 0,761 za Model A (delta = +0,014) uz bolji Brier skor. Sa average_precision (koja optimizuje rangiranje), razlika je minimalna i nesignifikantna. Ovo potvrđuje da je zaključak robustan na izbor scoring metrike kad se cilj definiše kao kvalitet probabilističkih predikcija, što je primaran cilj xG modela.</w:t>
       </w:r>
     </w:p>
     <w:p>
@@ -6504,7 +6534,7 @@
           <w:sz w:val="22"/>
           <w:szCs w:val="22"/>
         </w:rPr>
-        <w:t xml:space="preserve">Rezultati pokazuju da CONE daje najveće poboljšanje kada se pojedinačno doda Modelu A (+0,007), zatim PRESSURE (+0,007) i GK (+0,004). OPEN_ANGLE i SHOT_LINE ne donose merljiv doprinos kad se dodaju samostalno. Ovo ne meri jedinstveni doprinos svake grupe u punom modelu (jer su 360 atributi međusobno korelisani), već performans grupe kada se izoluje i doda baseline-u. Otvorenost ugla nije pokazala samostalan inkrementalni doprinos; njen eventualni doprinos u punom modelu može biti posledica redundancije sa drugim prostornim atributima. Napomena: ROC AUC za pun Model B u Tabeli 5 (0,773) blago se razlikuje od vrednosti u Tabeli 3 (0,777) jer ablation koristi logističku regresiju bez GridSearchCV.</w:t>
+        <w:t xml:space="preserve">Rezultati pokazuju da CONE daje najveće poboljšanje kada se pojedinačno doda Modelu A (+0,007), zatim PRESSURE (+0,007) i GK (+0,004). OPEN_ANGLE i SHOT_LINE ne donose merljiv doprinos kad se dodaju samostalno. Ovo ne meri jedinstveni doprinos svake grupe u punom modelu (jer su 360 atributi međusobno korelisani), već performans grupe kada se izoluje i doda baseline-u. Otvorenost ugla nije pokazala samostalan inkrementalni doprinos; njen eventualni doprinos u punom modelu može biti posledica redundancije sa drugim prostornim atributima. Napomena: ROC AUC za pun Model B u Tabeli 5 (0,773) blago se razlikuje od vrednosti u Tabeli 3 (0,772) jer ablation koristi logističku regresiju bez GridSearchCV.</w:t>
       </w:r>
     </w:p>
     <w:p>
@@ -7392,7 +7422,7 @@
     </w:p>
     <w:tbl>
       <w:tblPr>
-        <w:tblW w:type="dxa" w:w="9000"/>
+        <w:tblW w:type="dxa" w:w="8995"/>
         <w:tblBorders>
           <w:top w:val="single" w:color="auto" w:sz="4"/>
           <w:left w:val="single" w:color="auto" w:sz="4"/>
@@ -7403,11 +7433,13 @@
         </w:tblBorders>
       </w:tblPr>
       <w:tblGrid>
-        <w:gridCol w:w="1800"/>
-        <w:gridCol w:w="1800"/>
-        <w:gridCol w:w="1800"/>
-        <w:gridCol w:w="1800"/>
-        <w:gridCol w:w="1800"/>
+        <w:gridCol w:w="1285"/>
+        <w:gridCol w:w="1285"/>
+        <w:gridCol w:w="1285"/>
+        <w:gridCol w:w="1285"/>
+        <w:gridCol w:w="1285"/>
+        <w:gridCol w:w="1285"/>
+        <w:gridCol w:w="1285"/>
       </w:tblGrid>
       <w:tr>
         <w:trPr>
@@ -7415,7 +7447,7 @@
         </w:trPr>
         <w:tc>
           <w:tcPr>
-            <w:tcW w:type="dxa" w:w="1800"/>
+            <w:tcW w:type="dxa" w:w="1285"/>
             <w:tcBorders>
               <w:top w:val="single" w:color="BFBFBF" w:sz="4"/>
               <w:left w:val="single" w:color="BFBFBF" w:sz="4"/>
@@ -7450,7 +7482,7 @@
         </w:tc>
         <w:tc>
           <w:tcPr>
-            <w:tcW w:type="dxa" w:w="1800"/>
+            <w:tcW w:type="dxa" w:w="1285"/>
             <w:tcBorders>
               <w:top w:val="single" w:color="BFBFBF" w:sz="4"/>
               <w:left w:val="single" w:color="BFBFBF" w:sz="4"/>
@@ -7485,7 +7517,7 @@
         </w:tc>
         <w:tc>
           <w:tcPr>
-            <w:tcW w:type="dxa" w:w="1800"/>
+            <w:tcW w:type="dxa" w:w="1285"/>
             <w:tcBorders>
               <w:top w:val="single" w:color="BFBFBF" w:sz="4"/>
               <w:left w:val="single" w:color="BFBFBF" w:sz="4"/>
@@ -7514,13 +7546,13 @@
                 <w:sz w:val="19"/>
                 <w:szCs w:val="19"/>
               </w:rPr>
-              <w:t xml:space="preserve">AUC Model A</w:t>
-            </w:r>
-          </w:p>
-        </w:tc>
-        <w:tc>
-          <w:tcPr>
-            <w:tcW w:type="dxa" w:w="1800"/>
+              <w:t xml:space="preserve">Golovi (%)</w:t>
+            </w:r>
+          </w:p>
+        </w:tc>
+        <w:tc>
+          <w:tcPr>
+            <w:tcW w:type="dxa" w:w="1285"/>
             <w:tcBorders>
               <w:top w:val="single" w:color="BFBFBF" w:sz="4"/>
               <w:left w:val="single" w:color="BFBFBF" w:sz="4"/>
@@ -7549,13 +7581,13 @@
                 <w:sz w:val="19"/>
                 <w:szCs w:val="19"/>
               </w:rPr>
-              <w:t xml:space="preserve">AUC Model B</w:t>
-            </w:r>
-          </w:p>
-        </w:tc>
-        <w:tc>
-          <w:tcPr>
-            <w:tcW w:type="dxa" w:w="1800"/>
+              <w:t xml:space="preserve">Med. dist.</w:t>
+            </w:r>
+          </w:p>
+        </w:tc>
+        <w:tc>
+          <w:tcPr>
+            <w:tcW w:type="dxa" w:w="1285"/>
             <w:tcBorders>
               <w:top w:val="single" w:color="BFBFBF" w:sz="4"/>
               <w:left w:val="single" w:color="BFBFBF" w:sz="4"/>
@@ -7584,6 +7616,76 @@
                 <w:sz w:val="19"/>
                 <w:szCs w:val="19"/>
               </w:rPr>
+              <w:t xml:space="preserve">AUC A</w:t>
+            </w:r>
+          </w:p>
+        </w:tc>
+        <w:tc>
+          <w:tcPr>
+            <w:tcW w:type="dxa" w:w="1285"/>
+            <w:tcBorders>
+              <w:top w:val="single" w:color="BFBFBF" w:sz="4"/>
+              <w:left w:val="single" w:color="BFBFBF" w:sz="4"/>
+              <w:bottom w:val="single" w:color="BFBFBF" w:sz="4"/>
+              <w:right w:val="single" w:color="BFBFBF" w:sz="4"/>
+            </w:tcBorders>
+            <w:shd w:fill="1F3864" w:val="clear"/>
+            <w:tcMar>
+              <w:top w:type="dxa" w:w="80"/>
+              <w:left w:type="dxa" w:w="120"/>
+              <w:bottom w:type="dxa" w:w="80"/>
+              <w:right w:type="dxa" w:w="120"/>
+            </w:tcMar>
+            <w:vAlign w:val="center"/>
+          </w:tcPr>
+          <w:p>
+            <w:pPr>
+              <w:jc w:val="center"/>
+            </w:pPr>
+            <w:r>
+              <w:rPr>
+                <w:rFonts w:ascii="Calibri" w:cs="Calibri" w:eastAsia="Calibri" w:hAnsi="Calibri"/>
+                <w:b/>
+                <w:bCs/>
+                <w:color w:val="FFFFFF"/>
+                <w:sz w:val="19"/>
+                <w:szCs w:val="19"/>
+              </w:rPr>
+              <w:t xml:space="preserve">AUC B</w:t>
+            </w:r>
+          </w:p>
+        </w:tc>
+        <w:tc>
+          <w:tcPr>
+            <w:tcW w:type="dxa" w:w="1285"/>
+            <w:tcBorders>
+              <w:top w:val="single" w:color="BFBFBF" w:sz="4"/>
+              <w:left w:val="single" w:color="BFBFBF" w:sz="4"/>
+              <w:bottom w:val="single" w:color="BFBFBF" w:sz="4"/>
+              <w:right w:val="single" w:color="BFBFBF" w:sz="4"/>
+            </w:tcBorders>
+            <w:shd w:fill="1F3864" w:val="clear"/>
+            <w:tcMar>
+              <w:top w:type="dxa" w:w="80"/>
+              <w:left w:type="dxa" w:w="120"/>
+              <w:bottom w:type="dxa" w:w="80"/>
+              <w:right w:type="dxa" w:w="120"/>
+            </w:tcMar>
+            <w:vAlign w:val="center"/>
+          </w:tcPr>
+          <w:p>
+            <w:pPr>
+              <w:jc w:val="center"/>
+            </w:pPr>
+            <w:r>
+              <w:rPr>
+                <w:rFonts w:ascii="Calibri" w:cs="Calibri" w:eastAsia="Calibri" w:hAnsi="Calibri"/>
+                <w:b/>
+                <w:bCs/>
+                <w:color w:val="FFFFFF"/>
+                <w:sz w:val="19"/>
+                <w:szCs w:val="19"/>
+              </w:rPr>
               <w:t xml:space="preserve">Delta</w:t>
             </w:r>
           </w:p>
@@ -7592,7 +7694,7 @@
       <w:tr>
         <w:tc>
           <w:tcPr>
-            <w:tcW w:type="dxa" w:w="1800"/>
+            <w:tcW w:type="dxa" w:w="1285"/>
             <w:tcBorders>
               <w:top w:val="single" w:color="BFBFBF" w:sz="4"/>
               <w:left w:val="single" w:color="BFBFBF" w:sz="4"/>
@@ -7618,13 +7720,13 @@
                 <w:sz w:val="19"/>
                 <w:szCs w:val="19"/>
               </w:rPr>
-              <w:t xml:space="preserve">Svi šutevi (bez praga)</w:t>
-            </w:r>
-          </w:p>
-        </w:tc>
-        <w:tc>
-          <w:tcPr>
-            <w:tcW w:type="dxa" w:w="1800"/>
+              <w:t xml:space="preserve">Svi šutevi</w:t>
+            </w:r>
+          </w:p>
+        </w:tc>
+        <w:tc>
+          <w:tcPr>
+            <w:tcW w:type="dxa" w:w="1285"/>
             <w:tcBorders>
               <w:top w:val="single" w:color="BFBFBF" w:sz="4"/>
               <w:left w:val="single" w:color="BFBFBF" w:sz="4"/>
@@ -7656,7 +7758,7 @@
         </w:tc>
         <w:tc>
           <w:tcPr>
-            <w:tcW w:type="dxa" w:w="1800"/>
+            <w:tcW w:type="dxa" w:w="1285"/>
             <w:tcBorders>
               <w:top w:val="single" w:color="BFBFBF" w:sz="4"/>
               <w:left w:val="single" w:color="BFBFBF" w:sz="4"/>
@@ -7682,13 +7784,77 @@
                 <w:sz w:val="19"/>
                 <w:szCs w:val="19"/>
               </w:rPr>
+              <w:t xml:space="preserve">372 (9,4%)</w:t>
+            </w:r>
+          </w:p>
+        </w:tc>
+        <w:tc>
+          <w:tcPr>
+            <w:tcW w:type="dxa" w:w="1285"/>
+            <w:tcBorders>
+              <w:top w:val="single" w:color="BFBFBF" w:sz="4"/>
+              <w:left w:val="single" w:color="BFBFBF" w:sz="4"/>
+              <w:bottom w:val="single" w:color="BFBFBF" w:sz="4"/>
+              <w:right w:val="single" w:color="BFBFBF" w:sz="4"/>
+            </w:tcBorders>
+            <w:shd w:fill="FFFFFF" w:val="clear"/>
+            <w:tcMar>
+              <w:top w:type="dxa" w:w="60"/>
+              <w:left w:type="dxa" w:w="120"/>
+              <w:bottom w:type="dxa" w:w="60"/>
+              <w:right w:type="dxa" w:w="120"/>
+            </w:tcMar>
+            <w:vAlign w:val="center"/>
+          </w:tcPr>
+          <w:p>
+            <w:pPr>
+              <w:jc w:val="center"/>
+            </w:pPr>
+            <w:r>
+              <w:rPr>
+                <w:rFonts w:ascii="Calibri" w:cs="Calibri" w:eastAsia="Calibri" w:hAnsi="Calibri"/>
+                <w:sz w:val="19"/>
+                <w:szCs w:val="19"/>
+              </w:rPr>
+              <w:t xml:space="preserve">18,0</w:t>
+            </w:r>
+          </w:p>
+        </w:tc>
+        <w:tc>
+          <w:tcPr>
+            <w:tcW w:type="dxa" w:w="1285"/>
+            <w:tcBorders>
+              <w:top w:val="single" w:color="BFBFBF" w:sz="4"/>
+              <w:left w:val="single" w:color="BFBFBF" w:sz="4"/>
+              <w:bottom w:val="single" w:color="BFBFBF" w:sz="4"/>
+              <w:right w:val="single" w:color="BFBFBF" w:sz="4"/>
+            </w:tcBorders>
+            <w:shd w:fill="FFFFFF" w:val="clear"/>
+            <w:tcMar>
+              <w:top w:type="dxa" w:w="60"/>
+              <w:left w:type="dxa" w:w="120"/>
+              <w:bottom w:type="dxa" w:w="60"/>
+              <w:right w:type="dxa" w:w="120"/>
+            </w:tcMar>
+            <w:vAlign w:val="center"/>
+          </w:tcPr>
+          <w:p>
+            <w:pPr>
+              <w:jc w:val="center"/>
+            </w:pPr>
+            <w:r>
+              <w:rPr>
+                <w:rFonts w:ascii="Calibri" w:cs="Calibri" w:eastAsia="Calibri" w:hAnsi="Calibri"/>
+                <w:sz w:val="19"/>
+                <w:szCs w:val="19"/>
+              </w:rPr>
               <w:t xml:space="preserve">0,760</w:t>
             </w:r>
           </w:p>
         </w:tc>
         <w:tc>
           <w:tcPr>
-            <w:tcW w:type="dxa" w:w="1800"/>
+            <w:tcW w:type="dxa" w:w="1285"/>
             <w:tcBorders>
               <w:top w:val="single" w:color="BFBFBF" w:sz="4"/>
               <w:left w:val="single" w:color="BFBFBF" w:sz="4"/>
@@ -7720,7 +7886,7 @@
         </w:tc>
         <w:tc>
           <w:tcPr>
-            <w:tcW w:type="dxa" w:w="1800"/>
+            <w:tcW w:type="dxa" w:w="1285"/>
             <w:tcBorders>
               <w:top w:val="single" w:color="BFBFBF" w:sz="4"/>
               <w:left w:val="single" w:color="BFBFBF" w:sz="4"/>
@@ -7754,7 +7920,7 @@
       <w:tr>
         <w:tc>
           <w:tcPr>
-            <w:tcW w:type="dxa" w:w="1800"/>
+            <w:tcW w:type="dxa" w:w="1285"/>
             <w:tcBorders>
               <w:top w:val="single" w:color="BFBFBF" w:sz="4"/>
               <w:left w:val="single" w:color="BFBFBF" w:sz="4"/>
@@ -7780,13 +7946,13 @@
                 <w:sz w:val="19"/>
                 <w:szCs w:val="19"/>
               </w:rPr>
-              <w:t xml:space="preserve">&gt;=5 vidljivih protivnika</w:t>
-            </w:r>
-          </w:p>
-        </w:tc>
-        <w:tc>
-          <w:tcPr>
-            <w:tcW w:type="dxa" w:w="1800"/>
+              <w:t xml:space="preserve">&gt;=5 protivnika</w:t>
+            </w:r>
+          </w:p>
+        </w:tc>
+        <w:tc>
+          <w:tcPr>
+            <w:tcW w:type="dxa" w:w="1285"/>
             <w:tcBorders>
               <w:top w:val="single" w:color="BFBFBF" w:sz="4"/>
               <w:left w:val="single" w:color="BFBFBF" w:sz="4"/>
@@ -7818,7 +7984,7 @@
         </w:tc>
         <w:tc>
           <w:tcPr>
-            <w:tcW w:type="dxa" w:w="1800"/>
+            <w:tcW w:type="dxa" w:w="1285"/>
             <w:tcBorders>
               <w:top w:val="single" w:color="BFBFBF" w:sz="4"/>
               <w:left w:val="single" w:color="BFBFBF" w:sz="4"/>
@@ -7844,13 +8010,77 @@
                 <w:sz w:val="19"/>
                 <w:szCs w:val="19"/>
               </w:rPr>
+              <w:t xml:space="preserve">336 (9,1%)</w:t>
+            </w:r>
+          </w:p>
+        </w:tc>
+        <w:tc>
+          <w:tcPr>
+            <w:tcW w:type="dxa" w:w="1285"/>
+            <w:tcBorders>
+              <w:top w:val="single" w:color="BFBFBF" w:sz="4"/>
+              <w:left w:val="single" w:color="BFBFBF" w:sz="4"/>
+              <w:bottom w:val="single" w:color="BFBFBF" w:sz="4"/>
+              <w:right w:val="single" w:color="BFBFBF" w:sz="4"/>
+            </w:tcBorders>
+            <w:shd w:fill="F2F2F2" w:val="clear"/>
+            <w:tcMar>
+              <w:top w:type="dxa" w:w="60"/>
+              <w:left w:type="dxa" w:w="120"/>
+              <w:bottom w:type="dxa" w:w="60"/>
+              <w:right w:type="dxa" w:w="120"/>
+            </w:tcMar>
+            <w:vAlign w:val="center"/>
+          </w:tcPr>
+          <w:p>
+            <w:pPr>
+              <w:jc w:val="center"/>
+            </w:pPr>
+            <w:r>
+              <w:rPr>
+                <w:rFonts w:ascii="Calibri" w:cs="Calibri" w:eastAsia="Calibri" w:hAnsi="Calibri"/>
+                <w:sz w:val="19"/>
+                <w:szCs w:val="19"/>
+              </w:rPr>
+              <w:t xml:space="preserve">18,2</w:t>
+            </w:r>
+          </w:p>
+        </w:tc>
+        <w:tc>
+          <w:tcPr>
+            <w:tcW w:type="dxa" w:w="1285"/>
+            <w:tcBorders>
+              <w:top w:val="single" w:color="BFBFBF" w:sz="4"/>
+              <w:left w:val="single" w:color="BFBFBF" w:sz="4"/>
+              <w:bottom w:val="single" w:color="BFBFBF" w:sz="4"/>
+              <w:right w:val="single" w:color="BFBFBF" w:sz="4"/>
+            </w:tcBorders>
+            <w:shd w:fill="F2F2F2" w:val="clear"/>
+            <w:tcMar>
+              <w:top w:type="dxa" w:w="60"/>
+              <w:left w:type="dxa" w:w="120"/>
+              <w:bottom w:type="dxa" w:w="60"/>
+              <w:right w:type="dxa" w:w="120"/>
+            </w:tcMar>
+            <w:vAlign w:val="center"/>
+          </w:tcPr>
+          <w:p>
+            <w:pPr>
+              <w:jc w:val="center"/>
+            </w:pPr>
+            <w:r>
+              <w:rPr>
+                <w:rFonts w:ascii="Calibri" w:cs="Calibri" w:eastAsia="Calibri" w:hAnsi="Calibri"/>
+                <w:sz w:val="19"/>
+                <w:szCs w:val="19"/>
+              </w:rPr>
               <w:t xml:space="preserve">0,756</w:t>
             </w:r>
           </w:p>
         </w:tc>
         <w:tc>
           <w:tcPr>
-            <w:tcW w:type="dxa" w:w="1800"/>
+            <w:tcW w:type="dxa" w:w="1285"/>
             <w:tcBorders>
               <w:top w:val="single" w:color="BFBFBF" w:sz="4"/>
               <w:left w:val="single" w:color="BFBFBF" w:sz="4"/>
@@ -7882,7 +8112,7 @@
         </w:tc>
         <w:tc>
           <w:tcPr>
-            <w:tcW w:type="dxa" w:w="1800"/>
+            <w:tcW w:type="dxa" w:w="1285"/>
             <w:tcBorders>
               <w:top w:val="single" w:color="BFBFBF" w:sz="4"/>
               <w:left w:val="single" w:color="BFBFBF" w:sz="4"/>
@@ -7916,7 +8146,7 @@
       <w:tr>
         <w:tc>
           <w:tcPr>
-            <w:tcW w:type="dxa" w:w="1800"/>
+            <w:tcW w:type="dxa" w:w="1285"/>
             <w:tcBorders>
               <w:top w:val="single" w:color="BFBFBF" w:sz="4"/>
               <w:left w:val="single" w:color="BFBFBF" w:sz="4"/>
@@ -7942,13 +8172,13 @@
                 <w:sz w:val="19"/>
                 <w:szCs w:val="19"/>
               </w:rPr>
-              <w:t xml:space="preserve">&gt;=8 vidljivih protivnika</w:t>
-            </w:r>
-          </w:p>
-        </w:tc>
-        <w:tc>
-          <w:tcPr>
-            <w:tcW w:type="dxa" w:w="1800"/>
+              <w:t xml:space="preserve">&gt;=8 protivnika</w:t>
+            </w:r>
+          </w:p>
+        </w:tc>
+        <w:tc>
+          <w:tcPr>
+            <w:tcW w:type="dxa" w:w="1285"/>
             <w:tcBorders>
               <w:top w:val="single" w:color="BFBFBF" w:sz="4"/>
               <w:left w:val="single" w:color="BFBFBF" w:sz="4"/>
@@ -7980,7 +8210,7 @@
         </w:tc>
         <w:tc>
           <w:tcPr>
-            <w:tcW w:type="dxa" w:w="1800"/>
+            <w:tcW w:type="dxa" w:w="1285"/>
             <w:tcBorders>
               <w:top w:val="single" w:color="BFBFBF" w:sz="4"/>
               <w:left w:val="single" w:color="BFBFBF" w:sz="4"/>
@@ -8006,13 +8236,77 @@
                 <w:sz w:val="19"/>
                 <w:szCs w:val="19"/>
               </w:rPr>
+              <w:t xml:space="preserve">190 (7,2%)</w:t>
+            </w:r>
+          </w:p>
+        </w:tc>
+        <w:tc>
+          <w:tcPr>
+            <w:tcW w:type="dxa" w:w="1285"/>
+            <w:tcBorders>
+              <w:top w:val="single" w:color="BFBFBF" w:sz="4"/>
+              <w:left w:val="single" w:color="BFBFBF" w:sz="4"/>
+              <w:bottom w:val="single" w:color="BFBFBF" w:sz="4"/>
+              <w:right w:val="single" w:color="BFBFBF" w:sz="4"/>
+            </w:tcBorders>
+            <w:shd w:fill="FFFFFF" w:val="clear"/>
+            <w:tcMar>
+              <w:top w:type="dxa" w:w="60"/>
+              <w:left w:type="dxa" w:w="120"/>
+              <w:bottom w:type="dxa" w:w="60"/>
+              <w:right w:type="dxa" w:w="120"/>
+            </w:tcMar>
+            <w:vAlign w:val="center"/>
+          </w:tcPr>
+          <w:p>
+            <w:pPr>
+              <w:jc w:val="center"/>
+            </w:pPr>
+            <w:r>
+              <w:rPr>
+                <w:rFonts w:ascii="Calibri" w:cs="Calibri" w:eastAsia="Calibri" w:hAnsi="Calibri"/>
+                <w:sz w:val="19"/>
+                <w:szCs w:val="19"/>
+              </w:rPr>
+              <w:t xml:space="preserve">19,3</w:t>
+            </w:r>
+          </w:p>
+        </w:tc>
+        <w:tc>
+          <w:tcPr>
+            <w:tcW w:type="dxa" w:w="1285"/>
+            <w:tcBorders>
+              <w:top w:val="single" w:color="BFBFBF" w:sz="4"/>
+              <w:left w:val="single" w:color="BFBFBF" w:sz="4"/>
+              <w:bottom w:val="single" w:color="BFBFBF" w:sz="4"/>
+              <w:right w:val="single" w:color="BFBFBF" w:sz="4"/>
+            </w:tcBorders>
+            <w:shd w:fill="FFFFFF" w:val="clear"/>
+            <w:tcMar>
+              <w:top w:type="dxa" w:w="60"/>
+              <w:left w:type="dxa" w:w="120"/>
+              <w:bottom w:type="dxa" w:w="60"/>
+              <w:right w:type="dxa" w:w="120"/>
+            </w:tcMar>
+            <w:vAlign w:val="center"/>
+          </w:tcPr>
+          <w:p>
+            <w:pPr>
+              <w:jc w:val="center"/>
+            </w:pPr>
+            <w:r>
+              <w:rPr>
+                <w:rFonts w:ascii="Calibri" w:cs="Calibri" w:eastAsia="Calibri" w:hAnsi="Calibri"/>
+                <w:sz w:val="19"/>
+                <w:szCs w:val="19"/>
+              </w:rPr>
               <w:t xml:space="preserve">0,747</w:t>
             </w:r>
           </w:p>
         </w:tc>
         <w:tc>
           <w:tcPr>
-            <w:tcW w:type="dxa" w:w="1800"/>
+            <w:tcW w:type="dxa" w:w="1285"/>
             <w:tcBorders>
               <w:top w:val="single" w:color="BFBFBF" w:sz="4"/>
               <w:left w:val="single" w:color="BFBFBF" w:sz="4"/>
@@ -8044,7 +8338,7 @@
         </w:tc>
         <w:tc>
           <w:tcPr>
-            <w:tcW w:type="dxa" w:w="1800"/>
+            <w:tcW w:type="dxa" w:w="1285"/>
             <w:tcBorders>
               <w:top w:val="single" w:color="BFBFBF" w:sz="4"/>
               <w:left w:val="single" w:color="BFBFBF" w:sz="4"/>
@@ -8088,7 +8382,7 @@
           <w:sz w:val="22"/>
           <w:szCs w:val="22"/>
         </w:rPr>
-        <w:t xml:space="preserve">Model B zadržava prednost na svim pragovima vidljivosti. Smanjenje delta vrednosti za striktnije pragove (sa +0,013 na +0,009) je umereno i može odražavati gubitak statističke snage (manji uzorak) jednako kao i realni efekat kompletnosti podataka. Ključni zaključak je da prednost Modela B nije artefakt nepotpunih freeze-frame podataka.</w:t>
+        <w:t xml:space="preserve">Model B zadržava prednost na svim pragovima vidljivosti. Struktura uzorka je stabilna kroz pragove: medijana udaljenosti se ne menja bitno (18,0 do 19,3 koordinatnih jedinica), a procenat šuteva iz blizine (&lt;15 jed.) ostaje sličan (37-38%). Stroži pragovi ne biraju selektivno samo bliske šuteve. Smanjenje delta vrednosti za striktnije pragove (sa +0,013 na +0,009) može odražavati gubitak statističke snage (manji uzorak) jednako kao i realni efekat kompletnosti podataka. Ključni zaključak je da prednost Modela B nije artefakt nepotpunih freeze-frame podataka.</w:t>
       </w:r>
     </w:p>
     <w:p>

</xml_diff>

<commit_message>
Add code/data availability section (3.10) and GitHub repo to references
</commit_message>
<xml_diff>
--- a/xg_rad_nacrt.docx
+++ b/xg_rad_nacrt.docx
@@ -3072,6 +3072,29 @@
     </w:p>
     <w:p>
       <w:pPr>
+        <w:pStyle w:val="Heading2"/>
+      </w:pPr>
+      <w:r>
+        <w:t xml:space="preserve">3.10. Dostupnost podataka i koda</w:t>
+      </w:r>
+    </w:p>
+    <w:p>
+      <w:pPr>
+        <w:spacing w:after="160" w:line="276"/>
+        <w:ind w:firstLine="397"/>
+        <w:jc w:val="both"/>
+      </w:pPr>
+      <w:r>
+        <w:rPr>
+          <w:rFonts w:ascii="Calibri" w:cs="Calibri" w:eastAsia="Calibri" w:hAnsi="Calibri"/>
+          <w:sz w:val="22"/>
+          <w:szCs w:val="22"/>
+        </w:rPr>
+        <w:t xml:space="preserve">Kompletan kod za reprodukciju svih rezultata (priprema podataka, treniranje modela, validacija, evaluacija, vizualizacija) javno je dostupan na GitHub repozitorijumu: https://github.com/tfedek/xG360. Podaci korišćeni u istraživanju dolaze iz javno dostupnog StatsBomb Open Data repozitorijuma (https://github.com/statsbomb/open-data) i mogu se slobodno preuzeti za akademska istraživanja.</w:t>
+      </w:r>
+    </w:p>
+    <w:p>
+      <w:pPr>
         <w:pStyle w:val="Heading1"/>
       </w:pPr>
       <w:r>
@@ -8764,6 +8787,20 @@
           <w:szCs w:val="22"/>
         </w:rPr>
         <w:t xml:space="preserve">van der Wurp, H., Groll, A., Kneib, T., Marra, G., &amp; Radice, R. (2020). Generalised joint regression for count data: a penalty extension for competitive settings. Statistics and Computing, 30(5), 1419-1432. https://doi.org/10.1007/s11222-020-09953-7</w:t>
+      </w:r>
+    </w:p>
+    <w:p>
+      <w:pPr>
+        <w:spacing w:after="160" w:line="276"/>
+        <w:jc w:val="both"/>
+      </w:pPr>
+      <w:r>
+        <w:rPr>
+          <w:rFonts w:ascii="Calibri" w:cs="Calibri" w:eastAsia="Calibri" w:hAnsi="Calibri"/>
+          <w:sz w:val="22"/>
+          <w:szCs w:val="22"/>
+        </w:rPr>
+        <w:t xml:space="preserve">Fedek, T. (2026). xG360: Doprinos StatsBomb 360 prostornih podataka u proceni verovatnoce gola [izvorni kod]. GitHub. https://github.com/tfedek/xG360</w:t>
       </w:r>
     </w:p>
     <w:sectPr>

</xml_diff>

<commit_message>
Fix alphabetical order in references (Fedek after Degrenne)
</commit_message>
<xml_diff>
--- a/xg_rad_nacrt.docx
+++ b/xg_rad_nacrt.docx
@@ -8744,6 +8744,20 @@
           <w:sz w:val="22"/>
           <w:szCs w:val="22"/>
         </w:rPr>
+        <w:t xml:space="preserve">Fedek, T. (2026). xG360: Doprinos StatsBomb 360 prostornih podataka u proceni verovatnoce gola [izvorni kod]. GitHub. https://github.com/tfedek/xG360</w:t>
+      </w:r>
+    </w:p>
+    <w:p>
+      <w:pPr>
+        <w:spacing w:after="160" w:line="276"/>
+        <w:jc w:val="both"/>
+      </w:pPr>
+      <w:r>
+        <w:rPr>
+          <w:rFonts w:ascii="Calibri" w:cs="Calibri" w:eastAsia="Calibri" w:hAnsi="Calibri"/>
+          <w:sz w:val="22"/>
+          <w:szCs w:val="22"/>
+        </w:rPr>
         <w:t xml:space="preserve">Iapteff, L., Le Coz, S., Rioland, M., Houde, T., Carling, C., &amp; Imbach, F. (2025). Toward interpretable expected goals modeling using Bayesian mixed models. Frontiers in Sports and Active Living, 7, 1504362. https://doi.org/10.3389/fspor.2025.1504362</w:t>
       </w:r>
     </w:p>
@@ -8787,20 +8801,6 @@
           <w:szCs w:val="22"/>
         </w:rPr>
         <w:t xml:space="preserve">van der Wurp, H., Groll, A., Kneib, T., Marra, G., &amp; Radice, R. (2020). Generalised joint regression for count data: a penalty extension for competitive settings. Statistics and Computing, 30(5), 1419-1432. https://doi.org/10.1007/s11222-020-09953-7</w:t>
-      </w:r>
-    </w:p>
-    <w:p>
-      <w:pPr>
-        <w:spacing w:after="160" w:line="276"/>
-        <w:jc w:val="both"/>
-      </w:pPr>
-      <w:r>
-        <w:rPr>
-          <w:rFonts w:ascii="Calibri" w:cs="Calibri" w:eastAsia="Calibri" w:hAnsi="Calibri"/>
-          <w:sz w:val="22"/>
-          <w:szCs w:val="22"/>
-        </w:rPr>
-        <w:t xml:space="preserve">Fedek, T. (2026). xG360: Doprinos StatsBomb 360 prostornih podataka u proceni verovatnoce gola [izvorni kod]. GitHub. https://github.com/tfedek/xG360</w:t>
       </w:r>
     </w:p>
     <w:sectPr>

</xml_diff>

<commit_message>
Fix limitations section: remove resolved items, update bootstrap and visibility to reflect actual analyses
</commit_message>
<xml_diff>
--- a/xg_rad_nacrt.docx
+++ b/xg_rad_nacrt.docx
@@ -8610,52 +8610,37 @@
           <w:sz w:val="22"/>
           <w:szCs w:val="22"/>
         </w:rPr>
-        <w:t xml:space="preserve">Šesto, validacija je sprovedena sa StratifiedGroupKFold po meču (match_id kao grupišuća promenljiva), čime je obezbeđeno da šutevi iz iste utakmice nikada ne završe istovremeno u trening i test delu. Ovo je stroži pristup od standardnog Stratified K-Fold-a i daje konzervativniju ali realniju procenu performansa na novim utakmicama.</w:t>
-      </w:r>
-    </w:p>
-    <w:p>
-      <w:pPr>
-        <w:spacing w:after="160" w:line="276"/>
-        <w:ind w:firstLine="397"/>
-        <w:jc w:val="both"/>
-      </w:pPr>
-      <w:r>
-        <w:rPr>
-          <w:rFonts w:ascii="Calibri" w:cs="Calibri" w:eastAsia="Calibri" w:hAnsi="Calibri"/>
-          <w:sz w:val="22"/>
-          <w:szCs w:val="22"/>
-        </w:rPr>
-        <w:t xml:space="preserve">Sedmo, bootstrap analiza je sprovedena na nivou pojedinačnih šuteva (parno resamplovanje), što čuva uparivanje Model A/B predikcija za isti šut, ali ne čuva zavisnost šuteva unutar istog meča. Cluster bootstrap po mečevima bi bio robusniji pristup.</w:t>
-      </w:r>
-    </w:p>
-    <w:p>
-      <w:pPr>
-        <w:spacing w:after="160" w:line="276"/>
-        <w:ind w:firstLine="397"/>
-        <w:jc w:val="both"/>
-      </w:pPr>
-      <w:r>
-        <w:rPr>
-          <w:rFonts w:ascii="Calibri" w:cs="Calibri" w:eastAsia="Calibri" w:hAnsi="Calibri"/>
-          <w:sz w:val="22"/>
-          <w:szCs w:val="22"/>
-        </w:rPr>
-        <w:t xml:space="preserve">Osmo, StatsBomb 360 freeze-frame sadrži samo igrače vidljive kameri u trenutku šuta, ne nužno sve igrače na terenu. Count i density atributi (broj protivnika, pressure_score) mogu biti potcenjeni ako relevantan deo terena nije u vidnom polju kamere. Ovo ograničenje je inherentno izvoru podataka.</w:t>
-      </w:r>
-    </w:p>
-    <w:p>
-      <w:pPr>
-        <w:spacing w:after="160" w:line="276"/>
-        <w:ind w:firstLine="397"/>
-        <w:jc w:val="both"/>
-      </w:pPr>
-      <w:r>
-        <w:rPr>
-          <w:rFonts w:ascii="Calibri" w:cs="Calibri" w:eastAsia="Calibri" w:hAnsi="Calibri"/>
-          <w:sz w:val="22"/>
-          <w:szCs w:val="22"/>
-        </w:rPr>
-        <w:t xml:space="preserve">Deveto, StatsBomb koordinatni sistem (120x80) tretiran je kao yard-ekvivalentan na osnovu toga što standardne yard dimenzije fudbalskog terena numerički odgovaraju koordinatama u StatsBomb dokumentaciji (6, 12 i 18 koordinatnih jedinica za kazneni prostor). StatsBomb formalno ne naziva ove jedinice jardima, ali konzistentnost sa standardnim dimenzijama podržava ovu interpretaciju. Svi geometrijski proračuni sprovedeni su dosledno unutar ovog sistema (c=8 za širinu gola, radijus=10 za pritisak).</w:t>
+        <w:t xml:space="preserve">Šesto, formalna statistička neizvesnost razlike Model A/B procenjena je cluster bootstrap metodom po utakmicama (166 klastera, 2.000 iteracija), čime je poštovana zavisnost šuteva unutar iste utakmice. Dobijeni 95% interval poverenja za razliku ROC AUC [-0,033, 0,025] obuhvata nulu, što ukazuje da efekat na nivou pojedinačnog šuta, iako konzistentan po smeru kroz validacione šeme i turnire, nije statistički značajan na alfa=0,05 uz konzervativnu korekciju za klastersku zavisnost.</w:t>
+      </w:r>
+    </w:p>
+    <w:p>
+      <w:pPr>
+        <w:spacing w:after="160" w:line="276"/>
+        <w:ind w:firstLine="397"/>
+        <w:jc w:val="both"/>
+      </w:pPr>
+      <w:r>
+        <w:rPr>
+          <w:rFonts w:ascii="Calibri" w:cs="Calibri" w:eastAsia="Calibri" w:hAnsi="Calibri"/>
+          <w:sz w:val="22"/>
+          <w:szCs w:val="22"/>
+        </w:rPr>
+        <w:t xml:space="preserve">Sedmo, StatsBomb 360 freeze-frame sadrži samo igrače vidljive kameri u trenutku šuta, ne nužno sve igrače na terenu. Count i density atributi (broj protivnika, pressure_score) mogu biti potcenjeni ako relevantan deo terena nije u vidnom polju kamere. Ovo ograničenje je inherentno izvoru podataka. Sensitivity analiza (odeljak 4.7) pokazuje da prednost Modela B ostaje konzistentna pri strožim pragovima minimalne vidljivosti (&gt;=5, &gt;=8 vidljivih protivnika), što delimično ublažava ovaj rizik, iako ne može potpuno isključiti efekat nepotpunog kadra na apsolutnu vrednost pojedinačnih atributa.</w:t>
+      </w:r>
+    </w:p>
+    <w:p>
+      <w:pPr>
+        <w:spacing w:after="160" w:line="276"/>
+        <w:ind w:firstLine="397"/>
+        <w:jc w:val="both"/>
+      </w:pPr>
+      <w:r>
+        <w:rPr>
+          <w:rFonts w:ascii="Calibri" w:cs="Calibri" w:eastAsia="Calibri" w:hAnsi="Calibri"/>
+          <w:sz w:val="22"/>
+          <w:szCs w:val="22"/>
+        </w:rPr>
+        <w:t xml:space="preserve">Osmo, StatsBomb koordinatni sistem (120x80) tretiran je kao yard-ekvivalentan na osnovu toga što standardne yard dimenzije fudbalskog terena numerički odgovaraju koordinatama u StatsBomb dokumentaciji (6, 12 i 18 koordinatnih jedinica za kazneni prostor). StatsBomb formalno ne naziva ove jedinice jardima, ali konzistentnost sa standardnim dimenzijama podržava ovu interpretaciju. Svi geometrijski proračuni sprovedeni su dosledno unutar ovog sistema (c=8 za širinu gola, radijus=10 za pritisak).</w:t>
       </w:r>
     </w:p>
     <w:p>

</xml_diff>

<commit_message>
Remove duplicate 3.9 Diskusija heading, renumber 3.10 -> 3.9
</commit_message>
<xml_diff>
--- a/xg_rad_nacrt.docx
+++ b/xg_rad_nacrt.docx
@@ -3049,33 +3049,25 @@
     </w:p>
     <w:p>
       <w:pPr>
+        <w:spacing w:after="160" w:line="276"/>
+        <w:ind w:firstLine="397"/>
+        <w:jc w:val="both"/>
+      </w:pPr>
+      <w:r>
+        <w:rPr>
+          <w:rFonts w:ascii="Calibri" w:cs="Calibri" w:eastAsia="Calibri" w:hAnsi="Calibri"/>
+          <w:sz w:val="22"/>
+          <w:szCs w:val="22"/>
+        </w:rPr>
+        <w:t xml:space="preserve">Završni korak metodologije objedinjuje nalaze iz prethodnih koraka u celovitu diskusiju o doprinosu StatsBomb 360 atributa, generalizaciji modela kroz turnire, praktičnoj primeni nalaza i ograničenjima istraživanja, što je detaljno razrađeno u poglavlju 5.</w:t>
+      </w:r>
+    </w:p>
+    <w:p>
+      <w:pPr>
         <w:pStyle w:val="Heading2"/>
       </w:pPr>
       <w:r>
-        <w:t xml:space="preserve">3.9. Diskusija</w:t>
-      </w:r>
-    </w:p>
-    <w:p>
-      <w:pPr>
-        <w:spacing w:after="160" w:line="276"/>
-        <w:ind w:firstLine="397"/>
-        <w:jc w:val="both"/>
-      </w:pPr>
-      <w:r>
-        <w:rPr>
-          <w:rFonts w:ascii="Calibri" w:cs="Calibri" w:eastAsia="Calibri" w:hAnsi="Calibri"/>
-          <w:sz w:val="22"/>
-          <w:szCs w:val="22"/>
-        </w:rPr>
-        <w:t xml:space="preserve">Završni korak metodologije objedinjuje nalaze iz prethodnih koraka u celovitu diskusiju o doprinosu StatsBomb 360 atributa, generalizaciji modela kroz turnire, praktičnoj primeni nalaza i ograničenjima istraživanja, što je detaljno razrađeno u poglavlju 5.</w:t>
-      </w:r>
-    </w:p>
-    <w:p>
-      <w:pPr>
-        <w:pStyle w:val="Heading2"/>
-      </w:pPr>
-      <w:r>
-        <w:t xml:space="preserve">3.10. Dostupnost podataka i koda</w:t>
+        <w:t xml:space="preserve">3.9. Dostupnost podataka i koda</w:t>
       </w:r>
     </w:p>
     <w:p>

</xml_diff>